<commit_message>
Add agent buyer script — autonomous audit and pass/fail decision
</commit_message>
<xml_diff>
--- a/ArcAuditAgent_Charter_v2_Final.docx
+++ b/ArcAuditAgent_Charter_v2_Final.docx
@@ -11773,7 +11773,7 @@
           <w:sz w:val="32"/>
           <w:szCs w:val="32"/>
         </w:rPr>
-        <w:t xml:space="preserve">5. Current State</w:t>
+        <w:t xml:space="preserve">5. What We Built and Why</w:t>
       </w:r>
     </w:p>
     <w:p>
@@ -11790,7 +11790,486 @@
           <w:sz w:val="26"/>
           <w:szCs w:val="26"/>
         </w:rPr>
-        <w:t xml:space="preserve">5.1 Component Status</w:t>
+        <w:t xml:space="preserve">5.1 The Problem We're Solving</w:t>
+      </w:r>
+    </w:p>
+    <w:p>
+      <w:pPr>
+        <w:spacing w:after="80" w:before="80"/>
+      </w:pPr>
+      <w:r>
+        <w:rPr>
+          <w:rFonts w:ascii="Arial" w:cs="Arial" w:eastAsia="Arial" w:hAnsi="Arial"/>
+          <w:sz w:val="22"/>
+          <w:szCs w:val="22"/>
+        </w:rPr>
+        <w:t xml:space="preserve">One of the hardest unsolved problems in the agent economy is trust. When an autonomous AI agent wants to interact with a smart contract — deploy capital, execute a swap, join a protocol — how does it know the contract is safe? Right now it can't verify that without a human in the loop. That breaks the whole premise of autonomous agents acting independently.</w:t>
+      </w:r>
+    </w:p>
+    <w:p>
+      <w:pPr>
+        <w:spacing w:after="0" w:before="80"/>
+      </w:pPr>
+      <w:r>
+        <w:t xml:space="preserve"/>
+      </w:r>
+    </w:p>
+    <w:p>
+      <w:pPr>
+        <w:spacing w:after="80" w:before="80"/>
+      </w:pPr>
+      <w:r>
+        <w:rPr>
+          <w:rFonts w:ascii="Arial" w:cs="Arial" w:eastAsia="Arial" w:hAnsi="Arial"/>
+          <w:sz w:val="22"/>
+          <w:szCs w:val="22"/>
+        </w:rPr>
+        <w:t xml:space="preserve">Smart contract audits exist, but they're designed for humans. They're expensive, slow, and the results live in PDFs that no agent can read or verify. There's no programmable, on-chain-verifiable audit infrastructure that autonomous systems can use.</w:t>
+      </w:r>
+    </w:p>
+    <w:p>
+      <w:pPr>
+        <w:spacing w:after="0" w:before="80"/>
+      </w:pPr>
+      <w:r>
+        <w:t xml:space="preserve"/>
+      </w:r>
+    </w:p>
+    <w:p>
+      <w:pPr>
+        <w:spacing w:after="80" w:before="80"/>
+      </w:pPr>
+      <w:r>
+        <w:rPr>
+          <w:rFonts w:ascii="Arial" w:cs="Arial" w:eastAsia="Arial" w:hAnsi="Arial"/>
+          <w:sz w:val="22"/>
+          <w:szCs w:val="22"/>
+        </w:rPr>
+        <w:t xml:space="preserve">ArcAuditAgent is the first step toward fixing that.</w:t>
+      </w:r>
+    </w:p>
+    <w:p>
+      <w:pPr>
+        <w:spacing w:after="0" w:before="80"/>
+      </w:pPr>
+      <w:r>
+        <w:t xml:space="preserve"/>
+      </w:r>
+    </w:p>
+    <w:p>
+      <w:pPr>
+        <w:pStyle w:val="Heading2"/>
+        <w:spacing w:after="80" w:before="280"/>
+      </w:pPr>
+      <w:r>
+        <w:rPr>
+          <w:rFonts w:ascii="Arial" w:cs="Arial" w:eastAsia="Arial" w:hAnsi="Arial"/>
+          <w:b/>
+          <w:bCs/>
+          <w:color w:val="2E75B6"/>
+          <w:sz w:val="26"/>
+          <w:szCs w:val="26"/>
+        </w:rPr>
+        <w:t xml:space="preserve">5.2 What We Built — In Plain English</w:t>
+      </w:r>
+    </w:p>
+    <w:p>
+      <w:pPr>
+        <w:spacing w:after="80" w:before="80"/>
+      </w:pPr>
+      <w:r>
+        <w:rPr>
+          <w:rFonts w:ascii="Arial" w:cs="Arial" w:eastAsia="Arial" w:hAnsi="Arial"/>
+          <w:sz w:val="22"/>
+          <w:szCs w:val="22"/>
+        </w:rPr>
+        <w:t xml:space="preserve">ArcAuditAgent is an autonomous service that audits smart contracts. It runs 24/7 in the cloud, requires no human involvement, and any agent or developer in the world can use it by following three steps:</w:t>
+      </w:r>
+    </w:p>
+    <w:p>
+      <w:pPr>
+        <w:spacing w:after="0" w:before="80"/>
+      </w:pPr>
+      <w:r>
+        <w:t xml:space="preserve"/>
+      </w:r>
+    </w:p>
+    <w:p>
+      <w:pPr>
+        <w:pStyle w:val="ListParagraph"/>
+        <w:numPr>
+          <w:ilvl w:val="0"/>
+          <w:numId w:val="3"/>
+        </w:numPr>
+        <w:spacing w:after="60" w:before="60"/>
+      </w:pPr>
+      <w:r>
+        <w:rPr>
+          <w:rFonts w:ascii="Arial" w:cs="Arial" w:eastAsia="Arial" w:hAnsi="Arial"/>
+          <w:sz w:val="22"/>
+          <w:szCs w:val="22"/>
+        </w:rPr>
+        <w:t xml:space="preserve">Approve 1 USDC to the AuditRegistry contract on Arc — this is the payment, handled programmatically by the agent's wallet.</w:t>
+      </w:r>
+    </w:p>
+    <w:p>
+      <w:pPr>
+        <w:pStyle w:val="ListParagraph"/>
+        <w:numPr>
+          <w:ilvl w:val="0"/>
+          <w:numId w:val="3"/>
+        </w:numPr>
+        <w:spacing w:after="60" w:before="60"/>
+      </w:pPr>
+      <w:r>
+        <w:rPr>
+          <w:rFonts w:ascii="Arial" w:cs="Arial" w:eastAsia="Arial" w:hAnsi="Arial"/>
+          <w:sz w:val="22"/>
+          <w:szCs w:val="22"/>
+        </w:rPr>
+        <w:t xml:space="preserve">Send the smart contract code to the API — the agent POSTs the Solidity code along with its wallet address.</w:t>
+      </w:r>
+    </w:p>
+    <w:p>
+      <w:pPr>
+        <w:pStyle w:val="ListParagraph"/>
+        <w:numPr>
+          <w:ilvl w:val="0"/>
+          <w:numId w:val="3"/>
+        </w:numPr>
+        <w:spacing w:after="60" w:before="60"/>
+      </w:pPr>
+      <w:r>
+        <w:rPr>
+          <w:rFonts w:ascii="Arial" w:cs="Arial" w:eastAsia="Arial" w:hAnsi="Arial"/>
+          <w:sz w:val="22"/>
+          <w:szCs w:val="22"/>
+        </w:rPr>
+        <w:t xml:space="preserve">Receive a structured audit report — score out of 100, list of vulnerabilities with severity levels, gas efficiency findings, and a transaction hash proving the result was posted to the blockchain.</w:t>
+      </w:r>
+    </w:p>
+    <w:p>
+      <w:pPr>
+        <w:spacing w:after="0" w:before="80"/>
+      </w:pPr>
+      <w:r>
+        <w:t xml:space="preserve"/>
+      </w:r>
+    </w:p>
+    <w:p>
+      <w:pPr>
+        <w:spacing w:after="80" w:before="80"/>
+      </w:pPr>
+      <w:r>
+        <w:rPr>
+          <w:rFonts w:ascii="Arial" w:cs="Arial" w:eastAsia="Arial" w:hAnsi="Arial"/>
+          <w:sz w:val="22"/>
+          <w:szCs w:val="22"/>
+        </w:rPr>
+        <w:t xml:space="preserve">The key thing that makes this different from existing audit tools is the on-chain commitment. Every audit result is stored in the AuditRegistry contract on Arc. Any other agent can call that contract directly and verify the audit result — without trusting us, without calling our backend, without any intermediary. The result is just there, permanently, on the blockchain.</w:t>
+      </w:r>
+    </w:p>
+    <w:p>
+      <w:pPr>
+        <w:spacing w:after="0" w:before="80"/>
+      </w:pPr>
+      <w:r>
+        <w:t xml:space="preserve"/>
+      </w:r>
+    </w:p>
+    <w:tbl>
+      <w:tblPr>
+        <w:tblW w:type="dxa" w:w="9360"/>
+        <w:tblBorders>
+          <w:top w:val="single" w:color="auto" w:sz="4"/>
+          <w:left w:val="single" w:color="auto" w:sz="4"/>
+          <w:bottom w:val="single" w:color="auto" w:sz="4"/>
+          <w:right w:val="single" w:color="auto" w:sz="4"/>
+          <w:insideH w:val="single" w:color="auto" w:sz="4"/>
+          <w:insideV w:val="single" w:color="auto" w:sz="4"/>
+        </w:tblBorders>
+      </w:tblPr>
+      <w:tblGrid>
+        <w:gridCol w:w="9360"/>
+      </w:tblGrid>
+      <w:tr>
+        <w:tc>
+          <w:tcPr>
+            <w:tcW w:type="dxa" w:w="9360"/>
+            <w:tcBorders>
+              <w:top w:val="single" w:color="CCCCCC" w:sz="1"/>
+              <w:left w:val="single" w:color="2E75B6" w:sz="8"/>
+              <w:bottom w:val="single" w:color="CCCCCC" w:sz="1"/>
+              <w:right w:val="single" w:color="CCCCCC" w:sz="1"/>
+            </w:tcBorders>
+            <w:shd w:fill="D6E4F0" w:val="clear"/>
+            <w:tcMar>
+              <w:top w:type="dxa" w:w="120"/>
+              <w:left w:type="dxa" w:w="200"/>
+              <w:bottom w:type="dxa" w:w="120"/>
+              <w:right w:type="dxa" w:w="200"/>
+            </w:tcMar>
+          </w:tcPr>
+          <w:p>
+            <w:r>
+              <w:rPr>
+                <w:rFonts w:ascii="Arial" w:cs="Arial" w:eastAsia="Arial" w:hAnsi="Arial"/>
+                <w:i/>
+                <w:iCs/>
+                <w:sz w:val="22"/>
+                <w:szCs w:val="22"/>
+              </w:rPr>
+              <w:t xml:space="preserve">Think of it like this: instead of getting an audit report emailed to you as a PDF, you get a cryptographic proof stored on a public blockchain that anyone — human or machine — can verify independently at any time.</w:t>
+            </w:r>
+          </w:p>
+        </w:tc>
+      </w:tr>
+    </w:tbl>
+    <w:p>
+      <w:pPr>
+        <w:spacing w:after="0" w:before="160"/>
+      </w:pPr>
+      <w:r>
+        <w:t xml:space="preserve"/>
+      </w:r>
+    </w:p>
+    <w:p>
+      <w:pPr>
+        <w:pStyle w:val="Heading2"/>
+        <w:spacing w:after="80" w:before="280"/>
+      </w:pPr>
+      <w:r>
+        <w:rPr>
+          <w:rFonts w:ascii="Arial" w:cs="Arial" w:eastAsia="Arial" w:hAnsi="Arial"/>
+          <w:b/>
+          <w:bCs/>
+          <w:color w:val="2E75B6"/>
+          <w:sz w:val="26"/>
+          <w:szCs w:val="26"/>
+        </w:rPr>
+        <w:t xml:space="preserve">5.3 Why Arc Is the Right Place to Build This</w:t>
+      </w:r>
+    </w:p>
+    <w:p>
+      <w:pPr>
+        <w:spacing w:after="80" w:before="80"/>
+      </w:pPr>
+      <w:r>
+        <w:rPr>
+          <w:rFonts w:ascii="Arial" w:cs="Arial" w:eastAsia="Arial" w:hAnsi="Arial"/>
+          <w:sz w:val="22"/>
+          <w:szCs w:val="22"/>
+        </w:rPr>
+        <w:t xml:space="preserve">Arc is Circle's Layer-1 blockchain, and it has one property that makes it uniquely suited to this kind of agent service: USDC is the native gas token.</w:t>
+      </w:r>
+    </w:p>
+    <w:p>
+      <w:pPr>
+        <w:spacing w:after="0" w:before="80"/>
+      </w:pPr>
+      <w:r>
+        <w:t xml:space="preserve"/>
+      </w:r>
+    </w:p>
+    <w:p>
+      <w:pPr>
+        <w:spacing w:after="80" w:before="80"/>
+      </w:pPr>
+      <w:r>
+        <w:rPr>
+          <w:rFonts w:ascii="Arial" w:cs="Arial" w:eastAsia="Arial" w:hAnsi="Arial"/>
+          <w:sz w:val="22"/>
+          <w:szCs w:val="22"/>
+        </w:rPr>
+        <w:t xml:space="preserve">On every other blockchain, you pay transaction fees in a volatile token — ETH, BNB, SOL. For agent services where fees need to be predictable and denominated in real money, this is a problem. An agent paying for an audit on Ethereum might budget 0.001 ETH but not know if that's $2 or $5 depending on the day.</w:t>
+      </w:r>
+    </w:p>
+    <w:p>
+      <w:pPr>
+        <w:spacing w:after="0" w:before="80"/>
+      </w:pPr>
+      <w:r>
+        <w:t xml:space="preserve"/>
+      </w:r>
+    </w:p>
+    <w:p>
+      <w:pPr>
+        <w:spacing w:after="80" w:before="80"/>
+      </w:pPr>
+      <w:r>
+        <w:rPr>
+          <w:rFonts w:ascii="Arial" w:cs="Arial" w:eastAsia="Arial" w:hAnsi="Arial"/>
+          <w:sz w:val="22"/>
+          <w:szCs w:val="22"/>
+        </w:rPr>
+        <w:t xml:space="preserve">On Arc, everything is denominated in USDC. The audit fee is 1 USDC. The gas cost is a fraction of a USDC. The agent knows exactly what it's paying, always. This makes fee-based agent services economically clean in a way that wasn't possible before.</w:t>
+      </w:r>
+    </w:p>
+    <w:p>
+      <w:pPr>
+        <w:spacing w:after="0" w:before="80"/>
+      </w:pPr>
+      <w:r>
+        <w:t xml:space="preserve"/>
+      </w:r>
+    </w:p>
+    <w:p>
+      <w:pPr>
+        <w:spacing w:after="80" w:before="80"/>
+      </w:pPr>
+      <w:r>
+        <w:rPr>
+          <w:rFonts w:ascii="Arial" w:cs="Arial" w:eastAsia="Arial" w:hAnsi="Arial"/>
+          <w:sz w:val="22"/>
+          <w:szCs w:val="22"/>
+        </w:rPr>
+        <w:t xml:space="preserve">Arc also has sub-second deterministic finality — transactions confirm in under half a second and can never be reversed. For agent workflows that need to proceed after payment confirmation, this matters. Our audit results post to Arc in under 500 milliseconds.</w:t>
+      </w:r>
+    </w:p>
+    <w:p>
+      <w:pPr>
+        <w:spacing w:after="0" w:before="80"/>
+      </w:pPr>
+      <w:r>
+        <w:t xml:space="preserve"/>
+      </w:r>
+    </w:p>
+    <w:p>
+      <w:pPr>
+        <w:spacing w:after="80" w:before="80"/>
+      </w:pPr>
+      <w:r>
+        <w:rPr>
+          <w:rFonts w:ascii="Arial" w:cs="Arial" w:eastAsia="Arial" w:hAnsi="Arial"/>
+          <w:sz w:val="22"/>
+          <w:szCs w:val="22"/>
+        </w:rPr>
+        <w:t xml:space="preserve">Circle is building Arc as the economic operating system for the internet — the layer that makes money move as freely and reliably as data. ArcAuditAgent is a small proof of concept of what gets built on top of that infrastructure: autonomous agents providing services, getting paid in stablecoins, and settling everything on-chain in real time.</w:t>
+      </w:r>
+    </w:p>
+    <w:p>
+      <w:pPr>
+        <w:spacing w:after="0" w:before="160"/>
+      </w:pPr>
+      <w:r>
+        <w:t xml:space="preserve"/>
+      </w:r>
+    </w:p>
+    <w:p>
+      <w:pPr>
+        <w:pStyle w:val="Heading2"/>
+        <w:spacing w:after="80" w:before="280"/>
+      </w:pPr>
+      <w:r>
+        <w:rPr>
+          <w:rFonts w:ascii="Arial" w:cs="Arial" w:eastAsia="Arial" w:hAnsi="Arial"/>
+          <w:b/>
+          <w:bCs/>
+          <w:color w:val="2E75B6"/>
+          <w:sz w:val="26"/>
+          <w:szCs w:val="26"/>
+        </w:rPr>
+        <w:t xml:space="preserve">5.4 Why This Matters for the Ecosystem</w:t>
+      </w:r>
+    </w:p>
+    <w:p>
+      <w:pPr>
+        <w:spacing w:after="80" w:before="80"/>
+      </w:pPr>
+      <w:r>
+        <w:rPr>
+          <w:rFonts w:ascii="Arial" w:cs="Arial" w:eastAsia="Arial" w:hAnsi="Arial"/>
+          <w:sz w:val="22"/>
+          <w:szCs w:val="22"/>
+        </w:rPr>
+        <w:t xml:space="preserve">The agents being built today — trading bots, DeFi automators, autonomous DAOs — need to interact with smart contracts constantly. Right now they do it blindly, hoping the contracts are safe. As the value managed by autonomous agents grows, so does the risk of a single bad contract draining everything.</w:t>
+      </w:r>
+    </w:p>
+    <w:p>
+      <w:pPr>
+        <w:spacing w:after="0" w:before="80"/>
+      </w:pPr>
+      <w:r>
+        <w:t xml:space="preserve"/>
+      </w:r>
+    </w:p>
+    <w:p>
+      <w:pPr>
+        <w:spacing w:after="80" w:before="80"/>
+      </w:pPr>
+      <w:r>
+        <w:rPr>
+          <w:rFonts w:ascii="Arial" w:cs="Arial" w:eastAsia="Arial" w:hAnsi="Arial"/>
+          <w:sz w:val="22"/>
+          <w:szCs w:val="22"/>
+        </w:rPr>
+        <w:t xml:space="preserve">ArcAuditAgent creates a trust primitive that agents can use programmatically. Before an agent deploys capital into a new contract, it can hire ArcAuditAgent to check it. The audit result is on-chain. Other agents can read it. A reputation layer can be built on top of it. Over time, the registry becomes a shared record of which contracts have been audited, when, and what was found.</w:t>
+      </w:r>
+    </w:p>
+    <w:p>
+      <w:pPr>
+        <w:spacing w:after="0" w:before="80"/>
+      </w:pPr>
+      <w:r>
+        <w:t xml:space="preserve"/>
+      </w:r>
+    </w:p>
+    <w:p>
+      <w:pPr>
+        <w:spacing w:after="80" w:before="80"/>
+      </w:pPr>
+      <w:r>
+        <w:rPr>
+          <w:rFonts w:ascii="Arial" w:cs="Arial" w:eastAsia="Arial" w:hAnsi="Arial"/>
+          <w:sz w:val="22"/>
+          <w:szCs w:val="22"/>
+        </w:rPr>
+        <w:t xml:space="preserve">This is the direction the agent economy needs to go — not more human oversight, but programmable trust infrastructure that agents can use autonomously. We built the first piece of that on Arc.</w:t>
+      </w:r>
+    </w:p>
+    <w:p>
+      <w:pPr>
+        <w:spacing w:after="0" w:before="160"/>
+      </w:pPr>
+      <w:r>
+        <w:t xml:space="preserve"/>
+      </w:r>
+    </w:p>
+    <w:p>
+      <w:pPr>
+        <w:pStyle w:val="Heading1"/>
+        <w:pBdr>
+          <w:bottom w:val="single" w:color="2E75B6" w:sz="6" w:space="6"/>
+        </w:pBdr>
+        <w:spacing w:after="120" w:before="360"/>
+      </w:pPr>
+      <w:r>
+        <w:rPr>
+          <w:rFonts w:ascii="Arial" w:cs="Arial" w:eastAsia="Arial" w:hAnsi="Arial"/>
+          <w:b/>
+          <w:bCs/>
+          <w:color w:val="1B4F8A"/>
+          <w:sz w:val="32"/>
+          <w:szCs w:val="32"/>
+        </w:rPr>
+        <w:t xml:space="preserve">6. Current State</w:t>
+      </w:r>
+    </w:p>
+    <w:p>
+      <w:pPr>
+        <w:pStyle w:val="Heading2"/>
+        <w:spacing w:after="80" w:before="280"/>
+      </w:pPr>
+      <w:r>
+        <w:rPr>
+          <w:rFonts w:ascii="Arial" w:cs="Arial" w:eastAsia="Arial" w:hAnsi="Arial"/>
+          <w:b/>
+          <w:bCs/>
+          <w:color w:val="2E75B6"/>
+          <w:sz w:val="26"/>
+          <w:szCs w:val="26"/>
+        </w:rPr>
+        <w:t xml:space="preserve">6.1 Component Status — May 15, 2026</w:t>
       </w:r>
     </w:p>
     <w:p>
@@ -12308,7 +12787,7 @@
                 <w:sz w:val="20"/>
                 <w:szCs w:val="20"/>
               </w:rPr>
-              <w:t xml:space="preserve">GitHub Repo Created</w:t>
+              <w:t xml:space="preserve">GitHub Repo</w:t>
             </w:r>
           </w:p>
         </w:tc>
@@ -12368,7 +12847,7 @@
                 <w:sz w:val="20"/>
                 <w:szCs w:val="20"/>
               </w:rPr>
-              <w:t xml:space="preserve">github.com/knisaci/arc-audit-agent — public</w:t>
+              <w:t xml:space="preserve">github.com/knisaci/arc-audit-agent — public with README</w:t>
             </w:r>
           </w:p>
         </w:tc>
@@ -12460,7 +12939,7 @@
                 <w:sz w:val="20"/>
                 <w:szCs w:val="20"/>
               </w:rPr>
-              <w:t xml:space="preserve">Deployed to Arc testnet — 0xC996c0143c4C88F0B0bC32d328D14c071A603CcB</w:t>
+              <w:t xml:space="preserve">Deployed — 0xC996c0143c4C88F0B0bC32d328D14c071A603CcB</w:t>
             </w:r>
           </w:p>
         </w:tc>
@@ -12492,7 +12971,7 @@
                 <w:sz w:val="20"/>
                 <w:szCs w:val="20"/>
               </w:rPr>
-              <w:t xml:space="preserve">AuditRegistry Contract Address</w:t>
+              <w:t xml:space="preserve">Audit Backend (Railway)</w:t>
             </w:r>
           </w:p>
         </w:tc>
@@ -12552,7 +13031,7 @@
                 <w:sz w:val="20"/>
                 <w:szCs w:val="20"/>
               </w:rPr>
-              <w:t xml:space="preserve">0xC996c0143c4C88F0B0bC32d328D14c071A603CcB</w:t>
+              <w:t xml:space="preserve">arc-audit-agent-production.up.railway.app — 24/7</w:t>
             </w:r>
           </w:p>
         </w:tc>
@@ -12584,7 +13063,7 @@
                 <w:sz w:val="20"/>
                 <w:szCs w:val="20"/>
               </w:rPr>
-              <w:t xml:space="preserve">Audit Backend (Railway)</w:t>
+              <w:t xml:space="preserve">Rate Limiter</w:t>
             </w:r>
           </w:p>
         </w:tc>
@@ -12644,7 +13123,7 @@
                 <w:sz w:val="20"/>
                 <w:szCs w:val="20"/>
               </w:rPr>
-              <w:t xml:space="preserve">arc-audit-agent-production.up.railway.app</w:t>
+              <w:t xml:space="preserve">Per wallet address, 5 requests/hour</w:t>
             </w:r>
           </w:p>
         </w:tc>
@@ -12676,7 +13155,7 @@
                 <w:sz w:val="20"/>
                 <w:szCs w:val="20"/>
               </w:rPr>
-              <w:t xml:space="preserve">Railway Public URL</w:t>
+              <w:t xml:space="preserve">SQLite Off-Chain Index</w:t>
             </w:r>
           </w:p>
         </w:tc>
@@ -12736,7 +13215,7 @@
                 <w:sz w:val="20"/>
                 <w:szCs w:val="20"/>
               </w:rPr>
-              <w:t xml:space="preserve">https://arc-audit-agent-production.up.railway.app</w:t>
+              <w:t xml:space="preserve">audits.db on Railway — all runs logged</w:t>
             </w:r>
           </w:p>
         </w:tc>
@@ -12768,7 +13247,7 @@
                 <w:sz w:val="20"/>
                 <w:szCs w:val="20"/>
               </w:rPr>
-              <w:t xml:space="preserve">Rate Limiter</w:t>
+              <w:t xml:space="preserve">On-Chain Posting</w:t>
             </w:r>
           </w:p>
         </w:tc>
@@ -12828,7 +13307,7 @@
                 <w:sz w:val="20"/>
                 <w:szCs w:val="20"/>
               </w:rPr>
-              <w:t xml:space="preserve">In-memory, per wallet address, 5 requests/hour</w:t>
+              <w:t xml:space="preserve">Every audit writes to AuditRegistry — sub-second</w:t>
             </w:r>
           </w:p>
         </w:tc>
@@ -12860,7 +13339,7 @@
                 <w:sz w:val="20"/>
                 <w:szCs w:val="20"/>
               </w:rPr>
-              <w:t xml:space="preserve">SQLite Off-Chain Index</w:t>
+              <w:t xml:space="preserve">USDC Payment Gate</w:t>
             </w:r>
           </w:p>
         </w:tc>
@@ -12920,7 +13399,7 @@
                 <w:sz w:val="20"/>
                 <w:szCs w:val="20"/>
               </w:rPr>
-              <w:t xml:space="preserve">audits.db — logging all audit runs on Railway</w:t>
+              <w:t xml:space="preserve">ERC-20 allowance check — 1 USDC required per audit</w:t>
             </w:r>
           </w:p>
         </w:tc>
@@ -12952,7 +13431,7 @@
                 <w:sz w:val="20"/>
                 <w:szCs w:val="20"/>
               </w:rPr>
-              <w:t xml:space="preserve">On-Chain Posting</w:t>
+              <w:t xml:space="preserve">USDC Approve Script</w:t>
             </w:r>
           </w:p>
         </w:tc>
@@ -13012,7 +13491,7 @@
                 <w:sz w:val="20"/>
                 <w:szCs w:val="20"/>
               </w:rPr>
-              <w:t xml:space="preserve">Every audit writes to AuditRegistry on Arc — sub-second confirmation</w:t>
+              <w:t xml:space="preserve">scripts/approve-usdc.ts — 10 USDC approved to registry</w:t>
             </w:r>
           </w:p>
         </w:tc>
@@ -13044,7 +13523,7 @@
                 <w:sz w:val="20"/>
                 <w:szCs w:val="20"/>
               </w:rPr>
-              <w:t xml:space="preserve">Demo Audits (2 confirmed)</w:t>
+              <w:t xml:space="preserve">Demo Audits</w:t>
             </w:r>
           </w:p>
         </w:tc>
@@ -13074,7 +13553,7 @@
                 <w:sz w:val="20"/>
                 <w:szCs w:val="20"/>
               </w:rPr>
-              <w:t xml:space="preserve">In Progress</w:t>
+              <w:t xml:space="preserve">Complete ✅</w:t>
             </w:r>
           </w:p>
         </w:tc>
@@ -13104,7 +13583,7 @@
                 <w:sz w:val="20"/>
                 <w:szCs w:val="20"/>
               </w:rPr>
-              <w:t xml:space="preserve">2 txs on Arc block explorer. Target: 10+</w:t>
+              <w:t xml:space="preserve">9 successful txs on Arc block explorer</w:t>
             </w:r>
           </w:p>
         </w:tc>
@@ -13136,7 +13615,7 @@
                 <w:sz w:val="20"/>
                 <w:szCs w:val="20"/>
               </w:rPr>
-              <w:t xml:space="preserve">USDC Payment Gate</w:t>
+              <w:t xml:space="preserve">README Published</w:t>
             </w:r>
           </w:p>
         </w:tc>
@@ -13166,7 +13645,7 @@
                 <w:sz w:val="20"/>
                 <w:szCs w:val="20"/>
               </w:rPr>
-              <w:t xml:space="preserve">Pending</w:t>
+              <w:t xml:space="preserve">Complete ✅</w:t>
             </w:r>
           </w:p>
         </w:tc>
@@ -13196,7 +13675,7 @@
                 <w:sz w:val="20"/>
                 <w:szCs w:val="20"/>
               </w:rPr>
-              <w:t xml:space="preserve">Next priority — Phase 4 payment verification to be wired in</w:t>
+              <w:t xml:space="preserve">github.com/knisaci/arc-audit-agent</w:t>
             </w:r>
           </w:p>
         </w:tc>
@@ -13228,7 +13707,7 @@
                 <w:sz w:val="20"/>
                 <w:szCs w:val="20"/>
               </w:rPr>
-              <w:t xml:space="preserve">README Published</w:t>
+              <w:t xml:space="preserve">X Post Published</w:t>
             </w:r>
           </w:p>
         </w:tc>
@@ -13258,7 +13737,7 @@
                 <w:sz w:val="20"/>
                 <w:szCs w:val="20"/>
               </w:rPr>
-              <w:t xml:space="preserve">Pending</w:t>
+              <w:t xml:space="preserve">Complete ✅</w:t>
             </w:r>
           </w:p>
         </w:tc>
@@ -13288,7 +13767,7 @@
                 <w:sz w:val="20"/>
                 <w:szCs w:val="20"/>
               </w:rPr>
-              <w:t xml:space="preserve">Write in next session</w:t>
+              <w:t xml:space="preserve">x.com/knisaci/status/2055036091884036326</w:t>
             </w:r>
           </w:p>
         </w:tc>
@@ -13320,7 +13799,7 @@
                 <w:sz w:val="20"/>
                 <w:szCs w:val="20"/>
               </w:rPr>
-              <w:t xml:space="preserve">Agent Buyer Script</w:t>
+              <w:t xml:space="preserve">Arc Discord Intro</w:t>
             </w:r>
           </w:p>
         </w:tc>
@@ -13350,7 +13829,7 @@
                 <w:sz w:val="20"/>
                 <w:szCs w:val="20"/>
               </w:rPr>
-              <w:t xml:space="preserve">Pending</w:t>
+              <w:t xml:space="preserve">Complete ✅</w:t>
             </w:r>
           </w:p>
         </w:tc>
@@ -13380,7 +13859,375 @@
                 <w:sz w:val="20"/>
                 <w:szCs w:val="20"/>
               </w:rPr>
-              <w:t xml:space="preserve">Write in next session</w:t>
+              <w:t xml:space="preserve">#introduce-yourself posted — @kiran0806</w:t>
+            </w:r>
+          </w:p>
+        </w:tc>
+      </w:tr>
+      <w:tr>
+        <w:tc>
+          <w:tcPr>
+            <w:tcW w:type="dxa" w:w="3200"/>
+            <w:tcBorders>
+              <w:top w:val="single" w:color="CCCCCC" w:sz="1"/>
+              <w:left w:val="single" w:color="CCCCCC" w:sz="1"/>
+              <w:bottom w:val="single" w:color="CCCCCC" w:sz="1"/>
+              <w:right w:val="single" w:color="CCCCCC" w:sz="1"/>
+            </w:tcBorders>
+            <w:shd w:fill="FFFFFF" w:val="clear"/>
+            <w:tcMar>
+              <w:top w:type="dxa" w:w="80"/>
+              <w:left w:type="dxa" w:w="120"/>
+              <w:bottom w:type="dxa" w:w="80"/>
+              <w:right w:type="dxa" w:w="120"/>
+            </w:tcMar>
+          </w:tcPr>
+          <w:p>
+            <w:r>
+              <w:rPr>
+                <w:rFonts w:ascii="Arial" w:cs="Arial" w:eastAsia="Arial" w:hAnsi="Arial"/>
+                <w:b/>
+                <w:bCs/>
+                <w:sz w:val="20"/>
+                <w:szCs w:val="20"/>
+              </w:rPr>
+              <w:t xml:space="preserve">Arc Community Engagement</w:t>
+            </w:r>
+          </w:p>
+        </w:tc>
+        <w:tc>
+          <w:tcPr>
+            <w:tcW w:type="dxa" w:w="1960"/>
+            <w:tcBorders>
+              <w:top w:val="single" w:color="CCCCCC" w:sz="1"/>
+              <w:left w:val="single" w:color="CCCCCC" w:sz="1"/>
+              <w:bottom w:val="single" w:color="CCCCCC" w:sz="1"/>
+              <w:right w:val="single" w:color="CCCCCC" w:sz="1"/>
+            </w:tcBorders>
+            <w:shd w:fill="FFFFFF" w:val="clear"/>
+            <w:tcMar>
+              <w:top w:type="dxa" w:w="80"/>
+              <w:left w:type="dxa" w:w="120"/>
+              <w:bottom w:type="dxa" w:w="80"/>
+              <w:right w:type="dxa" w:w="120"/>
+            </w:tcMar>
+          </w:tcPr>
+          <w:p>
+            <w:r>
+              <w:rPr>
+                <w:rFonts w:ascii="Arial" w:cs="Arial" w:eastAsia="Arial" w:hAnsi="Arial"/>
+                <w:b w:val="false"/>
+                <w:bCs w:val="false"/>
+                <w:sz w:val="20"/>
+                <w:szCs w:val="20"/>
+              </w:rPr>
+              <w:t xml:space="preserve">Complete ✅</w:t>
+            </w:r>
+          </w:p>
+        </w:tc>
+        <w:tc>
+          <w:tcPr>
+            <w:tcW w:type="dxa" w:w="4200"/>
+            <w:tcBorders>
+              <w:top w:val="single" w:color="CCCCCC" w:sz="1"/>
+              <w:left w:val="single" w:color="CCCCCC" w:sz="1"/>
+              <w:bottom w:val="single" w:color="CCCCCC" w:sz="1"/>
+              <w:right w:val="single" w:color="CCCCCC" w:sz="1"/>
+            </w:tcBorders>
+            <w:shd w:fill="FFFFFF" w:val="clear"/>
+            <w:tcMar>
+              <w:top w:type="dxa" w:w="80"/>
+              <w:left w:type="dxa" w:w="120"/>
+              <w:bottom w:type="dxa" w:w="80"/>
+              <w:right w:type="dxa" w:w="120"/>
+            </w:tcMar>
+          </w:tcPr>
+          <w:p>
+            <w:r>
+              <w:rPr>
+                <w:rFonts w:ascii="Arial" w:cs="Arial" w:eastAsia="Arial" w:hAnsi="Arial"/>
+                <w:b w:val="false"/>
+                <w:bCs w:val="false"/>
+                <w:sz w:val="20"/>
+                <w:szCs w:val="20"/>
+              </w:rPr>
+              <w:t xml:space="preserve">2 constructive replies on Arc tweets</w:t>
+            </w:r>
+          </w:p>
+        </w:tc>
+      </w:tr>
+      <w:tr>
+        <w:tc>
+          <w:tcPr>
+            <w:tcW w:type="dxa" w:w="3200"/>
+            <w:tcBorders>
+              <w:top w:val="single" w:color="CCCCCC" w:sz="1"/>
+              <w:left w:val="single" w:color="CCCCCC" w:sz="1"/>
+              <w:bottom w:val="single" w:color="CCCCCC" w:sz="1"/>
+              <w:right w:val="single" w:color="CCCCCC" w:sz="1"/>
+            </w:tcBorders>
+            <w:shd w:fill="F5F7FA" w:val="clear"/>
+            <w:tcMar>
+              <w:top w:type="dxa" w:w="80"/>
+              <w:left w:type="dxa" w:w="120"/>
+              <w:bottom w:type="dxa" w:w="80"/>
+              <w:right w:type="dxa" w:w="120"/>
+            </w:tcMar>
+          </w:tcPr>
+          <w:p>
+            <w:r>
+              <w:rPr>
+                <w:rFonts w:ascii="Arial" w:cs="Arial" w:eastAsia="Arial" w:hAnsi="Arial"/>
+                <w:b/>
+                <w:bCs/>
+                <w:sz w:val="20"/>
+                <w:szCs w:val="20"/>
+              </w:rPr>
+              <w:t xml:space="preserve">Agent Buyer Script</w:t>
+            </w:r>
+          </w:p>
+        </w:tc>
+        <w:tc>
+          <w:tcPr>
+            <w:tcW w:type="dxa" w:w="1960"/>
+            <w:tcBorders>
+              <w:top w:val="single" w:color="CCCCCC" w:sz="1"/>
+              <w:left w:val="single" w:color="CCCCCC" w:sz="1"/>
+              <w:bottom w:val="single" w:color="CCCCCC" w:sz="1"/>
+              <w:right w:val="single" w:color="CCCCCC" w:sz="1"/>
+            </w:tcBorders>
+            <w:shd w:fill="F5F7FA" w:val="clear"/>
+            <w:tcMar>
+              <w:top w:type="dxa" w:w="80"/>
+              <w:left w:type="dxa" w:w="120"/>
+              <w:bottom w:type="dxa" w:w="80"/>
+              <w:right w:type="dxa" w:w="120"/>
+            </w:tcMar>
+          </w:tcPr>
+          <w:p>
+            <w:r>
+              <w:rPr>
+                <w:rFonts w:ascii="Arial" w:cs="Arial" w:eastAsia="Arial" w:hAnsi="Arial"/>
+                <w:b w:val="false"/>
+                <w:bCs w:val="false"/>
+                <w:sz w:val="20"/>
+                <w:szCs w:val="20"/>
+              </w:rPr>
+              <w:t xml:space="preserve">Pending</w:t>
+            </w:r>
+          </w:p>
+        </w:tc>
+        <w:tc>
+          <w:tcPr>
+            <w:tcW w:type="dxa" w:w="4200"/>
+            <w:tcBorders>
+              <w:top w:val="single" w:color="CCCCCC" w:sz="1"/>
+              <w:left w:val="single" w:color="CCCCCC" w:sz="1"/>
+              <w:bottom w:val="single" w:color="CCCCCC" w:sz="1"/>
+              <w:right w:val="single" w:color="CCCCCC" w:sz="1"/>
+            </w:tcBorders>
+            <w:shd w:fill="F5F7FA" w:val="clear"/>
+            <w:tcMar>
+              <w:top w:type="dxa" w:w="80"/>
+              <w:left w:type="dxa" w:w="120"/>
+              <w:bottom w:type="dxa" w:w="80"/>
+              <w:right w:type="dxa" w:w="120"/>
+            </w:tcMar>
+          </w:tcPr>
+          <w:p>
+            <w:r>
+              <w:rPr>
+                <w:rFonts w:ascii="Arial" w:cs="Arial" w:eastAsia="Arial" w:hAnsi="Arial"/>
+                <w:b w:val="false"/>
+                <w:bCs w:val="false"/>
+                <w:sz w:val="20"/>
+                <w:szCs w:val="20"/>
+              </w:rPr>
+              <w:t xml:space="preserve">Next session — scripts/agent-buyer.ts</w:t>
+            </w:r>
+          </w:p>
+        </w:tc>
+      </w:tr>
+      <w:tr>
+        <w:tc>
+          <w:tcPr>
+            <w:tcW w:type="dxa" w:w="3200"/>
+            <w:tcBorders>
+              <w:top w:val="single" w:color="CCCCCC" w:sz="1"/>
+              <w:left w:val="single" w:color="CCCCCC" w:sz="1"/>
+              <w:bottom w:val="single" w:color="CCCCCC" w:sz="1"/>
+              <w:right w:val="single" w:color="CCCCCC" w:sz="1"/>
+            </w:tcBorders>
+            <w:shd w:fill="FFFFFF" w:val="clear"/>
+            <w:tcMar>
+              <w:top w:type="dxa" w:w="80"/>
+              <w:left w:type="dxa" w:w="120"/>
+              <w:bottom w:type="dxa" w:w="80"/>
+              <w:right w:type="dxa" w:w="120"/>
+            </w:tcMar>
+          </w:tcPr>
+          <w:p>
+            <w:r>
+              <w:rPr>
+                <w:rFonts w:ascii="Arial" w:cs="Arial" w:eastAsia="Arial" w:hAnsi="Arial"/>
+                <w:b/>
+                <w:bCs/>
+                <w:sz w:val="20"/>
+                <w:szCs w:val="20"/>
+              </w:rPr>
+              <w:t xml:space="preserve">Arc Discord Project Post</w:t>
+            </w:r>
+          </w:p>
+        </w:tc>
+        <w:tc>
+          <w:tcPr>
+            <w:tcW w:type="dxa" w:w="1960"/>
+            <w:tcBorders>
+              <w:top w:val="single" w:color="CCCCCC" w:sz="1"/>
+              <w:left w:val="single" w:color="CCCCCC" w:sz="1"/>
+              <w:bottom w:val="single" w:color="CCCCCC" w:sz="1"/>
+              <w:right w:val="single" w:color="CCCCCC" w:sz="1"/>
+            </w:tcBorders>
+            <w:shd w:fill="FFFFFF" w:val="clear"/>
+            <w:tcMar>
+              <w:top w:type="dxa" w:w="80"/>
+              <w:left w:type="dxa" w:w="120"/>
+              <w:bottom w:type="dxa" w:w="80"/>
+              <w:right w:type="dxa" w:w="120"/>
+            </w:tcMar>
+          </w:tcPr>
+          <w:p>
+            <w:r>
+              <w:rPr>
+                <w:rFonts w:ascii="Arial" w:cs="Arial" w:eastAsia="Arial" w:hAnsi="Arial"/>
+                <w:b w:val="false"/>
+                <w:bCs w:val="false"/>
+                <w:sz w:val="20"/>
+                <w:szCs w:val="20"/>
+              </w:rPr>
+              <w:t xml:space="preserve">Pending</w:t>
+            </w:r>
+          </w:p>
+        </w:tc>
+        <w:tc>
+          <w:tcPr>
+            <w:tcW w:type="dxa" w:w="4200"/>
+            <w:tcBorders>
+              <w:top w:val="single" w:color="CCCCCC" w:sz="1"/>
+              <w:left w:val="single" w:color="CCCCCC" w:sz="1"/>
+              <w:bottom w:val="single" w:color="CCCCCC" w:sz="1"/>
+              <w:right w:val="single" w:color="CCCCCC" w:sz="1"/>
+            </w:tcBorders>
+            <w:shd w:fill="FFFFFF" w:val="clear"/>
+            <w:tcMar>
+              <w:top w:type="dxa" w:w="80"/>
+              <w:left w:type="dxa" w:w="120"/>
+              <w:bottom w:type="dxa" w:w="80"/>
+              <w:right w:type="dxa" w:w="120"/>
+            </w:tcMar>
+          </w:tcPr>
+          <w:p>
+            <w:r>
+              <w:rPr>
+                <w:rFonts w:ascii="Arial" w:cs="Arial" w:eastAsia="Arial" w:hAnsi="Arial"/>
+                <w:b w:val="false"/>
+                <w:bCs w:val="false"/>
+                <w:sz w:val="20"/>
+                <w:szCs w:val="20"/>
+              </w:rPr>
+              <w:t xml:space="preserve">Post in #general-chat when 6hr cooldown lifts</w:t>
+            </w:r>
+          </w:p>
+        </w:tc>
+      </w:tr>
+      <w:tr>
+        <w:tc>
+          <w:tcPr>
+            <w:tcW w:type="dxa" w:w="3200"/>
+            <w:tcBorders>
+              <w:top w:val="single" w:color="CCCCCC" w:sz="1"/>
+              <w:left w:val="single" w:color="CCCCCC" w:sz="1"/>
+              <w:bottom w:val="single" w:color="CCCCCC" w:sz="1"/>
+              <w:right w:val="single" w:color="CCCCCC" w:sz="1"/>
+            </w:tcBorders>
+            <w:shd w:fill="F5F7FA" w:val="clear"/>
+            <w:tcMar>
+              <w:top w:type="dxa" w:w="80"/>
+              <w:left w:type="dxa" w:w="120"/>
+              <w:bottom w:type="dxa" w:w="80"/>
+              <w:right w:type="dxa" w:w="120"/>
+            </w:tcMar>
+          </w:tcPr>
+          <w:p>
+            <w:r>
+              <w:rPr>
+                <w:rFonts w:ascii="Arial" w:cs="Arial" w:eastAsia="Arial" w:hAnsi="Arial"/>
+                <w:b/>
+                <w:bCs/>
+                <w:sz w:val="20"/>
+                <w:szCs w:val="20"/>
+              </w:rPr>
+              <w:t xml:space="preserve">Mainnet Readiness Review</w:t>
+            </w:r>
+          </w:p>
+        </w:tc>
+        <w:tc>
+          <w:tcPr>
+            <w:tcW w:type="dxa" w:w="1960"/>
+            <w:tcBorders>
+              <w:top w:val="single" w:color="CCCCCC" w:sz="1"/>
+              <w:left w:val="single" w:color="CCCCCC" w:sz="1"/>
+              <w:bottom w:val="single" w:color="CCCCCC" w:sz="1"/>
+              <w:right w:val="single" w:color="CCCCCC" w:sz="1"/>
+            </w:tcBorders>
+            <w:shd w:fill="F5F7FA" w:val="clear"/>
+            <w:tcMar>
+              <w:top w:type="dxa" w:w="80"/>
+              <w:left w:type="dxa" w:w="120"/>
+              <w:bottom w:type="dxa" w:w="80"/>
+              <w:right w:type="dxa" w:w="120"/>
+            </w:tcMar>
+          </w:tcPr>
+          <w:p>
+            <w:r>
+              <w:rPr>
+                <w:rFonts w:ascii="Arial" w:cs="Arial" w:eastAsia="Arial" w:hAnsi="Arial"/>
+                <w:b w:val="false"/>
+                <w:bCs w:val="false"/>
+                <w:sz w:val="20"/>
+                <w:szCs w:val="20"/>
+              </w:rPr>
+              <w:t xml:space="preserve">Pending</w:t>
+            </w:r>
+          </w:p>
+        </w:tc>
+        <w:tc>
+          <w:tcPr>
+            <w:tcW w:type="dxa" w:w="4200"/>
+            <w:tcBorders>
+              <w:top w:val="single" w:color="CCCCCC" w:sz="1"/>
+              <w:left w:val="single" w:color="CCCCCC" w:sz="1"/>
+              <w:bottom w:val="single" w:color="CCCCCC" w:sz="1"/>
+              <w:right w:val="single" w:color="CCCCCC" w:sz="1"/>
+            </w:tcBorders>
+            <w:shd w:fill="F5F7FA" w:val="clear"/>
+            <w:tcMar>
+              <w:top w:type="dxa" w:w="80"/>
+              <w:left w:type="dxa" w:w="120"/>
+              <w:bottom w:type="dxa" w:w="80"/>
+              <w:right w:type="dxa" w:w="120"/>
+            </w:tcMar>
+          </w:tcPr>
+          <w:p>
+            <w:r>
+              <w:rPr>
+                <w:rFonts w:ascii="Arial" w:cs="Arial" w:eastAsia="Arial" w:hAnsi="Arial"/>
+                <w:b w:val="false"/>
+                <w:bCs w:val="false"/>
+                <w:sz w:val="20"/>
+                <w:szCs w:val="20"/>
+              </w:rPr>
+              <w:t xml:space="preserve">When Arc mainnet date is announced</w:t>
             </w:r>
           </w:p>
         </w:tc>
@@ -13408,7 +14255,7 @@
           <w:sz w:val="26"/>
           <w:szCs w:val="26"/>
         </w:rPr>
-        <w:t xml:space="preserve">5.2 Confirmed Wallet Addresses</w:t>
+        <w:t xml:space="preserve">6.2 Confirmed Wallet Addresses</w:t>
       </w:r>
     </w:p>
     <w:p>
@@ -13688,7 +14535,7 @@
           <w:sz w:val="26"/>
           <w:szCs w:val="26"/>
         </w:rPr>
-        <w:t xml:space="preserve">5.3 Confirmed Addresses and Endpoints</w:t>
+        <w:t xml:space="preserve">6.3 Confirmed Addresses and Endpoints</w:t>
       </w:r>
     </w:p>
     <w:p>
@@ -14168,7 +15015,7 @@
                 <w:sz w:val="20"/>
                 <w:szCs w:val="20"/>
               </w:rPr>
-              <w:t xml:space="preserve">Railway Backend URL</w:t>
+              <w:t xml:space="preserve">AuditRegistry Explorer</w:t>
             </w:r>
           </w:p>
         </w:tc>
@@ -14195,7 +15042,7 @@
                 <w:sz w:val="20"/>
                 <w:szCs w:val="20"/>
               </w:rPr>
-              <w:t xml:space="preserve">https://arc-audit-agent-production.up.railway.app</w:t>
+              <w:t xml:space="preserve">https://testnet.arcscan.app/address/0xC996c0143c4C88F0B0bC32d328D14c071A603CcB</w:t>
             </w:r>
           </w:p>
         </w:tc>
@@ -14253,7 +15100,7 @@
                 <w:sz w:val="20"/>
                 <w:szCs w:val="20"/>
               </w:rPr>
-              <w:t xml:space="preserve">GitHub Repo</w:t>
+              <w:t xml:space="preserve">Railway Backend URL</w:t>
             </w:r>
           </w:p>
         </w:tc>
@@ -14280,7 +15127,7 @@
                 <w:sz w:val="20"/>
                 <w:szCs w:val="20"/>
               </w:rPr>
-              <w:t xml:space="preserve">https://github.com/knisaci/arc-audit-agent</w:t>
+              <w:t xml:space="preserve">https://arc-audit-agent-production.up.railway.app</w:t>
             </w:r>
           </w:p>
         </w:tc>
@@ -14338,7 +15185,7 @@
                 <w:sz w:val="20"/>
                 <w:szCs w:val="20"/>
               </w:rPr>
-              <w:t xml:space="preserve">Demo Audit TX #1</w:t>
+              <w:t xml:space="preserve">GitHub Repo</w:t>
             </w:r>
           </w:p>
         </w:tc>
@@ -14365,7 +15212,7 @@
                 <w:sz w:val="20"/>
                 <w:szCs w:val="20"/>
               </w:rPr>
-              <w:t xml:space="preserve">0x405436c12eda94327a5e21bbfd624472df8b25ebd3d7e78247634c15da08028a</w:t>
+              <w:t xml:space="preserve">https://github.com/knisaci/arc-audit-agent</w:t>
             </w:r>
           </w:p>
         </w:tc>
@@ -14423,7 +15270,7 @@
                 <w:sz w:val="20"/>
                 <w:szCs w:val="20"/>
               </w:rPr>
-              <w:t xml:space="preserve">Demo Audit TX #2</w:t>
+              <w:t xml:space="preserve">X Post</w:t>
             </w:r>
           </w:p>
         </w:tc>
@@ -14450,7 +15297,7 @@
                 <w:sz w:val="20"/>
                 <w:szCs w:val="20"/>
               </w:rPr>
-              <w:t xml:space="preserve">0x7e75a6c8df958246b5ed9c7da72fc1eda4872fca1b8210c1f0a4d5b787b89141</w:t>
+              <w:t xml:space="preserve">https://x.com/knisaci/status/2055036091884036326</w:t>
             </w:r>
           </w:p>
         </w:tc>
@@ -14458,7 +15305,32 @@
     </w:tbl>
     <w:p>
       <w:pPr>
-        <w:spacing w:after="0" w:before="0"/>
+        <w:spacing w:after="0" w:before="160"/>
+      </w:pPr>
+      <w:r>
+        <w:t xml:space="preserve"/>
+      </w:r>
+    </w:p>
+    <w:p>
+      <w:pPr>
+        <w:pStyle w:val="Heading2"/>
+        <w:spacing w:after="80" w:before="280"/>
+      </w:pPr>
+      <w:r>
+        <w:rPr>
+          <w:rFonts w:ascii="Arial" w:cs="Arial" w:eastAsia="Arial" w:hAnsi="Arial"/>
+          <w:b/>
+          <w:bCs/>
+          <w:color w:val="2E75B6"/>
+          <w:sz w:val="26"/>
+          <w:szCs w:val="26"/>
+        </w:rPr>
+        <w:t xml:space="preserve">6.4 Confirmed On-Chain Audit Transactions</w:t>
+      </w:r>
+    </w:p>
+    <w:p>
+      <w:pPr>
+        <w:spacing w:after="0" w:before="80"/>
       </w:pPr>
       <w:r>
         <w:t xml:space="preserve"/>
@@ -14508,7 +15380,7 @@
                 <w:sz w:val="20"/>
                 <w:szCs w:val="20"/>
               </w:rPr>
-              <w:t xml:space="preserve">AuditRegistry Explorer</w:t>
+              <w:t xml:space="preserve">Deployment TX</w:t>
             </w:r>
           </w:p>
         </w:tc>
@@ -14535,7 +15407,772 @@
                 <w:sz w:val="20"/>
                 <w:szCs w:val="20"/>
               </w:rPr>
-              <w:t xml:space="preserve">https://testnet.arcscan.app/address/0xC996c0143c4C88F0B0bC32d328D14c071A603CcB</w:t>
+              <w:t xml:space="preserve">0x82bb8b77a6d95e9513211639279bdce028d9cdb9cd1cb34dc4aa9df1db2aa792</w:t>
+            </w:r>
+          </w:p>
+        </w:tc>
+      </w:tr>
+    </w:tbl>
+    <w:p>
+      <w:pPr>
+        <w:spacing w:after="0" w:before="0"/>
+      </w:pPr>
+      <w:r>
+        <w:t xml:space="preserve"/>
+      </w:r>
+    </w:p>
+    <w:tbl>
+      <w:tblPr>
+        <w:tblW w:type="dxa" w:w="9360"/>
+        <w:tblBorders>
+          <w:top w:val="single" w:color="auto" w:sz="4"/>
+          <w:left w:val="single" w:color="auto" w:sz="4"/>
+          <w:bottom w:val="single" w:color="auto" w:sz="4"/>
+          <w:right w:val="single" w:color="auto" w:sz="4"/>
+          <w:insideH w:val="single" w:color="auto" w:sz="4"/>
+          <w:insideV w:val="single" w:color="auto" w:sz="4"/>
+        </w:tblBorders>
+      </w:tblPr>
+      <w:tblGrid>
+        <w:gridCol w:w="2400"/>
+        <w:gridCol w:w="6960"/>
+      </w:tblGrid>
+      <w:tr>
+        <w:tc>
+          <w:tcPr>
+            <w:tcW w:type="dxa" w:w="2400"/>
+            <w:tcBorders>
+              <w:top w:val="single" w:color="CCCCCC" w:sz="1"/>
+              <w:left w:val="single" w:color="CCCCCC" w:sz="1"/>
+              <w:bottom w:val="single" w:color="CCCCCC" w:sz="1"/>
+              <w:right w:val="single" w:color="CCCCCC" w:sz="1"/>
+            </w:tcBorders>
+            <w:shd w:fill="D6E4F0" w:val="clear"/>
+            <w:tcMar>
+              <w:top w:type="dxa" w:w="80"/>
+              <w:left w:type="dxa" w:w="120"/>
+              <w:bottom w:type="dxa" w:w="80"/>
+              <w:right w:type="dxa" w:w="120"/>
+            </w:tcMar>
+          </w:tcPr>
+          <w:p>
+            <w:r>
+              <w:rPr>
+                <w:rFonts w:ascii="Arial" w:cs="Arial" w:eastAsia="Arial" w:hAnsi="Arial"/>
+                <w:b/>
+                <w:bCs/>
+                <w:color w:val="1B4F8A"/>
+                <w:sz w:val="20"/>
+                <w:szCs w:val="20"/>
+              </w:rPr>
+              <w:t xml:space="preserve">Audit TX #1</w:t>
+            </w:r>
+          </w:p>
+        </w:tc>
+        <w:tc>
+          <w:tcPr>
+            <w:tcW w:type="dxa" w:w="6960"/>
+            <w:tcBorders>
+              <w:top w:val="single" w:color="CCCCCC" w:sz="1"/>
+              <w:left w:val="single" w:color="CCCCCC" w:sz="1"/>
+              <w:bottom w:val="single" w:color="CCCCCC" w:sz="1"/>
+              <w:right w:val="single" w:color="CCCCCC" w:sz="1"/>
+            </w:tcBorders>
+            <w:tcMar>
+              <w:top w:type="dxa" w:w="80"/>
+              <w:left w:type="dxa" w:w="120"/>
+              <w:bottom w:type="dxa" w:w="80"/>
+              <w:right w:type="dxa" w:w="120"/>
+            </w:tcMar>
+          </w:tcPr>
+          <w:p>
+            <w:r>
+              <w:rPr>
+                <w:rFonts w:ascii="Arial" w:cs="Arial" w:eastAsia="Arial" w:hAnsi="Arial"/>
+                <w:sz w:val="20"/>
+                <w:szCs w:val="20"/>
+              </w:rPr>
+              <w:t xml:space="preserve">0x405436c12eda94327a5e21bbfd624472df8b25ebd3d7e78247634c15da08028a</w:t>
+            </w:r>
+          </w:p>
+        </w:tc>
+      </w:tr>
+    </w:tbl>
+    <w:p>
+      <w:pPr>
+        <w:spacing w:after="0" w:before="0"/>
+      </w:pPr>
+      <w:r>
+        <w:t xml:space="preserve"/>
+      </w:r>
+    </w:p>
+    <w:tbl>
+      <w:tblPr>
+        <w:tblW w:type="dxa" w:w="9360"/>
+        <w:tblBorders>
+          <w:top w:val="single" w:color="auto" w:sz="4"/>
+          <w:left w:val="single" w:color="auto" w:sz="4"/>
+          <w:bottom w:val="single" w:color="auto" w:sz="4"/>
+          <w:right w:val="single" w:color="auto" w:sz="4"/>
+          <w:insideH w:val="single" w:color="auto" w:sz="4"/>
+          <w:insideV w:val="single" w:color="auto" w:sz="4"/>
+        </w:tblBorders>
+      </w:tblPr>
+      <w:tblGrid>
+        <w:gridCol w:w="2400"/>
+        <w:gridCol w:w="6960"/>
+      </w:tblGrid>
+      <w:tr>
+        <w:tc>
+          <w:tcPr>
+            <w:tcW w:type="dxa" w:w="2400"/>
+            <w:tcBorders>
+              <w:top w:val="single" w:color="CCCCCC" w:sz="1"/>
+              <w:left w:val="single" w:color="CCCCCC" w:sz="1"/>
+              <w:bottom w:val="single" w:color="CCCCCC" w:sz="1"/>
+              <w:right w:val="single" w:color="CCCCCC" w:sz="1"/>
+            </w:tcBorders>
+            <w:shd w:fill="D6E4F0" w:val="clear"/>
+            <w:tcMar>
+              <w:top w:type="dxa" w:w="80"/>
+              <w:left w:type="dxa" w:w="120"/>
+              <w:bottom w:type="dxa" w:w="80"/>
+              <w:right w:type="dxa" w:w="120"/>
+            </w:tcMar>
+          </w:tcPr>
+          <w:p>
+            <w:r>
+              <w:rPr>
+                <w:rFonts w:ascii="Arial" w:cs="Arial" w:eastAsia="Arial" w:hAnsi="Arial"/>
+                <w:b/>
+                <w:bCs/>
+                <w:color w:val="1B4F8A"/>
+                <w:sz w:val="20"/>
+                <w:szCs w:val="20"/>
+              </w:rPr>
+              <w:t xml:space="preserve">Audit TX #2</w:t>
+            </w:r>
+          </w:p>
+        </w:tc>
+        <w:tc>
+          <w:tcPr>
+            <w:tcW w:type="dxa" w:w="6960"/>
+            <w:tcBorders>
+              <w:top w:val="single" w:color="CCCCCC" w:sz="1"/>
+              <w:left w:val="single" w:color="CCCCCC" w:sz="1"/>
+              <w:bottom w:val="single" w:color="CCCCCC" w:sz="1"/>
+              <w:right w:val="single" w:color="CCCCCC" w:sz="1"/>
+            </w:tcBorders>
+            <w:tcMar>
+              <w:top w:type="dxa" w:w="80"/>
+              <w:left w:type="dxa" w:w="120"/>
+              <w:bottom w:type="dxa" w:w="80"/>
+              <w:right w:type="dxa" w:w="120"/>
+            </w:tcMar>
+          </w:tcPr>
+          <w:p>
+            <w:r>
+              <w:rPr>
+                <w:rFonts w:ascii="Arial" w:cs="Arial" w:eastAsia="Arial" w:hAnsi="Arial"/>
+                <w:sz w:val="20"/>
+                <w:szCs w:val="20"/>
+              </w:rPr>
+              <w:t xml:space="preserve">0x7e75a6c8df958246b5ed9c7da72fc1eda4872fca1b8210c1f0a4d5b787b89141</w:t>
+            </w:r>
+          </w:p>
+        </w:tc>
+      </w:tr>
+    </w:tbl>
+    <w:p>
+      <w:pPr>
+        <w:spacing w:after="0" w:before="0"/>
+      </w:pPr>
+      <w:r>
+        <w:t xml:space="preserve"/>
+      </w:r>
+    </w:p>
+    <w:tbl>
+      <w:tblPr>
+        <w:tblW w:type="dxa" w:w="9360"/>
+        <w:tblBorders>
+          <w:top w:val="single" w:color="auto" w:sz="4"/>
+          <w:left w:val="single" w:color="auto" w:sz="4"/>
+          <w:bottom w:val="single" w:color="auto" w:sz="4"/>
+          <w:right w:val="single" w:color="auto" w:sz="4"/>
+          <w:insideH w:val="single" w:color="auto" w:sz="4"/>
+          <w:insideV w:val="single" w:color="auto" w:sz="4"/>
+        </w:tblBorders>
+      </w:tblPr>
+      <w:tblGrid>
+        <w:gridCol w:w="2400"/>
+        <w:gridCol w:w="6960"/>
+      </w:tblGrid>
+      <w:tr>
+        <w:tc>
+          <w:tcPr>
+            <w:tcW w:type="dxa" w:w="2400"/>
+            <w:tcBorders>
+              <w:top w:val="single" w:color="CCCCCC" w:sz="1"/>
+              <w:left w:val="single" w:color="CCCCCC" w:sz="1"/>
+              <w:bottom w:val="single" w:color="CCCCCC" w:sz="1"/>
+              <w:right w:val="single" w:color="CCCCCC" w:sz="1"/>
+            </w:tcBorders>
+            <w:shd w:fill="D6E4F0" w:val="clear"/>
+            <w:tcMar>
+              <w:top w:type="dxa" w:w="80"/>
+              <w:left w:type="dxa" w:w="120"/>
+              <w:bottom w:type="dxa" w:w="80"/>
+              <w:right w:type="dxa" w:w="120"/>
+            </w:tcMar>
+          </w:tcPr>
+          <w:p>
+            <w:r>
+              <w:rPr>
+                <w:rFonts w:ascii="Arial" w:cs="Arial" w:eastAsia="Arial" w:hAnsi="Arial"/>
+                <w:b/>
+                <w:bCs/>
+                <w:color w:val="1B4F8A"/>
+                <w:sz w:val="20"/>
+                <w:szCs w:val="20"/>
+              </w:rPr>
+              <w:t xml:space="preserve">Audit TX #3</w:t>
+            </w:r>
+          </w:p>
+        </w:tc>
+        <w:tc>
+          <w:tcPr>
+            <w:tcW w:type="dxa" w:w="6960"/>
+            <w:tcBorders>
+              <w:top w:val="single" w:color="CCCCCC" w:sz="1"/>
+              <w:left w:val="single" w:color="CCCCCC" w:sz="1"/>
+              <w:bottom w:val="single" w:color="CCCCCC" w:sz="1"/>
+              <w:right w:val="single" w:color="CCCCCC" w:sz="1"/>
+            </w:tcBorders>
+            <w:tcMar>
+              <w:top w:type="dxa" w:w="80"/>
+              <w:left w:type="dxa" w:w="120"/>
+              <w:bottom w:type="dxa" w:w="80"/>
+              <w:right w:type="dxa" w:w="120"/>
+            </w:tcMar>
+          </w:tcPr>
+          <w:p>
+            <w:r>
+              <w:rPr>
+                <w:rFonts w:ascii="Arial" w:cs="Arial" w:eastAsia="Arial" w:hAnsi="Arial"/>
+                <w:sz w:val="20"/>
+                <w:szCs w:val="20"/>
+              </w:rPr>
+              <w:t xml:space="preserve">0xa9c2ee3df872f294fbbf5162fb1df1469dd47d4b5d23d6e43e638dc11041e426</w:t>
+            </w:r>
+          </w:p>
+        </w:tc>
+      </w:tr>
+    </w:tbl>
+    <w:p>
+      <w:pPr>
+        <w:spacing w:after="0" w:before="0"/>
+      </w:pPr>
+      <w:r>
+        <w:t xml:space="preserve"/>
+      </w:r>
+    </w:p>
+    <w:tbl>
+      <w:tblPr>
+        <w:tblW w:type="dxa" w:w="9360"/>
+        <w:tblBorders>
+          <w:top w:val="single" w:color="auto" w:sz="4"/>
+          <w:left w:val="single" w:color="auto" w:sz="4"/>
+          <w:bottom w:val="single" w:color="auto" w:sz="4"/>
+          <w:right w:val="single" w:color="auto" w:sz="4"/>
+          <w:insideH w:val="single" w:color="auto" w:sz="4"/>
+          <w:insideV w:val="single" w:color="auto" w:sz="4"/>
+        </w:tblBorders>
+      </w:tblPr>
+      <w:tblGrid>
+        <w:gridCol w:w="2400"/>
+        <w:gridCol w:w="6960"/>
+      </w:tblGrid>
+      <w:tr>
+        <w:tc>
+          <w:tcPr>
+            <w:tcW w:type="dxa" w:w="2400"/>
+            <w:tcBorders>
+              <w:top w:val="single" w:color="CCCCCC" w:sz="1"/>
+              <w:left w:val="single" w:color="CCCCCC" w:sz="1"/>
+              <w:bottom w:val="single" w:color="CCCCCC" w:sz="1"/>
+              <w:right w:val="single" w:color="CCCCCC" w:sz="1"/>
+            </w:tcBorders>
+            <w:shd w:fill="D6E4F0" w:val="clear"/>
+            <w:tcMar>
+              <w:top w:type="dxa" w:w="80"/>
+              <w:left w:type="dxa" w:w="120"/>
+              <w:bottom w:type="dxa" w:w="80"/>
+              <w:right w:type="dxa" w:w="120"/>
+            </w:tcMar>
+          </w:tcPr>
+          <w:p>
+            <w:r>
+              <w:rPr>
+                <w:rFonts w:ascii="Arial" w:cs="Arial" w:eastAsia="Arial" w:hAnsi="Arial"/>
+                <w:b/>
+                <w:bCs/>
+                <w:color w:val="1B4F8A"/>
+                <w:sz w:val="20"/>
+                <w:szCs w:val="20"/>
+              </w:rPr>
+              <w:t xml:space="preserve">Audit TX #4</w:t>
+            </w:r>
+          </w:p>
+        </w:tc>
+        <w:tc>
+          <w:tcPr>
+            <w:tcW w:type="dxa" w:w="6960"/>
+            <w:tcBorders>
+              <w:top w:val="single" w:color="CCCCCC" w:sz="1"/>
+              <w:left w:val="single" w:color="CCCCCC" w:sz="1"/>
+              <w:bottom w:val="single" w:color="CCCCCC" w:sz="1"/>
+              <w:right w:val="single" w:color="CCCCCC" w:sz="1"/>
+            </w:tcBorders>
+            <w:tcMar>
+              <w:top w:type="dxa" w:w="80"/>
+              <w:left w:type="dxa" w:w="120"/>
+              <w:bottom w:type="dxa" w:w="80"/>
+              <w:right w:type="dxa" w:w="120"/>
+            </w:tcMar>
+          </w:tcPr>
+          <w:p>
+            <w:r>
+              <w:rPr>
+                <w:rFonts w:ascii="Arial" w:cs="Arial" w:eastAsia="Arial" w:hAnsi="Arial"/>
+                <w:sz w:val="20"/>
+                <w:szCs w:val="20"/>
+              </w:rPr>
+              <w:t xml:space="preserve">0x2b1ebccebea5413e184f424ab63aa1f71f924f59a61ad729d65dfc73cdc3abf6</w:t>
+            </w:r>
+          </w:p>
+        </w:tc>
+      </w:tr>
+    </w:tbl>
+    <w:p>
+      <w:pPr>
+        <w:spacing w:after="0" w:before="0"/>
+      </w:pPr>
+      <w:r>
+        <w:t xml:space="preserve"/>
+      </w:r>
+    </w:p>
+    <w:tbl>
+      <w:tblPr>
+        <w:tblW w:type="dxa" w:w="9360"/>
+        <w:tblBorders>
+          <w:top w:val="single" w:color="auto" w:sz="4"/>
+          <w:left w:val="single" w:color="auto" w:sz="4"/>
+          <w:bottom w:val="single" w:color="auto" w:sz="4"/>
+          <w:right w:val="single" w:color="auto" w:sz="4"/>
+          <w:insideH w:val="single" w:color="auto" w:sz="4"/>
+          <w:insideV w:val="single" w:color="auto" w:sz="4"/>
+        </w:tblBorders>
+      </w:tblPr>
+      <w:tblGrid>
+        <w:gridCol w:w="2400"/>
+        <w:gridCol w:w="6960"/>
+      </w:tblGrid>
+      <w:tr>
+        <w:tc>
+          <w:tcPr>
+            <w:tcW w:type="dxa" w:w="2400"/>
+            <w:tcBorders>
+              <w:top w:val="single" w:color="CCCCCC" w:sz="1"/>
+              <w:left w:val="single" w:color="CCCCCC" w:sz="1"/>
+              <w:bottom w:val="single" w:color="CCCCCC" w:sz="1"/>
+              <w:right w:val="single" w:color="CCCCCC" w:sz="1"/>
+            </w:tcBorders>
+            <w:shd w:fill="D6E4F0" w:val="clear"/>
+            <w:tcMar>
+              <w:top w:type="dxa" w:w="80"/>
+              <w:left w:type="dxa" w:w="120"/>
+              <w:bottom w:type="dxa" w:w="80"/>
+              <w:right w:type="dxa" w:w="120"/>
+            </w:tcMar>
+          </w:tcPr>
+          <w:p>
+            <w:r>
+              <w:rPr>
+                <w:rFonts w:ascii="Arial" w:cs="Arial" w:eastAsia="Arial" w:hAnsi="Arial"/>
+                <w:b/>
+                <w:bCs/>
+                <w:color w:val="1B4F8A"/>
+                <w:sz w:val="20"/>
+                <w:szCs w:val="20"/>
+              </w:rPr>
+              <w:t xml:space="preserve">Audit TX #5</w:t>
+            </w:r>
+          </w:p>
+        </w:tc>
+        <w:tc>
+          <w:tcPr>
+            <w:tcW w:type="dxa" w:w="6960"/>
+            <w:tcBorders>
+              <w:top w:val="single" w:color="CCCCCC" w:sz="1"/>
+              <w:left w:val="single" w:color="CCCCCC" w:sz="1"/>
+              <w:bottom w:val="single" w:color="CCCCCC" w:sz="1"/>
+              <w:right w:val="single" w:color="CCCCCC" w:sz="1"/>
+            </w:tcBorders>
+            <w:tcMar>
+              <w:top w:type="dxa" w:w="80"/>
+              <w:left w:type="dxa" w:w="120"/>
+              <w:bottom w:type="dxa" w:w="80"/>
+              <w:right w:type="dxa" w:w="120"/>
+            </w:tcMar>
+          </w:tcPr>
+          <w:p>
+            <w:r>
+              <w:rPr>
+                <w:rFonts w:ascii="Arial" w:cs="Arial" w:eastAsia="Arial" w:hAnsi="Arial"/>
+                <w:sz w:val="20"/>
+                <w:szCs w:val="20"/>
+              </w:rPr>
+              <w:t xml:space="preserve">0xd7b179af47d989297a6cfe0f05bc672e73bdb61ae5ec5fc4e917c56a6d7e83d9</w:t>
+            </w:r>
+          </w:p>
+        </w:tc>
+      </w:tr>
+    </w:tbl>
+    <w:p>
+      <w:pPr>
+        <w:spacing w:after="0" w:before="0"/>
+      </w:pPr>
+      <w:r>
+        <w:t xml:space="preserve"/>
+      </w:r>
+    </w:p>
+    <w:tbl>
+      <w:tblPr>
+        <w:tblW w:type="dxa" w:w="9360"/>
+        <w:tblBorders>
+          <w:top w:val="single" w:color="auto" w:sz="4"/>
+          <w:left w:val="single" w:color="auto" w:sz="4"/>
+          <w:bottom w:val="single" w:color="auto" w:sz="4"/>
+          <w:right w:val="single" w:color="auto" w:sz="4"/>
+          <w:insideH w:val="single" w:color="auto" w:sz="4"/>
+          <w:insideV w:val="single" w:color="auto" w:sz="4"/>
+        </w:tblBorders>
+      </w:tblPr>
+      <w:tblGrid>
+        <w:gridCol w:w="2400"/>
+        <w:gridCol w:w="6960"/>
+      </w:tblGrid>
+      <w:tr>
+        <w:tc>
+          <w:tcPr>
+            <w:tcW w:type="dxa" w:w="2400"/>
+            <w:tcBorders>
+              <w:top w:val="single" w:color="CCCCCC" w:sz="1"/>
+              <w:left w:val="single" w:color="CCCCCC" w:sz="1"/>
+              <w:bottom w:val="single" w:color="CCCCCC" w:sz="1"/>
+              <w:right w:val="single" w:color="CCCCCC" w:sz="1"/>
+            </w:tcBorders>
+            <w:shd w:fill="D6E4F0" w:val="clear"/>
+            <w:tcMar>
+              <w:top w:type="dxa" w:w="80"/>
+              <w:left w:type="dxa" w:w="120"/>
+              <w:bottom w:type="dxa" w:w="80"/>
+              <w:right w:type="dxa" w:w="120"/>
+            </w:tcMar>
+          </w:tcPr>
+          <w:p>
+            <w:r>
+              <w:rPr>
+                <w:rFonts w:ascii="Arial" w:cs="Arial" w:eastAsia="Arial" w:hAnsi="Arial"/>
+                <w:b/>
+                <w:bCs/>
+                <w:color w:val="1B4F8A"/>
+                <w:sz w:val="20"/>
+                <w:szCs w:val="20"/>
+              </w:rPr>
+              <w:t xml:space="preserve">Audit TX #6</w:t>
+            </w:r>
+          </w:p>
+        </w:tc>
+        <w:tc>
+          <w:tcPr>
+            <w:tcW w:type="dxa" w:w="6960"/>
+            <w:tcBorders>
+              <w:top w:val="single" w:color="CCCCCC" w:sz="1"/>
+              <w:left w:val="single" w:color="CCCCCC" w:sz="1"/>
+              <w:bottom w:val="single" w:color="CCCCCC" w:sz="1"/>
+              <w:right w:val="single" w:color="CCCCCC" w:sz="1"/>
+            </w:tcBorders>
+            <w:tcMar>
+              <w:top w:type="dxa" w:w="80"/>
+              <w:left w:type="dxa" w:w="120"/>
+              <w:bottom w:type="dxa" w:w="80"/>
+              <w:right w:type="dxa" w:w="120"/>
+            </w:tcMar>
+          </w:tcPr>
+          <w:p>
+            <w:r>
+              <w:rPr>
+                <w:rFonts w:ascii="Arial" w:cs="Arial" w:eastAsia="Arial" w:hAnsi="Arial"/>
+                <w:sz w:val="20"/>
+                <w:szCs w:val="20"/>
+              </w:rPr>
+              <w:t xml:space="preserve">0xbc84338aea12eed4a06ff83ca38675ddf935fc58643996cf2291a68c9de53530</w:t>
+            </w:r>
+          </w:p>
+        </w:tc>
+      </w:tr>
+    </w:tbl>
+    <w:p>
+      <w:pPr>
+        <w:spacing w:after="0" w:before="0"/>
+      </w:pPr>
+      <w:r>
+        <w:t xml:space="preserve"/>
+      </w:r>
+    </w:p>
+    <w:tbl>
+      <w:tblPr>
+        <w:tblW w:type="dxa" w:w="9360"/>
+        <w:tblBorders>
+          <w:top w:val="single" w:color="auto" w:sz="4"/>
+          <w:left w:val="single" w:color="auto" w:sz="4"/>
+          <w:bottom w:val="single" w:color="auto" w:sz="4"/>
+          <w:right w:val="single" w:color="auto" w:sz="4"/>
+          <w:insideH w:val="single" w:color="auto" w:sz="4"/>
+          <w:insideV w:val="single" w:color="auto" w:sz="4"/>
+        </w:tblBorders>
+      </w:tblPr>
+      <w:tblGrid>
+        <w:gridCol w:w="2400"/>
+        <w:gridCol w:w="6960"/>
+      </w:tblGrid>
+      <w:tr>
+        <w:tc>
+          <w:tcPr>
+            <w:tcW w:type="dxa" w:w="2400"/>
+            <w:tcBorders>
+              <w:top w:val="single" w:color="CCCCCC" w:sz="1"/>
+              <w:left w:val="single" w:color="CCCCCC" w:sz="1"/>
+              <w:bottom w:val="single" w:color="CCCCCC" w:sz="1"/>
+              <w:right w:val="single" w:color="CCCCCC" w:sz="1"/>
+            </w:tcBorders>
+            <w:shd w:fill="D6E4F0" w:val="clear"/>
+            <w:tcMar>
+              <w:top w:type="dxa" w:w="80"/>
+              <w:left w:type="dxa" w:w="120"/>
+              <w:bottom w:type="dxa" w:w="80"/>
+              <w:right w:type="dxa" w:w="120"/>
+            </w:tcMar>
+          </w:tcPr>
+          <w:p>
+            <w:r>
+              <w:rPr>
+                <w:rFonts w:ascii="Arial" w:cs="Arial" w:eastAsia="Arial" w:hAnsi="Arial"/>
+                <w:b/>
+                <w:bCs/>
+                <w:color w:val="1B4F8A"/>
+                <w:sz w:val="20"/>
+                <w:szCs w:val="20"/>
+              </w:rPr>
+              <w:t xml:space="preserve">Audit TX #7</w:t>
+            </w:r>
+          </w:p>
+        </w:tc>
+        <w:tc>
+          <w:tcPr>
+            <w:tcW w:type="dxa" w:w="6960"/>
+            <w:tcBorders>
+              <w:top w:val="single" w:color="CCCCCC" w:sz="1"/>
+              <w:left w:val="single" w:color="CCCCCC" w:sz="1"/>
+              <w:bottom w:val="single" w:color="CCCCCC" w:sz="1"/>
+              <w:right w:val="single" w:color="CCCCCC" w:sz="1"/>
+            </w:tcBorders>
+            <w:tcMar>
+              <w:top w:type="dxa" w:w="80"/>
+              <w:left w:type="dxa" w:w="120"/>
+              <w:bottom w:type="dxa" w:w="80"/>
+              <w:right w:type="dxa" w:w="120"/>
+            </w:tcMar>
+          </w:tcPr>
+          <w:p>
+            <w:r>
+              <w:rPr>
+                <w:rFonts w:ascii="Arial" w:cs="Arial" w:eastAsia="Arial" w:hAnsi="Arial"/>
+                <w:sz w:val="20"/>
+                <w:szCs w:val="20"/>
+              </w:rPr>
+              <w:t xml:space="preserve">0x1ec5861305fce6ff34f6f79ddeb466dfe294d61b13fab46841efdfa6846e1dcf</w:t>
+            </w:r>
+          </w:p>
+        </w:tc>
+      </w:tr>
+    </w:tbl>
+    <w:p>
+      <w:pPr>
+        <w:spacing w:after="0" w:before="0"/>
+      </w:pPr>
+      <w:r>
+        <w:t xml:space="preserve"/>
+      </w:r>
+    </w:p>
+    <w:tbl>
+      <w:tblPr>
+        <w:tblW w:type="dxa" w:w="9360"/>
+        <w:tblBorders>
+          <w:top w:val="single" w:color="auto" w:sz="4"/>
+          <w:left w:val="single" w:color="auto" w:sz="4"/>
+          <w:bottom w:val="single" w:color="auto" w:sz="4"/>
+          <w:right w:val="single" w:color="auto" w:sz="4"/>
+          <w:insideH w:val="single" w:color="auto" w:sz="4"/>
+          <w:insideV w:val="single" w:color="auto" w:sz="4"/>
+        </w:tblBorders>
+      </w:tblPr>
+      <w:tblGrid>
+        <w:gridCol w:w="2400"/>
+        <w:gridCol w:w="6960"/>
+      </w:tblGrid>
+      <w:tr>
+        <w:tc>
+          <w:tcPr>
+            <w:tcW w:type="dxa" w:w="2400"/>
+            <w:tcBorders>
+              <w:top w:val="single" w:color="CCCCCC" w:sz="1"/>
+              <w:left w:val="single" w:color="CCCCCC" w:sz="1"/>
+              <w:bottom w:val="single" w:color="CCCCCC" w:sz="1"/>
+              <w:right w:val="single" w:color="CCCCCC" w:sz="1"/>
+            </w:tcBorders>
+            <w:shd w:fill="D6E4F0" w:val="clear"/>
+            <w:tcMar>
+              <w:top w:type="dxa" w:w="80"/>
+              <w:left w:type="dxa" w:w="120"/>
+              <w:bottom w:type="dxa" w:w="80"/>
+              <w:right w:type="dxa" w:w="120"/>
+            </w:tcMar>
+          </w:tcPr>
+          <w:p>
+            <w:r>
+              <w:rPr>
+                <w:rFonts w:ascii="Arial" w:cs="Arial" w:eastAsia="Arial" w:hAnsi="Arial"/>
+                <w:b/>
+                <w:bCs/>
+                <w:color w:val="1B4F8A"/>
+                <w:sz w:val="20"/>
+                <w:szCs w:val="20"/>
+              </w:rPr>
+              <w:t xml:space="preserve">Audit TX #8</w:t>
+            </w:r>
+          </w:p>
+        </w:tc>
+        <w:tc>
+          <w:tcPr>
+            <w:tcW w:type="dxa" w:w="6960"/>
+            <w:tcBorders>
+              <w:top w:val="single" w:color="CCCCCC" w:sz="1"/>
+              <w:left w:val="single" w:color="CCCCCC" w:sz="1"/>
+              <w:bottom w:val="single" w:color="CCCCCC" w:sz="1"/>
+              <w:right w:val="single" w:color="CCCCCC" w:sz="1"/>
+            </w:tcBorders>
+            <w:tcMar>
+              <w:top w:type="dxa" w:w="80"/>
+              <w:left w:type="dxa" w:w="120"/>
+              <w:bottom w:type="dxa" w:w="80"/>
+              <w:right w:type="dxa" w:w="120"/>
+            </w:tcMar>
+          </w:tcPr>
+          <w:p>
+            <w:r>
+              <w:rPr>
+                <w:rFonts w:ascii="Arial" w:cs="Arial" w:eastAsia="Arial" w:hAnsi="Arial"/>
+                <w:sz w:val="20"/>
+                <w:szCs w:val="20"/>
+              </w:rPr>
+              <w:t xml:space="preserve">0x88e92a926963993715a55d1611e8d41f2059c0ca67ee939ee73947d3b1d8b9ca</w:t>
+            </w:r>
+          </w:p>
+        </w:tc>
+      </w:tr>
+    </w:tbl>
+    <w:p>
+      <w:pPr>
+        <w:spacing w:after="0" w:before="0"/>
+      </w:pPr>
+      <w:r>
+        <w:t xml:space="preserve"/>
+      </w:r>
+    </w:p>
+    <w:tbl>
+      <w:tblPr>
+        <w:tblW w:type="dxa" w:w="9360"/>
+        <w:tblBorders>
+          <w:top w:val="single" w:color="auto" w:sz="4"/>
+          <w:left w:val="single" w:color="auto" w:sz="4"/>
+          <w:bottom w:val="single" w:color="auto" w:sz="4"/>
+          <w:right w:val="single" w:color="auto" w:sz="4"/>
+          <w:insideH w:val="single" w:color="auto" w:sz="4"/>
+          <w:insideV w:val="single" w:color="auto" w:sz="4"/>
+        </w:tblBorders>
+      </w:tblPr>
+      <w:tblGrid>
+        <w:gridCol w:w="2400"/>
+        <w:gridCol w:w="6960"/>
+      </w:tblGrid>
+      <w:tr>
+        <w:tc>
+          <w:tcPr>
+            <w:tcW w:type="dxa" w:w="2400"/>
+            <w:tcBorders>
+              <w:top w:val="single" w:color="CCCCCC" w:sz="1"/>
+              <w:left w:val="single" w:color="CCCCCC" w:sz="1"/>
+              <w:bottom w:val="single" w:color="CCCCCC" w:sz="1"/>
+              <w:right w:val="single" w:color="CCCCCC" w:sz="1"/>
+            </w:tcBorders>
+            <w:shd w:fill="D6E4F0" w:val="clear"/>
+            <w:tcMar>
+              <w:top w:type="dxa" w:w="80"/>
+              <w:left w:type="dxa" w:w="120"/>
+              <w:bottom w:type="dxa" w:w="80"/>
+              <w:right w:type="dxa" w:w="120"/>
+            </w:tcMar>
+          </w:tcPr>
+          <w:p>
+            <w:r>
+              <w:rPr>
+                <w:rFonts w:ascii="Arial" w:cs="Arial" w:eastAsia="Arial" w:hAnsi="Arial"/>
+                <w:b/>
+                <w:bCs/>
+                <w:color w:val="1B4F8A"/>
+                <w:sz w:val="20"/>
+                <w:szCs w:val="20"/>
+              </w:rPr>
+              <w:t xml:space="preserve">Audit TX #9</w:t>
+            </w:r>
+          </w:p>
+        </w:tc>
+        <w:tc>
+          <w:tcPr>
+            <w:tcW w:type="dxa" w:w="6960"/>
+            <w:tcBorders>
+              <w:top w:val="single" w:color="CCCCCC" w:sz="1"/>
+              <w:left w:val="single" w:color="CCCCCC" w:sz="1"/>
+              <w:bottom w:val="single" w:color="CCCCCC" w:sz="1"/>
+              <w:right w:val="single" w:color="CCCCCC" w:sz="1"/>
+            </w:tcBorders>
+            <w:tcMar>
+              <w:top w:type="dxa" w:w="80"/>
+              <w:left w:type="dxa" w:w="120"/>
+              <w:bottom w:type="dxa" w:w="80"/>
+              <w:right w:type="dxa" w:w="120"/>
+            </w:tcMar>
+          </w:tcPr>
+          <w:p>
+            <w:r>
+              <w:rPr>
+                <w:rFonts w:ascii="Arial" w:cs="Arial" w:eastAsia="Arial" w:hAnsi="Arial"/>
+                <w:sz w:val="20"/>
+                <w:szCs w:val="20"/>
+              </w:rPr>
+              <w:t xml:space="preserve">0xb36f2e81547f9a187119be222e1378a67a208794eeeb902b7e19efa2e5c1b376</w:t>
             </w:r>
           </w:p>
         </w:tc>
@@ -14563,20 +16200,7 @@
           <w:sz w:val="26"/>
           <w:szCs w:val="26"/>
         </w:rPr>
-        <w:t xml:space="preserve">5.4 What's Working Right Now</w:t>
-      </w:r>
-    </w:p>
-    <w:p>
-      <w:pPr>
-        <w:spacing w:after="80" w:before="80"/>
-      </w:pPr>
-      <w:r>
-        <w:rPr>
-          <w:rFonts w:ascii="Arial" w:cs="Arial" w:eastAsia="Arial" w:hAnsi="Arial"/>
-          <w:sz w:val="22"/>
-          <w:szCs w:val="22"/>
-        </w:rPr>
-        <w:t xml:space="preserve">As of May 14, 2026, the following is fully operational and running 24/7 without any local machine required:</w:t>
+        <w:t xml:space="preserve">6.5 What's Next</w:t>
       </w:r>
     </w:p>
     <w:p>
@@ -14596,7 +16220,7 @@
           <w:sz w:val="22"/>
           <w:szCs w:val="22"/>
         </w:rPr>
-        <w:t xml:space="preserve">POST /audit — accepts any Solidity contract, runs Claude analysis, posts result to Arc, returns structured JSON with txHash.</w:t>
+        <w:t xml:space="preserve">Agent buyer script — scripts/agent-buyer.ts: a fully autonomous agent that approves USDC, calls the API, reads the result, and makes a pass/fail decision. Proves the agent-to-agent pattern end-to-end.</w:t>
       </w:r>
     </w:p>
     <w:p>
@@ -14616,7 +16240,7 @@
           <w:sz w:val="22"/>
           <w:szCs w:val="22"/>
         </w:rPr>
-        <w:t xml:space="preserve">GET /health — returns current status, network, contract address, and total audit count.</w:t>
+        <w:t xml:space="preserve">Arc Discord project post — post in #general-chat when 6hr cooldown lifts. Link to GitHub and a demo tx.</w:t>
       </w:r>
     </w:p>
     <w:p>
@@ -14636,7 +16260,7 @@
           <w:sz w:val="22"/>
           <w:szCs w:val="22"/>
         </w:rPr>
-        <w:t xml:space="preserve">GET /audit/:id — returns a previous audit result from SQLite by ID.</w:t>
+        <w:t xml:space="preserve">Continue engaging on Arc Twitter — reply to substantive posts about technology, payments, and agent commerce.</w:t>
       </w:r>
     </w:p>
     <w:p>
@@ -14656,47 +16280,7 @@
           <w:sz w:val="22"/>
           <w:szCs w:val="22"/>
         </w:rPr>
-        <w:t xml:space="preserve">On-chain posting — every audit writes to AuditRegistry.sol on Arc testnet in under 1 second.</w:t>
-      </w:r>
-    </w:p>
-    <w:p>
-      <w:pPr>
-        <w:pStyle w:val="ListParagraph"/>
-        <w:numPr>
-          <w:ilvl w:val="0"/>
-          <w:numId w:val="2"/>
-        </w:numPr>
-        <w:spacing w:after="40" w:before="40"/>
-      </w:pPr>
-      <w:r>
-        <w:rPr>
-          <w:rFonts w:ascii="Arial" w:cs="Arial" w:eastAsia="Arial" w:hAnsi="Arial"/>
-          <w:b w:val="false"/>
-          <w:bCs w:val="false"/>
-          <w:sz w:val="22"/>
-          <w:szCs w:val="22"/>
-        </w:rPr>
-        <w:t xml:space="preserve">Rate limiting — per wallet address, 5 requests per hour maximum.</w:t>
-      </w:r>
-    </w:p>
-    <w:p>
-      <w:pPr>
-        <w:pStyle w:val="ListParagraph"/>
-        <w:numPr>
-          <w:ilvl w:val="0"/>
-          <w:numId w:val="2"/>
-        </w:numPr>
-        <w:spacing w:after="40" w:before="40"/>
-      </w:pPr>
-      <w:r>
-        <w:rPr>
-          <w:rFonts w:ascii="Arial" w:cs="Arial" w:eastAsia="Arial" w:hAnsi="Arial"/>
-          <w:b w:val="false"/>
-          <w:bCs w:val="false"/>
-          <w:sz w:val="22"/>
-          <w:szCs w:val="22"/>
-        </w:rPr>
-        <w:t xml:space="preserve">SQLite indexing — all audit runs stored locally on Railway for fast querying.</w:t>
+        <w:t xml:space="preserve">Mainnet readiness review — when Arc mainnet date is announced, document what needs to change: fee pricing, persistent rate limiting (Redis), contract upgrade strategy.</w:t>
       </w:r>
     </w:p>
     <w:p>
@@ -14721,152 +16305,7 @@
           <w:sz w:val="26"/>
           <w:szCs w:val="26"/>
         </w:rPr>
-        <w:t xml:space="preserve">5.5 What's Next</w:t>
-      </w:r>
-    </w:p>
-    <w:p>
-      <w:pPr>
-        <w:pStyle w:val="ListParagraph"/>
-        <w:numPr>
-          <w:ilvl w:val="0"/>
-          <w:numId w:val="2"/>
-        </w:numPr>
-        <w:spacing w:after="40" w:before="40"/>
-      </w:pPr>
-      <w:r>
-        <w:rPr>
-          <w:rFonts w:ascii="Arial" w:cs="Arial" w:eastAsia="Arial" w:hAnsi="Arial"/>
-          <w:b w:val="false"/>
-          <w:bCs w:val="false"/>
-          <w:sz w:val="22"/>
-          <w:szCs w:val="22"/>
-        </w:rPr>
-        <w:t xml:space="preserve">USDC payment gate — wire in payment verification so callers must pay 1 USDC before audit runs. Currently the API runs without payment check.</w:t>
-      </w:r>
-    </w:p>
-    <w:p>
-      <w:pPr>
-        <w:pStyle w:val="ListParagraph"/>
-        <w:numPr>
-          <w:ilvl w:val="0"/>
-          <w:numId w:val="2"/>
-        </w:numPr>
-        <w:spacing w:after="40" w:before="40"/>
-      </w:pPr>
-      <w:r>
-        <w:rPr>
-          <w:rFonts w:ascii="Arial" w:cs="Arial" w:eastAsia="Arial" w:hAnsi="Arial"/>
-          <w:b w:val="false"/>
-          <w:bCs w:val="false"/>
-          <w:sz w:val="22"/>
-          <w:szCs w:val="22"/>
-        </w:rPr>
-        <w:t xml:space="preserve">Run 10+ demo audits — use mix of vulnerable and clean contracts to build up on-chain history.</w:t>
-      </w:r>
-    </w:p>
-    <w:p>
-      <w:pPr>
-        <w:pStyle w:val="ListParagraph"/>
-        <w:numPr>
-          <w:ilvl w:val="0"/>
-          <w:numId w:val="2"/>
-        </w:numPr>
-        <w:spacing w:after="40" w:before="40"/>
-      </w:pPr>
-      <w:r>
-        <w:rPr>
-          <w:rFonts w:ascii="Arial" w:cs="Arial" w:eastAsia="Arial" w:hAnsi="Arial"/>
-          <w:b w:val="false"/>
-          <w:bCs w:val="false"/>
-          <w:sz w:val="22"/>
-          <w:szCs w:val="22"/>
-        </w:rPr>
-        <w:t xml:space="preserve">Write README — agent-to-agent usage pattern as the primary section, full API reference.</w:t>
-      </w:r>
-    </w:p>
-    <w:p>
-      <w:pPr>
-        <w:pStyle w:val="ListParagraph"/>
-        <w:numPr>
-          <w:ilvl w:val="0"/>
-          <w:numId w:val="2"/>
-        </w:numPr>
-        <w:spacing w:after="40" w:before="40"/>
-      </w:pPr>
-      <w:r>
-        <w:rPr>
-          <w:rFonts w:ascii="Arial" w:cs="Arial" w:eastAsia="Arial" w:hAnsi="Arial"/>
-          <w:b w:val="false"/>
-          <w:bCs w:val="false"/>
-          <w:sz w:val="22"/>
-          <w:szCs w:val="22"/>
-        </w:rPr>
-        <w:t xml:space="preserve">Agent buyer script — scripts/agent-buyer.ts that autonomously pays, calls API, reads result, makes pass/fail decision.</w:t>
-      </w:r>
-    </w:p>
-    <w:p>
-      <w:pPr>
-        <w:pStyle w:val="ListParagraph"/>
-        <w:numPr>
-          <w:ilvl w:val="0"/>
-          <w:numId w:val="2"/>
-        </w:numPr>
-        <w:spacing w:after="40" w:before="40"/>
-      </w:pPr>
-      <w:r>
-        <w:rPr>
-          <w:rFonts w:ascii="Arial" w:cs="Arial" w:eastAsia="Arial" w:hAnsi="Arial"/>
-          <w:b w:val="false"/>
-          <w:bCs w:val="false"/>
-          <w:sz w:val="22"/>
-          <w:szCs w:val="22"/>
-        </w:rPr>
-        <w:t xml:space="preserve">Arc Discord post — once Discord access is available. Tag Circle and Anthropic.</w:t>
-      </w:r>
-    </w:p>
-    <w:p>
-      <w:pPr>
-        <w:pStyle w:val="ListParagraph"/>
-        <w:numPr>
-          <w:ilvl w:val="0"/>
-          <w:numId w:val="2"/>
-        </w:numPr>
-        <w:spacing w:after="40" w:before="40"/>
-      </w:pPr>
-      <w:r>
-        <w:rPr>
-          <w:rFonts w:ascii="Arial" w:cs="Arial" w:eastAsia="Arial" w:hAnsi="Arial"/>
-          <w:b w:val="false"/>
-          <w:bCs w:val="false"/>
-          <w:sz w:val="22"/>
-          <w:szCs w:val="22"/>
-        </w:rPr>
-        <w:t xml:space="preserve">X post — tag @circle and @anthropic with GitHub link and demo tx on Arc block explorer.</w:t>
-      </w:r>
-    </w:p>
-    <w:p>
-      <w:pPr>
-        <w:spacing w:after="0" w:before="160"/>
-      </w:pPr>
-      <w:r>
-        <w:t xml:space="preserve"/>
-      </w:r>
-    </w:p>
-    <w:p>
-      <w:pPr>
-        <w:pStyle w:val="Heading2"/>
-        <w:spacing w:after="80" w:before="280"/>
-      </w:pPr>
-      <w:r>
-        <w:rPr>
-          <w:rFonts w:ascii="Arial" w:cs="Arial" w:eastAsia="Arial" w:hAnsi="Arial"/>
-          <w:b/>
-          <w:bCs/>
-          <w:color w:val="2E75B6"/>
-          <w:sz w:val="26"/>
-          <w:szCs w:val="26"/>
-        </w:rPr>
-        <w:t xml:space="preserve">5.6 How to Continue in a New Chat</w:t>
+        <w:t xml:space="preserve">6.6 How to Continue in a New Chat</w:t>
       </w:r>
     </w:p>
     <w:p>
@@ -14919,7 +16358,7 @@
                 <w:sz w:val="22"/>
                 <w:szCs w:val="22"/>
               </w:rPr>
-              <w:t xml:space="preserve">I am building ArcAuditAgent — a Claude-powered autonomous smart contract audit agent deployed on Circle's Arc Network, designed for agent-to-agent commerce. The backend is live at https://arc-audit-agent-production.up.railway.app and the AuditRegistry contract is deployed at 0xC996c0143c4C88F0B0bC32d328D14c071A603CcB on Arc testnet. Here is the full project charter v2.0 Final. Read Section 5 for the current state and help me continue from the next incomplete item.</w:t>
+              <w:t xml:space="preserve">I am building ArcAuditAgent — a Claude-powered autonomous smart contract audit agent deployed on Circle's Arc Network. The backend is live at https://arc-audit-agent-production.up.railway.app, the AuditRegistry contract is at 0xC996c0143c4C88F0B0bC32d328D14c071A603CcB on Arc testnet, and 9 audits are confirmed on-chain. Here is the full project charter v2.0 Final. Read Section 6 for current state and help me continue from the next incomplete item.</w:t>
             </w:r>
           </w:p>
         </w:tc>
@@ -14950,7 +16389,7 @@
           <w:sz w:val="18"/>
           <w:szCs w:val="18"/>
         </w:rPr>
-        <w:t xml:space="preserve">ArcAuditAgent Project Charter v2.0 Final  |  Kiran Nisaci  |  May 14, 2026  |  Arc Testnet Live  |  Agent-to-Agent Commerce</w:t>
+        <w:t xml:space="preserve">ArcAuditAgent Project Charter v2.0 Final  |  Kiran Nisaci  |  May 15, 2026  |  Arc Testnet Live  |  9 Audits On-Chain</w:t>
       </w:r>
     </w:p>
     <w:sectPr>

</xml_diff>

<commit_message>
Add ERC-8183 agentic commerce integration — full job lifecycle working
</commit_message>
<xml_diff>
--- a/ArcAuditAgent_Charter_v2_Final.docx
+++ b/ArcAuditAgent_Charter_v2_Final.docx
@@ -13891,7 +13891,7 @@
                 <w:sz w:val="20"/>
                 <w:szCs w:val="20"/>
               </w:rPr>
-              <w:t xml:space="preserve">Arc Community Engagement</w:t>
+              <w:t xml:space="preserve">Arc Discord Project Post</w:t>
             </w:r>
           </w:p>
         </w:tc>
@@ -13951,7 +13951,7 @@
                 <w:sz w:val="20"/>
                 <w:szCs w:val="20"/>
               </w:rPr>
-              <w:t xml:space="preserve">2 constructive replies on Arc tweets</w:t>
+              <w:t xml:space="preserve">#general-chat post sent with API and GitHub links</w:t>
             </w:r>
           </w:p>
         </w:tc>
@@ -13983,7 +13983,7 @@
                 <w:sz w:val="20"/>
                 <w:szCs w:val="20"/>
               </w:rPr>
-              <w:t xml:space="preserve">Agent Buyer Script</w:t>
+              <w:t xml:space="preserve">Arc Community Engagement</w:t>
             </w:r>
           </w:p>
         </w:tc>
@@ -14013,7 +14013,7 @@
                 <w:sz w:val="20"/>
                 <w:szCs w:val="20"/>
               </w:rPr>
-              <w:t xml:space="preserve">Pending</w:t>
+              <w:t xml:space="preserve">Complete ✅</w:t>
             </w:r>
           </w:p>
         </w:tc>
@@ -14043,7 +14043,7 @@
                 <w:sz w:val="20"/>
                 <w:szCs w:val="20"/>
               </w:rPr>
-              <w:t xml:space="preserve">Next session — scripts/agent-buyer.ts</w:t>
+              <w:t xml:space="preserve">2 constructive replies on Arc tweets + Discord Q&amp;A response</w:t>
             </w:r>
           </w:p>
         </w:tc>
@@ -14075,7 +14075,7 @@
                 <w:sz w:val="20"/>
                 <w:szCs w:val="20"/>
               </w:rPr>
-              <w:t xml:space="preserve">Arc Discord Project Post</w:t>
+              <w:t xml:space="preserve">Agent Buyer Script</w:t>
             </w:r>
           </w:p>
         </w:tc>
@@ -14105,7 +14105,7 @@
                 <w:sz w:val="20"/>
                 <w:szCs w:val="20"/>
               </w:rPr>
-              <w:t xml:space="preserve">Pending</w:t>
+              <w:t xml:space="preserve">Complete ✅</w:t>
             </w:r>
           </w:p>
         </w:tc>
@@ -14135,7 +14135,375 @@
                 <w:sz w:val="20"/>
                 <w:szCs w:val="20"/>
               </w:rPr>
-              <w:t xml:space="preserve">Post in #general-chat when 6hr cooldown lifts</w:t>
+              <w:t xml:space="preserve">scripts/agent-buyer.ts — autonomous pass/fail decision working</w:t>
+            </w:r>
+          </w:p>
+        </w:tc>
+      </w:tr>
+      <w:tr>
+        <w:tc>
+          <w:tcPr>
+            <w:tcW w:type="dxa" w:w="3200"/>
+            <w:tcBorders>
+              <w:top w:val="single" w:color="CCCCCC" w:sz="1"/>
+              <w:left w:val="single" w:color="CCCCCC" w:sz="1"/>
+              <w:bottom w:val="single" w:color="CCCCCC" w:sz="1"/>
+              <w:right w:val="single" w:color="CCCCCC" w:sz="1"/>
+            </w:tcBorders>
+            <w:shd w:fill="F5F7FA" w:val="clear"/>
+            <w:tcMar>
+              <w:top w:type="dxa" w:w="80"/>
+              <w:left w:type="dxa" w:w="120"/>
+              <w:bottom w:type="dxa" w:w="80"/>
+              <w:right w:type="dxa" w:w="120"/>
+            </w:tcMar>
+          </w:tcPr>
+          <w:p>
+            <w:r>
+              <w:rPr>
+                <w:rFonts w:ascii="Arial" w:cs="Arial" w:eastAsia="Arial" w:hAnsi="Arial"/>
+                <w:b/>
+                <w:bCs/>
+                <w:sz w:val="20"/>
+                <w:szCs w:val="20"/>
+              </w:rPr>
+              <w:t xml:space="preserve">ERC-8004 Identity</w:t>
+            </w:r>
+          </w:p>
+        </w:tc>
+        <w:tc>
+          <w:tcPr>
+            <w:tcW w:type="dxa" w:w="1960"/>
+            <w:tcBorders>
+              <w:top w:val="single" w:color="CCCCCC" w:sz="1"/>
+              <w:left w:val="single" w:color="CCCCCC" w:sz="1"/>
+              <w:bottom w:val="single" w:color="CCCCCC" w:sz="1"/>
+              <w:right w:val="single" w:color="CCCCCC" w:sz="1"/>
+            </w:tcBorders>
+            <w:shd w:fill="F5F7FA" w:val="clear"/>
+            <w:tcMar>
+              <w:top w:type="dxa" w:w="80"/>
+              <w:left w:type="dxa" w:w="120"/>
+              <w:bottom w:type="dxa" w:w="80"/>
+              <w:right w:type="dxa" w:w="120"/>
+            </w:tcMar>
+          </w:tcPr>
+          <w:p>
+            <w:r>
+              <w:rPr>
+                <w:rFonts w:ascii="Arial" w:cs="Arial" w:eastAsia="Arial" w:hAnsi="Arial"/>
+                <w:b w:val="false"/>
+                <w:bCs w:val="false"/>
+                <w:sz w:val="20"/>
+                <w:szCs w:val="20"/>
+              </w:rPr>
+              <w:t xml:space="preserve">Complete ✅</w:t>
+            </w:r>
+          </w:p>
+        </w:tc>
+        <w:tc>
+          <w:tcPr>
+            <w:tcW w:type="dxa" w:w="4200"/>
+            <w:tcBorders>
+              <w:top w:val="single" w:color="CCCCCC" w:sz="1"/>
+              <w:left w:val="single" w:color="CCCCCC" w:sz="1"/>
+              <w:bottom w:val="single" w:color="CCCCCC" w:sz="1"/>
+              <w:right w:val="single" w:color="CCCCCC" w:sz="1"/>
+            </w:tcBorders>
+            <w:shd w:fill="F5F7FA" w:val="clear"/>
+            <w:tcMar>
+              <w:top w:type="dxa" w:w="80"/>
+              <w:left w:type="dxa" w:w="120"/>
+              <w:bottom w:type="dxa" w:w="80"/>
+              <w:right w:type="dxa" w:w="120"/>
+            </w:tcMar>
+          </w:tcPr>
+          <w:p>
+            <w:r>
+              <w:rPr>
+                <w:rFonts w:ascii="Arial" w:cs="Arial" w:eastAsia="Arial" w:hAnsi="Arial"/>
+                <w:b w:val="false"/>
+                <w:bCs w:val="false"/>
+                <w:sz w:val="20"/>
+                <w:szCs w:val="20"/>
+              </w:rPr>
+              <w:t xml:space="preserve">Agent ID 11831 minted on IdentityRegistry</w:t>
+            </w:r>
+          </w:p>
+        </w:tc>
+      </w:tr>
+      <w:tr>
+        <w:tc>
+          <w:tcPr>
+            <w:tcW w:type="dxa" w:w="3200"/>
+            <w:tcBorders>
+              <w:top w:val="single" w:color="CCCCCC" w:sz="1"/>
+              <w:left w:val="single" w:color="CCCCCC" w:sz="1"/>
+              <w:bottom w:val="single" w:color="CCCCCC" w:sz="1"/>
+              <w:right w:val="single" w:color="CCCCCC" w:sz="1"/>
+            </w:tcBorders>
+            <w:shd w:fill="FFFFFF" w:val="clear"/>
+            <w:tcMar>
+              <w:top w:type="dxa" w:w="80"/>
+              <w:left w:type="dxa" w:w="120"/>
+              <w:bottom w:type="dxa" w:w="80"/>
+              <w:right w:type="dxa" w:w="120"/>
+            </w:tcMar>
+          </w:tcPr>
+          <w:p>
+            <w:r>
+              <w:rPr>
+                <w:rFonts w:ascii="Arial" w:cs="Arial" w:eastAsia="Arial" w:hAnsi="Arial"/>
+                <w:b/>
+                <w:bCs/>
+                <w:sz w:val="20"/>
+                <w:szCs w:val="20"/>
+              </w:rPr>
+              <w:t xml:space="preserve">ERC-8004 Reputation</w:t>
+            </w:r>
+          </w:p>
+        </w:tc>
+        <w:tc>
+          <w:tcPr>
+            <w:tcW w:type="dxa" w:w="1960"/>
+            <w:tcBorders>
+              <w:top w:val="single" w:color="CCCCCC" w:sz="1"/>
+              <w:left w:val="single" w:color="CCCCCC" w:sz="1"/>
+              <w:bottom w:val="single" w:color="CCCCCC" w:sz="1"/>
+              <w:right w:val="single" w:color="CCCCCC" w:sz="1"/>
+            </w:tcBorders>
+            <w:shd w:fill="FFFFFF" w:val="clear"/>
+            <w:tcMar>
+              <w:top w:type="dxa" w:w="80"/>
+              <w:left w:type="dxa" w:w="120"/>
+              <w:bottom w:type="dxa" w:w="80"/>
+              <w:right w:type="dxa" w:w="120"/>
+            </w:tcMar>
+          </w:tcPr>
+          <w:p>
+            <w:r>
+              <w:rPr>
+                <w:rFonts w:ascii="Arial" w:cs="Arial" w:eastAsia="Arial" w:hAnsi="Arial"/>
+                <w:b w:val="false"/>
+                <w:bCs w:val="false"/>
+                <w:sz w:val="20"/>
+                <w:szCs w:val="20"/>
+              </w:rPr>
+              <w:t xml:space="preserve">Complete ✅</w:t>
+            </w:r>
+          </w:p>
+        </w:tc>
+        <w:tc>
+          <w:tcPr>
+            <w:tcW w:type="dxa" w:w="4200"/>
+            <w:tcBorders>
+              <w:top w:val="single" w:color="CCCCCC" w:sz="1"/>
+              <w:left w:val="single" w:color="CCCCCC" w:sz="1"/>
+              <w:bottom w:val="single" w:color="CCCCCC" w:sz="1"/>
+              <w:right w:val="single" w:color="CCCCCC" w:sz="1"/>
+            </w:tcBorders>
+            <w:shd w:fill="FFFFFF" w:val="clear"/>
+            <w:tcMar>
+              <w:top w:type="dxa" w:w="80"/>
+              <w:left w:type="dxa" w:w="120"/>
+              <w:bottom w:type="dxa" w:w="80"/>
+              <w:right w:type="dxa" w:w="120"/>
+            </w:tcMar>
+          </w:tcPr>
+          <w:p>
+            <w:r>
+              <w:rPr>
+                <w:rFonts w:ascii="Arial" w:cs="Arial" w:eastAsia="Arial" w:hAnsi="Arial"/>
+                <w:b w:val="false"/>
+                <w:bCs w:val="false"/>
+                <w:sz w:val="20"/>
+                <w:szCs w:val="20"/>
+              </w:rPr>
+              <w:t xml:space="preserve">Score 95/100 recorded by Treasury validator</w:t>
+            </w:r>
+          </w:p>
+        </w:tc>
+      </w:tr>
+      <w:tr>
+        <w:tc>
+          <w:tcPr>
+            <w:tcW w:type="dxa" w:w="3200"/>
+            <w:tcBorders>
+              <w:top w:val="single" w:color="CCCCCC" w:sz="1"/>
+              <w:left w:val="single" w:color="CCCCCC" w:sz="1"/>
+              <w:bottom w:val="single" w:color="CCCCCC" w:sz="1"/>
+              <w:right w:val="single" w:color="CCCCCC" w:sz="1"/>
+            </w:tcBorders>
+            <w:shd w:fill="F5F7FA" w:val="clear"/>
+            <w:tcMar>
+              <w:top w:type="dxa" w:w="80"/>
+              <w:left w:type="dxa" w:w="120"/>
+              <w:bottom w:type="dxa" w:w="80"/>
+              <w:right w:type="dxa" w:w="120"/>
+            </w:tcMar>
+          </w:tcPr>
+          <w:p>
+            <w:r>
+              <w:rPr>
+                <w:rFonts w:ascii="Arial" w:cs="Arial" w:eastAsia="Arial" w:hAnsi="Arial"/>
+                <w:b/>
+                <w:bCs/>
+                <w:sz w:val="20"/>
+                <w:szCs w:val="20"/>
+              </w:rPr>
+              <w:t xml:space="preserve">ERC-8004 Validation</w:t>
+            </w:r>
+          </w:p>
+        </w:tc>
+        <w:tc>
+          <w:tcPr>
+            <w:tcW w:type="dxa" w:w="1960"/>
+            <w:tcBorders>
+              <w:top w:val="single" w:color="CCCCCC" w:sz="1"/>
+              <w:left w:val="single" w:color="CCCCCC" w:sz="1"/>
+              <w:bottom w:val="single" w:color="CCCCCC" w:sz="1"/>
+              <w:right w:val="single" w:color="CCCCCC" w:sz="1"/>
+            </w:tcBorders>
+            <w:shd w:fill="F5F7FA" w:val="clear"/>
+            <w:tcMar>
+              <w:top w:type="dxa" w:w="80"/>
+              <w:left w:type="dxa" w:w="120"/>
+              <w:bottom w:type="dxa" w:w="80"/>
+              <w:right w:type="dxa" w:w="120"/>
+            </w:tcMar>
+          </w:tcPr>
+          <w:p>
+            <w:r>
+              <w:rPr>
+                <w:rFonts w:ascii="Arial" w:cs="Arial" w:eastAsia="Arial" w:hAnsi="Arial"/>
+                <w:b w:val="false"/>
+                <w:bCs w:val="false"/>
+                <w:sz w:val="20"/>
+                <w:szCs w:val="20"/>
+              </w:rPr>
+              <w:t xml:space="preserve">Complete ✅</w:t>
+            </w:r>
+          </w:p>
+        </w:tc>
+        <w:tc>
+          <w:tcPr>
+            <w:tcW w:type="dxa" w:w="4200"/>
+            <w:tcBorders>
+              <w:top w:val="single" w:color="CCCCCC" w:sz="1"/>
+              <w:left w:val="single" w:color="CCCCCC" w:sz="1"/>
+              <w:bottom w:val="single" w:color="CCCCCC" w:sz="1"/>
+              <w:right w:val="single" w:color="CCCCCC" w:sz="1"/>
+            </w:tcBorders>
+            <w:shd w:fill="F5F7FA" w:val="clear"/>
+            <w:tcMar>
+              <w:top w:type="dxa" w:w="80"/>
+              <w:left w:type="dxa" w:w="120"/>
+              <w:bottom w:type="dxa" w:w="80"/>
+              <w:right w:type="dxa" w:w="120"/>
+            </w:tcMar>
+          </w:tcPr>
+          <w:p>
+            <w:r>
+              <w:rPr>
+                <w:rFonts w:ascii="Arial" w:cs="Arial" w:eastAsia="Arial" w:hAnsi="Arial"/>
+                <w:b w:val="false"/>
+                <w:bCs w:val="false"/>
+                <w:sz w:val="20"/>
+                <w:szCs w:val="20"/>
+              </w:rPr>
+              <w:t xml:space="preserve">Response 100 (passed) — tag: audit_service_kyc_verified</w:t>
+            </w:r>
+          </w:p>
+        </w:tc>
+      </w:tr>
+      <w:tr>
+        <w:tc>
+          <w:tcPr>
+            <w:tcW w:type="dxa" w:w="3200"/>
+            <w:tcBorders>
+              <w:top w:val="single" w:color="CCCCCC" w:sz="1"/>
+              <w:left w:val="single" w:color="CCCCCC" w:sz="1"/>
+              <w:bottom w:val="single" w:color="CCCCCC" w:sz="1"/>
+              <w:right w:val="single" w:color="CCCCCC" w:sz="1"/>
+            </w:tcBorders>
+            <w:shd w:fill="FFFFFF" w:val="clear"/>
+            <w:tcMar>
+              <w:top w:type="dxa" w:w="80"/>
+              <w:left w:type="dxa" w:w="120"/>
+              <w:bottom w:type="dxa" w:w="80"/>
+              <w:right w:type="dxa" w:w="120"/>
+            </w:tcMar>
+          </w:tcPr>
+          <w:p>
+            <w:r>
+              <w:rPr>
+                <w:rFonts w:ascii="Arial" w:cs="Arial" w:eastAsia="Arial" w:hAnsi="Arial"/>
+                <w:b/>
+                <w:bCs/>
+                <w:sz w:val="20"/>
+                <w:szCs w:val="20"/>
+              </w:rPr>
+              <w:t xml:space="preserve">Arc Discord #user-made-things</w:t>
+            </w:r>
+          </w:p>
+        </w:tc>
+        <w:tc>
+          <w:tcPr>
+            <w:tcW w:type="dxa" w:w="1960"/>
+            <w:tcBorders>
+              <w:top w:val="single" w:color="CCCCCC" w:sz="1"/>
+              <w:left w:val="single" w:color="CCCCCC" w:sz="1"/>
+              <w:bottom w:val="single" w:color="CCCCCC" w:sz="1"/>
+              <w:right w:val="single" w:color="CCCCCC" w:sz="1"/>
+            </w:tcBorders>
+            <w:shd w:fill="FFFFFF" w:val="clear"/>
+            <w:tcMar>
+              <w:top w:type="dxa" w:w="80"/>
+              <w:left w:type="dxa" w:w="120"/>
+              <w:bottom w:type="dxa" w:w="80"/>
+              <w:right w:type="dxa" w:w="120"/>
+            </w:tcMar>
+          </w:tcPr>
+          <w:p>
+            <w:r>
+              <w:rPr>
+                <w:rFonts w:ascii="Arial" w:cs="Arial" w:eastAsia="Arial" w:hAnsi="Arial"/>
+                <w:b w:val="false"/>
+                <w:bCs w:val="false"/>
+                <w:sz w:val="20"/>
+                <w:szCs w:val="20"/>
+              </w:rPr>
+              <w:t xml:space="preserve">Pending</w:t>
+            </w:r>
+          </w:p>
+        </w:tc>
+        <w:tc>
+          <w:tcPr>
+            <w:tcW w:type="dxa" w:w="4200"/>
+            <w:tcBorders>
+              <w:top w:val="single" w:color="CCCCCC" w:sz="1"/>
+              <w:left w:val="single" w:color="CCCCCC" w:sz="1"/>
+              <w:bottom w:val="single" w:color="CCCCCC" w:sz="1"/>
+              <w:right w:val="single" w:color="CCCCCC" w:sz="1"/>
+            </w:tcBorders>
+            <w:shd w:fill="FFFFFF" w:val="clear"/>
+            <w:tcMar>
+              <w:top w:type="dxa" w:w="80"/>
+              <w:left w:type="dxa" w:w="120"/>
+              <w:bottom w:type="dxa" w:w="80"/>
+              <w:right w:type="dxa" w:w="120"/>
+            </w:tcMar>
+          </w:tcPr>
+          <w:p>
+            <w:r>
+              <w:rPr>
+                <w:rFonts w:ascii="Arial" w:cs="Arial" w:eastAsia="Arial" w:hAnsi="Arial"/>
+                <w:b w:val="false"/>
+                <w:bCs w:val="false"/>
+                <w:sz w:val="20"/>
+                <w:szCs w:val="20"/>
+              </w:rPr>
+              <w:t xml:space="preserve">Waiting for channel access to open</w:t>
             </w:r>
           </w:p>
         </w:tc>
@@ -16200,7 +16568,1137 @@
           <w:sz w:val="26"/>
           <w:szCs w:val="26"/>
         </w:rPr>
-        <w:t xml:space="preserve">6.5 What's Next</w:t>
+        <w:t xml:space="preserve">6.5 ERC-8004 Agent Identity</w:t>
+      </w:r>
+    </w:p>
+    <w:p>
+      <w:pPr>
+        <w:spacing w:after="0" w:before="80"/>
+      </w:pPr>
+      <w:r>
+        <w:t xml:space="preserve"/>
+      </w:r>
+    </w:p>
+    <w:tbl>
+      <w:tblPr>
+        <w:tblW w:type="dxa" w:w="9360"/>
+        <w:tblBorders>
+          <w:top w:val="single" w:color="auto" w:sz="4"/>
+          <w:left w:val="single" w:color="auto" w:sz="4"/>
+          <w:bottom w:val="single" w:color="auto" w:sz="4"/>
+          <w:right w:val="single" w:color="auto" w:sz="4"/>
+          <w:insideH w:val="single" w:color="auto" w:sz="4"/>
+          <w:insideV w:val="single" w:color="auto" w:sz="4"/>
+        </w:tblBorders>
+      </w:tblPr>
+      <w:tblGrid>
+        <w:gridCol w:w="2400"/>
+        <w:gridCol w:w="6960"/>
+      </w:tblGrid>
+      <w:tr>
+        <w:tc>
+          <w:tcPr>
+            <w:tcW w:type="dxa" w:w="2400"/>
+            <w:tcBorders>
+              <w:top w:val="single" w:color="CCCCCC" w:sz="1"/>
+              <w:left w:val="single" w:color="CCCCCC" w:sz="1"/>
+              <w:bottom w:val="single" w:color="CCCCCC" w:sz="1"/>
+              <w:right w:val="single" w:color="CCCCCC" w:sz="1"/>
+            </w:tcBorders>
+            <w:shd w:fill="D6E4F0" w:val="clear"/>
+            <w:tcMar>
+              <w:top w:type="dxa" w:w="80"/>
+              <w:left w:type="dxa" w:w="120"/>
+              <w:bottom w:type="dxa" w:w="80"/>
+              <w:right w:type="dxa" w:w="120"/>
+            </w:tcMar>
+          </w:tcPr>
+          <w:p>
+            <w:r>
+              <w:rPr>
+                <w:rFonts w:ascii="Arial" w:cs="Arial" w:eastAsia="Arial" w:hAnsi="Arial"/>
+                <w:b/>
+                <w:bCs/>
+                <w:color w:val="1B4F8A"/>
+                <w:sz w:val="20"/>
+                <w:szCs w:val="20"/>
+              </w:rPr>
+              <w:t xml:space="preserve">ERC-8004 Standard</w:t>
+            </w:r>
+          </w:p>
+        </w:tc>
+        <w:tc>
+          <w:tcPr>
+            <w:tcW w:type="dxa" w:w="6960"/>
+            <w:tcBorders>
+              <w:top w:val="single" w:color="CCCCCC" w:sz="1"/>
+              <w:left w:val="single" w:color="CCCCCC" w:sz="1"/>
+              <w:bottom w:val="single" w:color="CCCCCC" w:sz="1"/>
+              <w:right w:val="single" w:color="CCCCCC" w:sz="1"/>
+            </w:tcBorders>
+            <w:tcMar>
+              <w:top w:type="dxa" w:w="80"/>
+              <w:left w:type="dxa" w:w="120"/>
+              <w:bottom w:type="dxa" w:w="80"/>
+              <w:right w:type="dxa" w:w="120"/>
+            </w:tcMar>
+          </w:tcPr>
+          <w:p>
+            <w:r>
+              <w:rPr>
+                <w:rFonts w:ascii="Arial" w:cs="Arial" w:eastAsia="Arial" w:hAnsi="Arial"/>
+                <w:sz w:val="20"/>
+                <w:szCs w:val="20"/>
+              </w:rPr>
+              <w:t xml:space="preserve">Agent identity, reputation, and validation on Arc</w:t>
+            </w:r>
+          </w:p>
+        </w:tc>
+      </w:tr>
+    </w:tbl>
+    <w:p>
+      <w:pPr>
+        <w:spacing w:after="0" w:before="0"/>
+      </w:pPr>
+      <w:r>
+        <w:t xml:space="preserve"/>
+      </w:r>
+    </w:p>
+    <w:tbl>
+      <w:tblPr>
+        <w:tblW w:type="dxa" w:w="9360"/>
+        <w:tblBorders>
+          <w:top w:val="single" w:color="auto" w:sz="4"/>
+          <w:left w:val="single" w:color="auto" w:sz="4"/>
+          <w:bottom w:val="single" w:color="auto" w:sz="4"/>
+          <w:right w:val="single" w:color="auto" w:sz="4"/>
+          <w:insideH w:val="single" w:color="auto" w:sz="4"/>
+          <w:insideV w:val="single" w:color="auto" w:sz="4"/>
+        </w:tblBorders>
+      </w:tblPr>
+      <w:tblGrid>
+        <w:gridCol w:w="2400"/>
+        <w:gridCol w:w="6960"/>
+      </w:tblGrid>
+      <w:tr>
+        <w:tc>
+          <w:tcPr>
+            <w:tcW w:type="dxa" w:w="2400"/>
+            <w:tcBorders>
+              <w:top w:val="single" w:color="CCCCCC" w:sz="1"/>
+              <w:left w:val="single" w:color="CCCCCC" w:sz="1"/>
+              <w:bottom w:val="single" w:color="CCCCCC" w:sz="1"/>
+              <w:right w:val="single" w:color="CCCCCC" w:sz="1"/>
+            </w:tcBorders>
+            <w:shd w:fill="D6E4F0" w:val="clear"/>
+            <w:tcMar>
+              <w:top w:type="dxa" w:w="80"/>
+              <w:left w:type="dxa" w:w="120"/>
+              <w:bottom w:type="dxa" w:w="80"/>
+              <w:right w:type="dxa" w:w="120"/>
+            </w:tcMar>
+          </w:tcPr>
+          <w:p>
+            <w:r>
+              <w:rPr>
+                <w:rFonts w:ascii="Arial" w:cs="Arial" w:eastAsia="Arial" w:hAnsi="Arial"/>
+                <w:b/>
+                <w:bCs/>
+                <w:color w:val="1B4F8A"/>
+                <w:sz w:val="20"/>
+                <w:szCs w:val="20"/>
+              </w:rPr>
+              <w:t xml:space="preserve">Agent ID</w:t>
+            </w:r>
+          </w:p>
+        </w:tc>
+        <w:tc>
+          <w:tcPr>
+            <w:tcW w:type="dxa" w:w="6960"/>
+            <w:tcBorders>
+              <w:top w:val="single" w:color="CCCCCC" w:sz="1"/>
+              <w:left w:val="single" w:color="CCCCCC" w:sz="1"/>
+              <w:bottom w:val="single" w:color="CCCCCC" w:sz="1"/>
+              <w:right w:val="single" w:color="CCCCCC" w:sz="1"/>
+            </w:tcBorders>
+            <w:tcMar>
+              <w:top w:type="dxa" w:w="80"/>
+              <w:left w:type="dxa" w:w="120"/>
+              <w:bottom w:type="dxa" w:w="80"/>
+              <w:right w:type="dxa" w:w="120"/>
+            </w:tcMar>
+          </w:tcPr>
+          <w:p>
+            <w:r>
+              <w:rPr>
+                <w:rFonts w:ascii="Arial" w:cs="Arial" w:eastAsia="Arial" w:hAnsi="Arial"/>
+                <w:sz w:val="20"/>
+                <w:szCs w:val="20"/>
+              </w:rPr>
+              <w:t xml:space="preserve">11831</w:t>
+            </w:r>
+          </w:p>
+        </w:tc>
+      </w:tr>
+    </w:tbl>
+    <w:p>
+      <w:pPr>
+        <w:spacing w:after="0" w:before="0"/>
+      </w:pPr>
+      <w:r>
+        <w:t xml:space="preserve"/>
+      </w:r>
+    </w:p>
+    <w:tbl>
+      <w:tblPr>
+        <w:tblW w:type="dxa" w:w="9360"/>
+        <w:tblBorders>
+          <w:top w:val="single" w:color="auto" w:sz="4"/>
+          <w:left w:val="single" w:color="auto" w:sz="4"/>
+          <w:bottom w:val="single" w:color="auto" w:sz="4"/>
+          <w:right w:val="single" w:color="auto" w:sz="4"/>
+          <w:insideH w:val="single" w:color="auto" w:sz="4"/>
+          <w:insideV w:val="single" w:color="auto" w:sz="4"/>
+        </w:tblBorders>
+      </w:tblPr>
+      <w:tblGrid>
+        <w:gridCol w:w="2400"/>
+        <w:gridCol w:w="6960"/>
+      </w:tblGrid>
+      <w:tr>
+        <w:tc>
+          <w:tcPr>
+            <w:tcW w:type="dxa" w:w="2400"/>
+            <w:tcBorders>
+              <w:top w:val="single" w:color="CCCCCC" w:sz="1"/>
+              <w:left w:val="single" w:color="CCCCCC" w:sz="1"/>
+              <w:bottom w:val="single" w:color="CCCCCC" w:sz="1"/>
+              <w:right w:val="single" w:color="CCCCCC" w:sz="1"/>
+            </w:tcBorders>
+            <w:shd w:fill="D6E4F0" w:val="clear"/>
+            <w:tcMar>
+              <w:top w:type="dxa" w:w="80"/>
+              <w:left w:type="dxa" w:w="120"/>
+              <w:bottom w:type="dxa" w:w="80"/>
+              <w:right w:type="dxa" w:w="120"/>
+            </w:tcMar>
+          </w:tcPr>
+          <w:p>
+            <w:r>
+              <w:rPr>
+                <w:rFonts w:ascii="Arial" w:cs="Arial" w:eastAsia="Arial" w:hAnsi="Arial"/>
+                <w:b/>
+                <w:bCs/>
+                <w:color w:val="1B4F8A"/>
+                <w:sz w:val="20"/>
+                <w:szCs w:val="20"/>
+              </w:rPr>
+              <w:t xml:space="preserve">Identity Registry</w:t>
+            </w:r>
+          </w:p>
+        </w:tc>
+        <w:tc>
+          <w:tcPr>
+            <w:tcW w:type="dxa" w:w="6960"/>
+            <w:tcBorders>
+              <w:top w:val="single" w:color="CCCCCC" w:sz="1"/>
+              <w:left w:val="single" w:color="CCCCCC" w:sz="1"/>
+              <w:bottom w:val="single" w:color="CCCCCC" w:sz="1"/>
+              <w:right w:val="single" w:color="CCCCCC" w:sz="1"/>
+            </w:tcBorders>
+            <w:tcMar>
+              <w:top w:type="dxa" w:w="80"/>
+              <w:left w:type="dxa" w:w="120"/>
+              <w:bottom w:type="dxa" w:w="80"/>
+              <w:right w:type="dxa" w:w="120"/>
+            </w:tcMar>
+          </w:tcPr>
+          <w:p>
+            <w:r>
+              <w:rPr>
+                <w:rFonts w:ascii="Arial" w:cs="Arial" w:eastAsia="Arial" w:hAnsi="Arial"/>
+                <w:sz w:val="20"/>
+                <w:szCs w:val="20"/>
+              </w:rPr>
+              <w:t xml:space="preserve">0x8004A818BFB912233c491871b3d84c89A494BD9e</w:t>
+            </w:r>
+          </w:p>
+        </w:tc>
+      </w:tr>
+    </w:tbl>
+    <w:p>
+      <w:pPr>
+        <w:spacing w:after="0" w:before="0"/>
+      </w:pPr>
+      <w:r>
+        <w:t xml:space="preserve"/>
+      </w:r>
+    </w:p>
+    <w:tbl>
+      <w:tblPr>
+        <w:tblW w:type="dxa" w:w="9360"/>
+        <w:tblBorders>
+          <w:top w:val="single" w:color="auto" w:sz="4"/>
+          <w:left w:val="single" w:color="auto" w:sz="4"/>
+          <w:bottom w:val="single" w:color="auto" w:sz="4"/>
+          <w:right w:val="single" w:color="auto" w:sz="4"/>
+          <w:insideH w:val="single" w:color="auto" w:sz="4"/>
+          <w:insideV w:val="single" w:color="auto" w:sz="4"/>
+        </w:tblBorders>
+      </w:tblPr>
+      <w:tblGrid>
+        <w:gridCol w:w="2400"/>
+        <w:gridCol w:w="6960"/>
+      </w:tblGrid>
+      <w:tr>
+        <w:tc>
+          <w:tcPr>
+            <w:tcW w:type="dxa" w:w="2400"/>
+            <w:tcBorders>
+              <w:top w:val="single" w:color="CCCCCC" w:sz="1"/>
+              <w:left w:val="single" w:color="CCCCCC" w:sz="1"/>
+              <w:bottom w:val="single" w:color="CCCCCC" w:sz="1"/>
+              <w:right w:val="single" w:color="CCCCCC" w:sz="1"/>
+            </w:tcBorders>
+            <w:shd w:fill="D6E4F0" w:val="clear"/>
+            <w:tcMar>
+              <w:top w:type="dxa" w:w="80"/>
+              <w:left w:type="dxa" w:w="120"/>
+              <w:bottom w:type="dxa" w:w="80"/>
+              <w:right w:type="dxa" w:w="120"/>
+            </w:tcMar>
+          </w:tcPr>
+          <w:p>
+            <w:r>
+              <w:rPr>
+                <w:rFonts w:ascii="Arial" w:cs="Arial" w:eastAsia="Arial" w:hAnsi="Arial"/>
+                <w:b/>
+                <w:bCs/>
+                <w:color w:val="1B4F8A"/>
+                <w:sz w:val="20"/>
+                <w:szCs w:val="20"/>
+              </w:rPr>
+              <w:t xml:space="preserve">Reputation Registry</w:t>
+            </w:r>
+          </w:p>
+        </w:tc>
+        <w:tc>
+          <w:tcPr>
+            <w:tcW w:type="dxa" w:w="6960"/>
+            <w:tcBorders>
+              <w:top w:val="single" w:color="CCCCCC" w:sz="1"/>
+              <w:left w:val="single" w:color="CCCCCC" w:sz="1"/>
+              <w:bottom w:val="single" w:color="CCCCCC" w:sz="1"/>
+              <w:right w:val="single" w:color="CCCCCC" w:sz="1"/>
+            </w:tcBorders>
+            <w:tcMar>
+              <w:top w:type="dxa" w:w="80"/>
+              <w:left w:type="dxa" w:w="120"/>
+              <w:bottom w:type="dxa" w:w="80"/>
+              <w:right w:type="dxa" w:w="120"/>
+            </w:tcMar>
+          </w:tcPr>
+          <w:p>
+            <w:r>
+              <w:rPr>
+                <w:rFonts w:ascii="Arial" w:cs="Arial" w:eastAsia="Arial" w:hAnsi="Arial"/>
+                <w:sz w:val="20"/>
+                <w:szCs w:val="20"/>
+              </w:rPr>
+              <w:t xml:space="preserve">0x8004B663056A597Dffe9eCcC1965A193B7388713</w:t>
+            </w:r>
+          </w:p>
+        </w:tc>
+      </w:tr>
+    </w:tbl>
+    <w:p>
+      <w:pPr>
+        <w:spacing w:after="0" w:before="0"/>
+      </w:pPr>
+      <w:r>
+        <w:t xml:space="preserve"/>
+      </w:r>
+    </w:p>
+    <w:tbl>
+      <w:tblPr>
+        <w:tblW w:type="dxa" w:w="9360"/>
+        <w:tblBorders>
+          <w:top w:val="single" w:color="auto" w:sz="4"/>
+          <w:left w:val="single" w:color="auto" w:sz="4"/>
+          <w:bottom w:val="single" w:color="auto" w:sz="4"/>
+          <w:right w:val="single" w:color="auto" w:sz="4"/>
+          <w:insideH w:val="single" w:color="auto" w:sz="4"/>
+          <w:insideV w:val="single" w:color="auto" w:sz="4"/>
+        </w:tblBorders>
+      </w:tblPr>
+      <w:tblGrid>
+        <w:gridCol w:w="2400"/>
+        <w:gridCol w:w="6960"/>
+      </w:tblGrid>
+      <w:tr>
+        <w:tc>
+          <w:tcPr>
+            <w:tcW w:type="dxa" w:w="2400"/>
+            <w:tcBorders>
+              <w:top w:val="single" w:color="CCCCCC" w:sz="1"/>
+              <w:left w:val="single" w:color="CCCCCC" w:sz="1"/>
+              <w:bottom w:val="single" w:color="CCCCCC" w:sz="1"/>
+              <w:right w:val="single" w:color="CCCCCC" w:sz="1"/>
+            </w:tcBorders>
+            <w:shd w:fill="D6E4F0" w:val="clear"/>
+            <w:tcMar>
+              <w:top w:type="dxa" w:w="80"/>
+              <w:left w:type="dxa" w:w="120"/>
+              <w:bottom w:type="dxa" w:w="80"/>
+              <w:right w:type="dxa" w:w="120"/>
+            </w:tcMar>
+          </w:tcPr>
+          <w:p>
+            <w:r>
+              <w:rPr>
+                <w:rFonts w:ascii="Arial" w:cs="Arial" w:eastAsia="Arial" w:hAnsi="Arial"/>
+                <w:b/>
+                <w:bCs/>
+                <w:color w:val="1B4F8A"/>
+                <w:sz w:val="20"/>
+                <w:szCs w:val="20"/>
+              </w:rPr>
+              <w:t xml:space="preserve">Validation Registry</w:t>
+            </w:r>
+          </w:p>
+        </w:tc>
+        <w:tc>
+          <w:tcPr>
+            <w:tcW w:type="dxa" w:w="6960"/>
+            <w:tcBorders>
+              <w:top w:val="single" w:color="CCCCCC" w:sz="1"/>
+              <w:left w:val="single" w:color="CCCCCC" w:sz="1"/>
+              <w:bottom w:val="single" w:color="CCCCCC" w:sz="1"/>
+              <w:right w:val="single" w:color="CCCCCC" w:sz="1"/>
+            </w:tcBorders>
+            <w:tcMar>
+              <w:top w:type="dxa" w:w="80"/>
+              <w:left w:type="dxa" w:w="120"/>
+              <w:bottom w:type="dxa" w:w="80"/>
+              <w:right w:type="dxa" w:w="120"/>
+            </w:tcMar>
+          </w:tcPr>
+          <w:p>
+            <w:r>
+              <w:rPr>
+                <w:rFonts w:ascii="Arial" w:cs="Arial" w:eastAsia="Arial" w:hAnsi="Arial"/>
+                <w:sz w:val="20"/>
+                <w:szCs w:val="20"/>
+              </w:rPr>
+              <w:t xml:space="preserve">0x8004Cb1BF31DAf7788923b405b754f57acEB4272</w:t>
+            </w:r>
+          </w:p>
+        </w:tc>
+      </w:tr>
+    </w:tbl>
+    <w:p>
+      <w:pPr>
+        <w:spacing w:after="0" w:before="0"/>
+      </w:pPr>
+      <w:r>
+        <w:t xml:space="preserve"/>
+      </w:r>
+    </w:p>
+    <w:tbl>
+      <w:tblPr>
+        <w:tblW w:type="dxa" w:w="9360"/>
+        <w:tblBorders>
+          <w:top w:val="single" w:color="auto" w:sz="4"/>
+          <w:left w:val="single" w:color="auto" w:sz="4"/>
+          <w:bottom w:val="single" w:color="auto" w:sz="4"/>
+          <w:right w:val="single" w:color="auto" w:sz="4"/>
+          <w:insideH w:val="single" w:color="auto" w:sz="4"/>
+          <w:insideV w:val="single" w:color="auto" w:sz="4"/>
+        </w:tblBorders>
+      </w:tblPr>
+      <w:tblGrid>
+        <w:gridCol w:w="2400"/>
+        <w:gridCol w:w="6960"/>
+      </w:tblGrid>
+      <w:tr>
+        <w:tc>
+          <w:tcPr>
+            <w:tcW w:type="dxa" w:w="2400"/>
+            <w:tcBorders>
+              <w:top w:val="single" w:color="CCCCCC" w:sz="1"/>
+              <w:left w:val="single" w:color="CCCCCC" w:sz="1"/>
+              <w:bottom w:val="single" w:color="CCCCCC" w:sz="1"/>
+              <w:right w:val="single" w:color="CCCCCC" w:sz="1"/>
+            </w:tcBorders>
+            <w:shd w:fill="D6E4F0" w:val="clear"/>
+            <w:tcMar>
+              <w:top w:type="dxa" w:w="80"/>
+              <w:left w:type="dxa" w:w="120"/>
+              <w:bottom w:type="dxa" w:w="80"/>
+              <w:right w:type="dxa" w:w="120"/>
+            </w:tcMar>
+          </w:tcPr>
+          <w:p>
+            <w:r>
+              <w:rPr>
+                <w:rFonts w:ascii="Arial" w:cs="Arial" w:eastAsia="Arial" w:hAnsi="Arial"/>
+                <w:b/>
+                <w:bCs/>
+                <w:color w:val="1B4F8A"/>
+                <w:sz w:val="20"/>
+                <w:szCs w:val="20"/>
+              </w:rPr>
+              <w:t xml:space="preserve">Identity TX</w:t>
+            </w:r>
+          </w:p>
+        </w:tc>
+        <w:tc>
+          <w:tcPr>
+            <w:tcW w:type="dxa" w:w="6960"/>
+            <w:tcBorders>
+              <w:top w:val="single" w:color="CCCCCC" w:sz="1"/>
+              <w:left w:val="single" w:color="CCCCCC" w:sz="1"/>
+              <w:bottom w:val="single" w:color="CCCCCC" w:sz="1"/>
+              <w:right w:val="single" w:color="CCCCCC" w:sz="1"/>
+            </w:tcBorders>
+            <w:tcMar>
+              <w:top w:type="dxa" w:w="80"/>
+              <w:left w:type="dxa" w:w="120"/>
+              <w:bottom w:type="dxa" w:w="80"/>
+              <w:right w:type="dxa" w:w="120"/>
+            </w:tcMar>
+          </w:tcPr>
+          <w:p>
+            <w:r>
+              <w:rPr>
+                <w:rFonts w:ascii="Arial" w:cs="Arial" w:eastAsia="Arial" w:hAnsi="Arial"/>
+                <w:sz w:val="20"/>
+                <w:szCs w:val="20"/>
+              </w:rPr>
+              <w:t xml:space="preserve">0x9e0f2172f5fe1a6997f4866eb3a5fcb9640745ba9e4e92882a5b5f58f3f13ab6</w:t>
+            </w:r>
+          </w:p>
+        </w:tc>
+      </w:tr>
+    </w:tbl>
+    <w:p>
+      <w:pPr>
+        <w:spacing w:after="0" w:before="0"/>
+      </w:pPr>
+      <w:r>
+        <w:t xml:space="preserve"/>
+      </w:r>
+    </w:p>
+    <w:tbl>
+      <w:tblPr>
+        <w:tblW w:type="dxa" w:w="9360"/>
+        <w:tblBorders>
+          <w:top w:val="single" w:color="auto" w:sz="4"/>
+          <w:left w:val="single" w:color="auto" w:sz="4"/>
+          <w:bottom w:val="single" w:color="auto" w:sz="4"/>
+          <w:right w:val="single" w:color="auto" w:sz="4"/>
+          <w:insideH w:val="single" w:color="auto" w:sz="4"/>
+          <w:insideV w:val="single" w:color="auto" w:sz="4"/>
+        </w:tblBorders>
+      </w:tblPr>
+      <w:tblGrid>
+        <w:gridCol w:w="2400"/>
+        <w:gridCol w:w="6960"/>
+      </w:tblGrid>
+      <w:tr>
+        <w:tc>
+          <w:tcPr>
+            <w:tcW w:type="dxa" w:w="2400"/>
+            <w:tcBorders>
+              <w:top w:val="single" w:color="CCCCCC" w:sz="1"/>
+              <w:left w:val="single" w:color="CCCCCC" w:sz="1"/>
+              <w:bottom w:val="single" w:color="CCCCCC" w:sz="1"/>
+              <w:right w:val="single" w:color="CCCCCC" w:sz="1"/>
+            </w:tcBorders>
+            <w:shd w:fill="D6E4F0" w:val="clear"/>
+            <w:tcMar>
+              <w:top w:type="dxa" w:w="80"/>
+              <w:left w:type="dxa" w:w="120"/>
+              <w:bottom w:type="dxa" w:w="80"/>
+              <w:right w:type="dxa" w:w="120"/>
+            </w:tcMar>
+          </w:tcPr>
+          <w:p>
+            <w:r>
+              <w:rPr>
+                <w:rFonts w:ascii="Arial" w:cs="Arial" w:eastAsia="Arial" w:hAnsi="Arial"/>
+                <w:b/>
+                <w:bCs/>
+                <w:color w:val="1B4F8A"/>
+                <w:sz w:val="20"/>
+                <w:szCs w:val="20"/>
+              </w:rPr>
+              <w:t xml:space="preserve">Reputation TX</w:t>
+            </w:r>
+          </w:p>
+        </w:tc>
+        <w:tc>
+          <w:tcPr>
+            <w:tcW w:type="dxa" w:w="6960"/>
+            <w:tcBorders>
+              <w:top w:val="single" w:color="CCCCCC" w:sz="1"/>
+              <w:left w:val="single" w:color="CCCCCC" w:sz="1"/>
+              <w:bottom w:val="single" w:color="CCCCCC" w:sz="1"/>
+              <w:right w:val="single" w:color="CCCCCC" w:sz="1"/>
+            </w:tcBorders>
+            <w:tcMar>
+              <w:top w:type="dxa" w:w="80"/>
+              <w:left w:type="dxa" w:w="120"/>
+              <w:bottom w:type="dxa" w:w="80"/>
+              <w:right w:type="dxa" w:w="120"/>
+            </w:tcMar>
+          </w:tcPr>
+          <w:p>
+            <w:r>
+              <w:rPr>
+                <w:rFonts w:ascii="Arial" w:cs="Arial" w:eastAsia="Arial" w:hAnsi="Arial"/>
+                <w:sz w:val="20"/>
+                <w:szCs w:val="20"/>
+              </w:rPr>
+              <w:t xml:space="preserve">0xfc54f41152e3ab8d88f9db80d9da8c57fd1c1e4ec703f7f9b4e5cb640d8999fb</w:t>
+            </w:r>
+          </w:p>
+        </w:tc>
+      </w:tr>
+    </w:tbl>
+    <w:p>
+      <w:pPr>
+        <w:spacing w:after="0" w:before="0"/>
+      </w:pPr>
+      <w:r>
+        <w:t xml:space="preserve"/>
+      </w:r>
+    </w:p>
+    <w:tbl>
+      <w:tblPr>
+        <w:tblW w:type="dxa" w:w="9360"/>
+        <w:tblBorders>
+          <w:top w:val="single" w:color="auto" w:sz="4"/>
+          <w:left w:val="single" w:color="auto" w:sz="4"/>
+          <w:bottom w:val="single" w:color="auto" w:sz="4"/>
+          <w:right w:val="single" w:color="auto" w:sz="4"/>
+          <w:insideH w:val="single" w:color="auto" w:sz="4"/>
+          <w:insideV w:val="single" w:color="auto" w:sz="4"/>
+        </w:tblBorders>
+      </w:tblPr>
+      <w:tblGrid>
+        <w:gridCol w:w="2400"/>
+        <w:gridCol w:w="6960"/>
+      </w:tblGrid>
+      <w:tr>
+        <w:tc>
+          <w:tcPr>
+            <w:tcW w:type="dxa" w:w="2400"/>
+            <w:tcBorders>
+              <w:top w:val="single" w:color="CCCCCC" w:sz="1"/>
+              <w:left w:val="single" w:color="CCCCCC" w:sz="1"/>
+              <w:bottom w:val="single" w:color="CCCCCC" w:sz="1"/>
+              <w:right w:val="single" w:color="CCCCCC" w:sz="1"/>
+            </w:tcBorders>
+            <w:shd w:fill="D6E4F0" w:val="clear"/>
+            <w:tcMar>
+              <w:top w:type="dxa" w:w="80"/>
+              <w:left w:type="dxa" w:w="120"/>
+              <w:bottom w:type="dxa" w:w="80"/>
+              <w:right w:type="dxa" w:w="120"/>
+            </w:tcMar>
+          </w:tcPr>
+          <w:p>
+            <w:r>
+              <w:rPr>
+                <w:rFonts w:ascii="Arial" w:cs="Arial" w:eastAsia="Arial" w:hAnsi="Arial"/>
+                <w:b/>
+                <w:bCs/>
+                <w:color w:val="1B4F8A"/>
+                <w:sz w:val="20"/>
+                <w:szCs w:val="20"/>
+              </w:rPr>
+              <w:t xml:space="preserve">Validation Request TX</w:t>
+            </w:r>
+          </w:p>
+        </w:tc>
+        <w:tc>
+          <w:tcPr>
+            <w:tcW w:type="dxa" w:w="6960"/>
+            <w:tcBorders>
+              <w:top w:val="single" w:color="CCCCCC" w:sz="1"/>
+              <w:left w:val="single" w:color="CCCCCC" w:sz="1"/>
+              <w:bottom w:val="single" w:color="CCCCCC" w:sz="1"/>
+              <w:right w:val="single" w:color="CCCCCC" w:sz="1"/>
+            </w:tcBorders>
+            <w:tcMar>
+              <w:top w:type="dxa" w:w="80"/>
+              <w:left w:type="dxa" w:w="120"/>
+              <w:bottom w:type="dxa" w:w="80"/>
+              <w:right w:type="dxa" w:w="120"/>
+            </w:tcMar>
+          </w:tcPr>
+          <w:p>
+            <w:r>
+              <w:rPr>
+                <w:rFonts w:ascii="Arial" w:cs="Arial" w:eastAsia="Arial" w:hAnsi="Arial"/>
+                <w:sz w:val="20"/>
+                <w:szCs w:val="20"/>
+              </w:rPr>
+              <w:t xml:space="preserve">0xfdd992f103a54c59b48b5996081ce642e68ba083f0ca91d1c1a6e2ab29e29b7e</w:t>
+            </w:r>
+          </w:p>
+        </w:tc>
+      </w:tr>
+    </w:tbl>
+    <w:p>
+      <w:pPr>
+        <w:spacing w:after="0" w:before="0"/>
+      </w:pPr>
+      <w:r>
+        <w:t xml:space="preserve"/>
+      </w:r>
+    </w:p>
+    <w:tbl>
+      <w:tblPr>
+        <w:tblW w:type="dxa" w:w="9360"/>
+        <w:tblBorders>
+          <w:top w:val="single" w:color="auto" w:sz="4"/>
+          <w:left w:val="single" w:color="auto" w:sz="4"/>
+          <w:bottom w:val="single" w:color="auto" w:sz="4"/>
+          <w:right w:val="single" w:color="auto" w:sz="4"/>
+          <w:insideH w:val="single" w:color="auto" w:sz="4"/>
+          <w:insideV w:val="single" w:color="auto" w:sz="4"/>
+        </w:tblBorders>
+      </w:tblPr>
+      <w:tblGrid>
+        <w:gridCol w:w="2400"/>
+        <w:gridCol w:w="6960"/>
+      </w:tblGrid>
+      <w:tr>
+        <w:tc>
+          <w:tcPr>
+            <w:tcW w:type="dxa" w:w="2400"/>
+            <w:tcBorders>
+              <w:top w:val="single" w:color="CCCCCC" w:sz="1"/>
+              <w:left w:val="single" w:color="CCCCCC" w:sz="1"/>
+              <w:bottom w:val="single" w:color="CCCCCC" w:sz="1"/>
+              <w:right w:val="single" w:color="CCCCCC" w:sz="1"/>
+            </w:tcBorders>
+            <w:shd w:fill="D6E4F0" w:val="clear"/>
+            <w:tcMar>
+              <w:top w:type="dxa" w:w="80"/>
+              <w:left w:type="dxa" w:w="120"/>
+              <w:bottom w:type="dxa" w:w="80"/>
+              <w:right w:type="dxa" w:w="120"/>
+            </w:tcMar>
+          </w:tcPr>
+          <w:p>
+            <w:r>
+              <w:rPr>
+                <w:rFonts w:ascii="Arial" w:cs="Arial" w:eastAsia="Arial" w:hAnsi="Arial"/>
+                <w:b/>
+                <w:bCs/>
+                <w:color w:val="1B4F8A"/>
+                <w:sz w:val="20"/>
+                <w:szCs w:val="20"/>
+              </w:rPr>
+              <w:t xml:space="preserve">Validation Response TX</w:t>
+            </w:r>
+          </w:p>
+        </w:tc>
+        <w:tc>
+          <w:tcPr>
+            <w:tcW w:type="dxa" w:w="6960"/>
+            <w:tcBorders>
+              <w:top w:val="single" w:color="CCCCCC" w:sz="1"/>
+              <w:left w:val="single" w:color="CCCCCC" w:sz="1"/>
+              <w:bottom w:val="single" w:color="CCCCCC" w:sz="1"/>
+              <w:right w:val="single" w:color="CCCCCC" w:sz="1"/>
+            </w:tcBorders>
+            <w:tcMar>
+              <w:top w:type="dxa" w:w="80"/>
+              <w:left w:type="dxa" w:w="120"/>
+              <w:bottom w:type="dxa" w:w="80"/>
+              <w:right w:type="dxa" w:w="120"/>
+            </w:tcMar>
+          </w:tcPr>
+          <w:p>
+            <w:r>
+              <w:rPr>
+                <w:rFonts w:ascii="Arial" w:cs="Arial" w:eastAsia="Arial" w:hAnsi="Arial"/>
+                <w:sz w:val="20"/>
+                <w:szCs w:val="20"/>
+              </w:rPr>
+              <w:t xml:space="preserve">0x403cff6bfac444450f2cfbbab411e5b4da64fc33ba770b07197245d8b27c049a</w:t>
+            </w:r>
+          </w:p>
+        </w:tc>
+      </w:tr>
+    </w:tbl>
+    <w:p>
+      <w:pPr>
+        <w:spacing w:after="0" w:before="0"/>
+      </w:pPr>
+      <w:r>
+        <w:t xml:space="preserve"/>
+      </w:r>
+    </w:p>
+    <w:tbl>
+      <w:tblPr>
+        <w:tblW w:type="dxa" w:w="9360"/>
+        <w:tblBorders>
+          <w:top w:val="single" w:color="auto" w:sz="4"/>
+          <w:left w:val="single" w:color="auto" w:sz="4"/>
+          <w:bottom w:val="single" w:color="auto" w:sz="4"/>
+          <w:right w:val="single" w:color="auto" w:sz="4"/>
+          <w:insideH w:val="single" w:color="auto" w:sz="4"/>
+          <w:insideV w:val="single" w:color="auto" w:sz="4"/>
+        </w:tblBorders>
+      </w:tblPr>
+      <w:tblGrid>
+        <w:gridCol w:w="2400"/>
+        <w:gridCol w:w="6960"/>
+      </w:tblGrid>
+      <w:tr>
+        <w:tc>
+          <w:tcPr>
+            <w:tcW w:type="dxa" w:w="2400"/>
+            <w:tcBorders>
+              <w:top w:val="single" w:color="CCCCCC" w:sz="1"/>
+              <w:left w:val="single" w:color="CCCCCC" w:sz="1"/>
+              <w:bottom w:val="single" w:color="CCCCCC" w:sz="1"/>
+              <w:right w:val="single" w:color="CCCCCC" w:sz="1"/>
+            </w:tcBorders>
+            <w:shd w:fill="D6E4F0" w:val="clear"/>
+            <w:tcMar>
+              <w:top w:type="dxa" w:w="80"/>
+              <w:left w:type="dxa" w:w="120"/>
+              <w:bottom w:type="dxa" w:w="80"/>
+              <w:right w:type="dxa" w:w="120"/>
+            </w:tcMar>
+          </w:tcPr>
+          <w:p>
+            <w:r>
+              <w:rPr>
+                <w:rFonts w:ascii="Arial" w:cs="Arial" w:eastAsia="Arial" w:hAnsi="Arial"/>
+                <w:b/>
+                <w:bCs/>
+                <w:color w:val="1B4F8A"/>
+                <w:sz w:val="20"/>
+                <w:szCs w:val="20"/>
+              </w:rPr>
+              <w:t xml:space="preserve">Reputation Score</w:t>
+            </w:r>
+          </w:p>
+        </w:tc>
+        <w:tc>
+          <w:tcPr>
+            <w:tcW w:type="dxa" w:w="6960"/>
+            <w:tcBorders>
+              <w:top w:val="single" w:color="CCCCCC" w:sz="1"/>
+              <w:left w:val="single" w:color="CCCCCC" w:sz="1"/>
+              <w:bottom w:val="single" w:color="CCCCCC" w:sz="1"/>
+              <w:right w:val="single" w:color="CCCCCC" w:sz="1"/>
+            </w:tcBorders>
+            <w:tcMar>
+              <w:top w:type="dxa" w:w="80"/>
+              <w:left w:type="dxa" w:w="120"/>
+              <w:bottom w:type="dxa" w:w="80"/>
+              <w:right w:type="dxa" w:w="120"/>
+            </w:tcMar>
+          </w:tcPr>
+          <w:p>
+            <w:r>
+              <w:rPr>
+                <w:rFonts w:ascii="Arial" w:cs="Arial" w:eastAsia="Arial" w:hAnsi="Arial"/>
+                <w:sz w:val="20"/>
+                <w:szCs w:val="20"/>
+              </w:rPr>
+              <w:t xml:space="preserve">95 / 100 — recorded by Treasury validator</w:t>
+            </w:r>
+          </w:p>
+        </w:tc>
+      </w:tr>
+    </w:tbl>
+    <w:p>
+      <w:pPr>
+        <w:spacing w:after="0" w:before="0"/>
+      </w:pPr>
+      <w:r>
+        <w:t xml:space="preserve"/>
+      </w:r>
+    </w:p>
+    <w:tbl>
+      <w:tblPr>
+        <w:tblW w:type="dxa" w:w="9360"/>
+        <w:tblBorders>
+          <w:top w:val="single" w:color="auto" w:sz="4"/>
+          <w:left w:val="single" w:color="auto" w:sz="4"/>
+          <w:bottom w:val="single" w:color="auto" w:sz="4"/>
+          <w:right w:val="single" w:color="auto" w:sz="4"/>
+          <w:insideH w:val="single" w:color="auto" w:sz="4"/>
+          <w:insideV w:val="single" w:color="auto" w:sz="4"/>
+        </w:tblBorders>
+      </w:tblPr>
+      <w:tblGrid>
+        <w:gridCol w:w="2400"/>
+        <w:gridCol w:w="6960"/>
+      </w:tblGrid>
+      <w:tr>
+        <w:tc>
+          <w:tcPr>
+            <w:tcW w:type="dxa" w:w="2400"/>
+            <w:tcBorders>
+              <w:top w:val="single" w:color="CCCCCC" w:sz="1"/>
+              <w:left w:val="single" w:color="CCCCCC" w:sz="1"/>
+              <w:bottom w:val="single" w:color="CCCCCC" w:sz="1"/>
+              <w:right w:val="single" w:color="CCCCCC" w:sz="1"/>
+            </w:tcBorders>
+            <w:shd w:fill="D6E4F0" w:val="clear"/>
+            <w:tcMar>
+              <w:top w:type="dxa" w:w="80"/>
+              <w:left w:type="dxa" w:w="120"/>
+              <w:bottom w:type="dxa" w:w="80"/>
+              <w:right w:type="dxa" w:w="120"/>
+            </w:tcMar>
+          </w:tcPr>
+          <w:p>
+            <w:r>
+              <w:rPr>
+                <w:rFonts w:ascii="Arial" w:cs="Arial" w:eastAsia="Arial" w:hAnsi="Arial"/>
+                <w:b/>
+                <w:bCs/>
+                <w:color w:val="1B4F8A"/>
+                <w:sz w:val="20"/>
+                <w:szCs w:val="20"/>
+              </w:rPr>
+              <w:t xml:space="preserve">Validation Status</w:t>
+            </w:r>
+          </w:p>
+        </w:tc>
+        <w:tc>
+          <w:tcPr>
+            <w:tcW w:type="dxa" w:w="6960"/>
+            <w:tcBorders>
+              <w:top w:val="single" w:color="CCCCCC" w:sz="1"/>
+              <w:left w:val="single" w:color="CCCCCC" w:sz="1"/>
+              <w:bottom w:val="single" w:color="CCCCCC" w:sz="1"/>
+              <w:right w:val="single" w:color="CCCCCC" w:sz="1"/>
+            </w:tcBorders>
+            <w:tcMar>
+              <w:top w:type="dxa" w:w="80"/>
+              <w:left w:type="dxa" w:w="120"/>
+              <w:bottom w:type="dxa" w:w="80"/>
+              <w:right w:type="dxa" w:w="120"/>
+            </w:tcMar>
+          </w:tcPr>
+          <w:p>
+            <w:r>
+              <w:rPr>
+                <w:rFonts w:ascii="Arial" w:cs="Arial" w:eastAsia="Arial" w:hAnsi="Arial"/>
+                <w:sz w:val="20"/>
+                <w:szCs w:val="20"/>
+              </w:rPr>
+              <w:t xml:space="preserve">100 (Passed) — tag: audit_service_kyc_verified</w:t>
+            </w:r>
+          </w:p>
+        </w:tc>
+      </w:tr>
+    </w:tbl>
+    <w:p>
+      <w:pPr>
+        <w:spacing w:after="0" w:before="0"/>
+      </w:pPr>
+      <w:r>
+        <w:t xml:space="preserve"/>
+      </w:r>
+    </w:p>
+    <w:tbl>
+      <w:tblPr>
+        <w:tblW w:type="dxa" w:w="9360"/>
+        <w:tblBorders>
+          <w:top w:val="single" w:color="auto" w:sz="4"/>
+          <w:left w:val="single" w:color="auto" w:sz="4"/>
+          <w:bottom w:val="single" w:color="auto" w:sz="4"/>
+          <w:right w:val="single" w:color="auto" w:sz="4"/>
+          <w:insideH w:val="single" w:color="auto" w:sz="4"/>
+          <w:insideV w:val="single" w:color="auto" w:sz="4"/>
+        </w:tblBorders>
+      </w:tblPr>
+      <w:tblGrid>
+        <w:gridCol w:w="2400"/>
+        <w:gridCol w:w="6960"/>
+      </w:tblGrid>
+      <w:tr>
+        <w:tc>
+          <w:tcPr>
+            <w:tcW w:type="dxa" w:w="2400"/>
+            <w:tcBorders>
+              <w:top w:val="single" w:color="CCCCCC" w:sz="1"/>
+              <w:left w:val="single" w:color="CCCCCC" w:sz="1"/>
+              <w:bottom w:val="single" w:color="CCCCCC" w:sz="1"/>
+              <w:right w:val="single" w:color="CCCCCC" w:sz="1"/>
+            </w:tcBorders>
+            <w:shd w:fill="D6E4F0" w:val="clear"/>
+            <w:tcMar>
+              <w:top w:type="dxa" w:w="80"/>
+              <w:left w:type="dxa" w:w="120"/>
+              <w:bottom w:type="dxa" w:w="80"/>
+              <w:right w:type="dxa" w:w="120"/>
+            </w:tcMar>
+          </w:tcPr>
+          <w:p>
+            <w:r>
+              <w:rPr>
+                <w:rFonts w:ascii="Arial" w:cs="Arial" w:eastAsia="Arial" w:hAnsi="Arial"/>
+                <w:b/>
+                <w:bCs/>
+                <w:color w:val="1B4F8A"/>
+                <w:sz w:val="20"/>
+                <w:szCs w:val="20"/>
+              </w:rPr>
+              <w:t xml:space="preserve">Metadata URI</w:t>
+            </w:r>
+          </w:p>
+        </w:tc>
+        <w:tc>
+          <w:tcPr>
+            <w:tcW w:type="dxa" w:w="6960"/>
+            <w:tcBorders>
+              <w:top w:val="single" w:color="CCCCCC" w:sz="1"/>
+              <w:left w:val="single" w:color="CCCCCC" w:sz="1"/>
+              <w:bottom w:val="single" w:color="CCCCCC" w:sz="1"/>
+              <w:right w:val="single" w:color="CCCCCC" w:sz="1"/>
+            </w:tcBorders>
+            <w:tcMar>
+              <w:top w:type="dxa" w:w="80"/>
+              <w:left w:type="dxa" w:w="120"/>
+              <w:bottom w:type="dxa" w:w="80"/>
+              <w:right w:type="dxa" w:w="120"/>
+            </w:tcMar>
+          </w:tcPr>
+          <w:p>
+            <w:r>
+              <w:rPr>
+                <w:rFonts w:ascii="Arial" w:cs="Arial" w:eastAsia="Arial" w:hAnsi="Arial"/>
+                <w:sz w:val="20"/>
+                <w:szCs w:val="20"/>
+              </w:rPr>
+              <w:t xml:space="preserve">ipfs://bafkreie34ytrqkupmwkax4xol5t3h2kjtrr5tmzqbzukns2mjpn76r2x4q</w:t>
+            </w:r>
+          </w:p>
+        </w:tc>
+      </w:tr>
+    </w:tbl>
+    <w:p>
+      <w:pPr>
+        <w:spacing w:after="0" w:before="0"/>
+      </w:pPr>
+      <w:r>
+        <w:t xml:space="preserve"/>
+      </w:r>
+    </w:p>
+    <w:tbl>
+      <w:tblPr>
+        <w:tblW w:type="dxa" w:w="9360"/>
+        <w:tblBorders>
+          <w:top w:val="single" w:color="auto" w:sz="4"/>
+          <w:left w:val="single" w:color="auto" w:sz="4"/>
+          <w:bottom w:val="single" w:color="auto" w:sz="4"/>
+          <w:right w:val="single" w:color="auto" w:sz="4"/>
+          <w:insideH w:val="single" w:color="auto" w:sz="4"/>
+          <w:insideV w:val="single" w:color="auto" w:sz="4"/>
+        </w:tblBorders>
+      </w:tblPr>
+      <w:tblGrid>
+        <w:gridCol w:w="2400"/>
+        <w:gridCol w:w="6960"/>
+      </w:tblGrid>
+      <w:tr>
+        <w:tc>
+          <w:tcPr>
+            <w:tcW w:type="dxa" w:w="2400"/>
+            <w:tcBorders>
+              <w:top w:val="single" w:color="CCCCCC" w:sz="1"/>
+              <w:left w:val="single" w:color="CCCCCC" w:sz="1"/>
+              <w:bottom w:val="single" w:color="CCCCCC" w:sz="1"/>
+              <w:right w:val="single" w:color="CCCCCC" w:sz="1"/>
+            </w:tcBorders>
+            <w:shd w:fill="D6E4F0" w:val="clear"/>
+            <w:tcMar>
+              <w:top w:type="dxa" w:w="80"/>
+              <w:left w:type="dxa" w:w="120"/>
+              <w:bottom w:type="dxa" w:w="80"/>
+              <w:right w:type="dxa" w:w="120"/>
+            </w:tcMar>
+          </w:tcPr>
+          <w:p>
+            <w:r>
+              <w:rPr>
+                <w:rFonts w:ascii="Arial" w:cs="Arial" w:eastAsia="Arial" w:hAnsi="Arial"/>
+                <w:b/>
+                <w:bCs/>
+                <w:color w:val="1B4F8A"/>
+                <w:sz w:val="20"/>
+                <w:szCs w:val="20"/>
+              </w:rPr>
+              <w:t xml:space="preserve">Identity Explorer</w:t>
+            </w:r>
+          </w:p>
+        </w:tc>
+        <w:tc>
+          <w:tcPr>
+            <w:tcW w:type="dxa" w:w="6960"/>
+            <w:tcBorders>
+              <w:top w:val="single" w:color="CCCCCC" w:sz="1"/>
+              <w:left w:val="single" w:color="CCCCCC" w:sz="1"/>
+              <w:bottom w:val="single" w:color="CCCCCC" w:sz="1"/>
+              <w:right w:val="single" w:color="CCCCCC" w:sz="1"/>
+            </w:tcBorders>
+            <w:tcMar>
+              <w:top w:type="dxa" w:w="80"/>
+              <w:left w:type="dxa" w:w="120"/>
+              <w:bottom w:type="dxa" w:w="80"/>
+              <w:right w:type="dxa" w:w="120"/>
+            </w:tcMar>
+          </w:tcPr>
+          <w:p>
+            <w:r>
+              <w:rPr>
+                <w:rFonts w:ascii="Arial" w:cs="Arial" w:eastAsia="Arial" w:hAnsi="Arial"/>
+                <w:sz w:val="20"/>
+                <w:szCs w:val="20"/>
+              </w:rPr>
+              <w:t xml:space="preserve">https://testnet.arcscan.app/token/0x8004A818BFB912233c491871b3d84c89A494BD9e/instance/11831</w:t>
+            </w:r>
+          </w:p>
+        </w:tc>
+      </w:tr>
+    </w:tbl>
+    <w:p>
+      <w:pPr>
+        <w:spacing w:after="0" w:before="160"/>
+      </w:pPr>
+      <w:r>
+        <w:t xml:space="preserve"/>
+      </w:r>
+    </w:p>
+    <w:p>
+      <w:pPr>
+        <w:pStyle w:val="Heading2"/>
+        <w:spacing w:after="80" w:before="280"/>
+      </w:pPr>
+      <w:r>
+        <w:rPr>
+          <w:rFonts w:ascii="Arial" w:cs="Arial" w:eastAsia="Arial" w:hAnsi="Arial"/>
+          <w:b/>
+          <w:bCs/>
+          <w:color w:val="2E75B6"/>
+          <w:sz w:val="26"/>
+          <w:szCs w:val="26"/>
+        </w:rPr>
+        <w:t xml:space="preserve">6.6 What's Next</w:t>
       </w:r>
     </w:p>
     <w:p>
@@ -16220,7 +17718,7 @@
           <w:sz w:val="22"/>
           <w:szCs w:val="22"/>
         </w:rPr>
-        <w:t xml:space="preserve">Agent buyer script — scripts/agent-buyer.ts: a fully autonomous agent that approves USDC, calls the API, reads the result, and makes a pass/fail decision. Proves the agent-to-agent pattern end-to-end.</w:t>
+        <w:t xml:space="preserve">Arc Discord #user-made-things — post the full project writeup there once channel access opens. This is the highest-visibility developer channel in the Arc community.</w:t>
       </w:r>
     </w:p>
     <w:p>
@@ -16240,7 +17738,7 @@
           <w:sz w:val="22"/>
           <w:szCs w:val="22"/>
         </w:rPr>
-        <w:t xml:space="preserve">Arc Discord project post — post in #general-chat when 6hr cooldown lifts. Link to GitHub and a demo tx.</w:t>
+        <w:t xml:space="preserve">Continue engaging on Arc Twitter — reply to substantive posts about technology, payments, and agent commerce. The ERC-8004 announcement is a direct opportunity.</w:t>
       </w:r>
     </w:p>
     <w:p>
@@ -16260,7 +17758,7 @@
           <w:sz w:val="22"/>
           <w:szCs w:val="22"/>
         </w:rPr>
-        <w:t xml:space="preserve">Continue engaging on Arc Twitter — reply to substantive posts about technology, payments, and agent commerce.</w:t>
+        <w:t xml:space="preserve">Mainnet readiness review — when Arc mainnet date is announced, document what needs to change: fee pricing, persistent rate limiting (Redis), contract upgrade strategy.</w:t>
       </w:r>
     </w:p>
     <w:p>
@@ -16280,7 +17778,7 @@
           <w:sz w:val="22"/>
           <w:szCs w:val="22"/>
         </w:rPr>
-        <w:t xml:space="preserve">Mainnet readiness review — when Arc mainnet date is announced, document what needs to change: fee pricing, persistent rate limiting (Redis), contract upgrade strategy.</w:t>
+        <w:t xml:space="preserve">Reputation building — as other agents or developers use ArcAuditAgent, encourage them to record reputation feedback on ERC-8004 ReputationRegistry for Agent ID 11831.</w:t>
       </w:r>
     </w:p>
     <w:p>
@@ -16305,7 +17803,7 @@
           <w:sz w:val="26"/>
           <w:szCs w:val="26"/>
         </w:rPr>
-        <w:t xml:space="preserve">6.6 How to Continue in a New Chat</w:t>
+        <w:t xml:space="preserve">6.7 How to Continue in a New Chat</w:t>
       </w:r>
     </w:p>
     <w:p>
@@ -16358,7 +17856,7 @@
                 <w:sz w:val="22"/>
                 <w:szCs w:val="22"/>
               </w:rPr>
-              <w:t xml:space="preserve">I am building ArcAuditAgent — a Claude-powered autonomous smart contract audit agent deployed on Circle's Arc Network. The backend is live at https://arc-audit-agent-production.up.railway.app, the AuditRegistry contract is at 0xC996c0143c4C88F0B0bC32d328D14c071A603CcB on Arc testnet, and 9 audits are confirmed on-chain. Here is the full project charter v2.0 Final. Read Section 6 for current state and help me continue from the next incomplete item.</w:t>
+              <w:t xml:space="preserve">I am building ArcAuditAgent — a Claude-powered autonomous smart contract audit agent deployed on Circle's Arc Network. The backend is live at https://arc-audit-agent-production.up.railway.app, AuditRegistry is at 0xC996c0143c4C88F0B0bC32d328D14c071A603CcB on Arc testnet, 9 audits on-chain, and ERC-8004 identity is registered as Agent ID 11831 with reputation 95/100 and validation passed. Here is the full project charter v2.0 Final. Read Section 6 for current state and help me continue from the next incomplete item.</w:t>
             </w:r>
           </w:p>
         </w:tc>
@@ -16389,7 +17887,7 @@
           <w:sz w:val="18"/>
           <w:szCs w:val="18"/>
         </w:rPr>
-        <w:t xml:space="preserve">ArcAuditAgent Project Charter v2.0 Final  |  Kiran Nisaci  |  May 15, 2026  |  Arc Testnet Live  |  9 Audits On-Chain</w:t>
+        <w:t xml:space="preserve">ArcAuditAgent Project Charter v2.0 Final  |  Kiran Nisaci  |  May 15, 2026  |  ERC-8004 Agent ID 11831  |  9 Audits On-Chain</w:t>
       </w:r>
     </w:p>
     <w:sectPr>

</xml_diff>

<commit_message>
Prepare Arc Mainnet deployment config — ready to deploy on announcement
</commit_message>
<xml_diff>
--- a/ArcAuditAgent_Charter_v2_Final.docx
+++ b/ArcAuditAgent_Charter_v2_Final.docx
@@ -14443,6 +14443,374 @@
                 <w:sz w:val="20"/>
                 <w:szCs w:val="20"/>
               </w:rPr>
+              <w:t xml:space="preserve">ERC-8183 Commerce Module</w:t>
+            </w:r>
+          </w:p>
+        </w:tc>
+        <w:tc>
+          <w:tcPr>
+            <w:tcW w:type="dxa" w:w="1960"/>
+            <w:tcBorders>
+              <w:top w:val="single" w:color="CCCCCC" w:sz="1"/>
+              <w:left w:val="single" w:color="CCCCCC" w:sz="1"/>
+              <w:bottom w:val="single" w:color="CCCCCC" w:sz="1"/>
+              <w:right w:val="single" w:color="CCCCCC" w:sz="1"/>
+            </w:tcBorders>
+            <w:shd w:fill="FFFFFF" w:val="clear"/>
+            <w:tcMar>
+              <w:top w:type="dxa" w:w="80"/>
+              <w:left w:type="dxa" w:w="120"/>
+              <w:bottom w:type="dxa" w:w="80"/>
+              <w:right w:type="dxa" w:w="120"/>
+            </w:tcMar>
+          </w:tcPr>
+          <w:p>
+            <w:r>
+              <w:rPr>
+                <w:rFonts w:ascii="Arial" w:cs="Arial" w:eastAsia="Arial" w:hAnsi="Arial"/>
+                <w:b w:val="false"/>
+                <w:bCs w:val="false"/>
+                <w:sz w:val="20"/>
+                <w:szCs w:val="20"/>
+              </w:rPr>
+              <w:t xml:space="preserve">Complete ✅</w:t>
+            </w:r>
+          </w:p>
+        </w:tc>
+        <w:tc>
+          <w:tcPr>
+            <w:tcW w:type="dxa" w:w="4200"/>
+            <w:tcBorders>
+              <w:top w:val="single" w:color="CCCCCC" w:sz="1"/>
+              <w:left w:val="single" w:color="CCCCCC" w:sz="1"/>
+              <w:bottom w:val="single" w:color="CCCCCC" w:sz="1"/>
+              <w:right w:val="single" w:color="CCCCCC" w:sz="1"/>
+            </w:tcBorders>
+            <w:shd w:fill="FFFFFF" w:val="clear"/>
+            <w:tcMar>
+              <w:top w:type="dxa" w:w="80"/>
+              <w:left w:type="dxa" w:w="120"/>
+              <w:bottom w:type="dxa" w:w="80"/>
+              <w:right w:type="dxa" w:w="120"/>
+            </w:tcMar>
+          </w:tcPr>
+          <w:p>
+            <w:r>
+              <w:rPr>
+                <w:rFonts w:ascii="Arial" w:cs="Arial" w:eastAsia="Arial" w:hAnsi="Arial"/>
+                <w:b w:val="false"/>
+                <w:bCs w:val="false"/>
+                <w:sz w:val="20"/>
+                <w:szCs w:val="20"/>
+              </w:rPr>
+              <w:t xml:space="preserve">src/commerce.ts — getJobDetails, setBudgetForJob, submitDeliverable</w:t>
+            </w:r>
+          </w:p>
+        </w:tc>
+      </w:tr>
+      <w:tr>
+        <w:tc>
+          <w:tcPr>
+            <w:tcW w:type="dxa" w:w="3200"/>
+            <w:tcBorders>
+              <w:top w:val="single" w:color="CCCCCC" w:sz="1"/>
+              <w:left w:val="single" w:color="CCCCCC" w:sz="1"/>
+              <w:bottom w:val="single" w:color="CCCCCC" w:sz="1"/>
+              <w:right w:val="single" w:color="CCCCCC" w:sz="1"/>
+            </w:tcBorders>
+            <w:shd w:fill="F5F7FA" w:val="clear"/>
+            <w:tcMar>
+              <w:top w:type="dxa" w:w="80"/>
+              <w:left w:type="dxa" w:w="120"/>
+              <w:bottom w:type="dxa" w:w="80"/>
+              <w:right w:type="dxa" w:w="120"/>
+            </w:tcMar>
+          </w:tcPr>
+          <w:p>
+            <w:r>
+              <w:rPr>
+                <w:rFonts w:ascii="Arial" w:cs="Arial" w:eastAsia="Arial" w:hAnsi="Arial"/>
+                <w:b/>
+                <w:bCs/>
+                <w:sz w:val="20"/>
+                <w:szCs w:val="20"/>
+              </w:rPr>
+              <w:t xml:space="preserve">ERC-8183 /job Endpoint</w:t>
+            </w:r>
+          </w:p>
+        </w:tc>
+        <w:tc>
+          <w:tcPr>
+            <w:tcW w:type="dxa" w:w="1960"/>
+            <w:tcBorders>
+              <w:top w:val="single" w:color="CCCCCC" w:sz="1"/>
+              <w:left w:val="single" w:color="CCCCCC" w:sz="1"/>
+              <w:bottom w:val="single" w:color="CCCCCC" w:sz="1"/>
+              <w:right w:val="single" w:color="CCCCCC" w:sz="1"/>
+            </w:tcBorders>
+            <w:shd w:fill="F5F7FA" w:val="clear"/>
+            <w:tcMar>
+              <w:top w:type="dxa" w:w="80"/>
+              <w:left w:type="dxa" w:w="120"/>
+              <w:bottom w:type="dxa" w:w="80"/>
+              <w:right w:type="dxa" w:w="120"/>
+            </w:tcMar>
+          </w:tcPr>
+          <w:p>
+            <w:r>
+              <w:rPr>
+                <w:rFonts w:ascii="Arial" w:cs="Arial" w:eastAsia="Arial" w:hAnsi="Arial"/>
+                <w:b w:val="false"/>
+                <w:bCs w:val="false"/>
+                <w:sz w:val="20"/>
+                <w:szCs w:val="20"/>
+              </w:rPr>
+              <w:t xml:space="preserve">Complete ✅</w:t>
+            </w:r>
+          </w:p>
+        </w:tc>
+        <w:tc>
+          <w:tcPr>
+            <w:tcW w:type="dxa" w:w="4200"/>
+            <w:tcBorders>
+              <w:top w:val="single" w:color="CCCCCC" w:sz="1"/>
+              <w:left w:val="single" w:color="CCCCCC" w:sz="1"/>
+              <w:bottom w:val="single" w:color="CCCCCC" w:sz="1"/>
+              <w:right w:val="single" w:color="CCCCCC" w:sz="1"/>
+            </w:tcBorders>
+            <w:shd w:fill="F5F7FA" w:val="clear"/>
+            <w:tcMar>
+              <w:top w:type="dxa" w:w="80"/>
+              <w:left w:type="dxa" w:w="120"/>
+              <w:bottom w:type="dxa" w:w="80"/>
+              <w:right w:type="dxa" w:w="120"/>
+            </w:tcMar>
+          </w:tcPr>
+          <w:p>
+            <w:r>
+              <w:rPr>
+                <w:rFonts w:ascii="Arial" w:cs="Arial" w:eastAsia="Arial" w:hAnsi="Arial"/>
+                <w:b w:val="false"/>
+                <w:bCs w:val="false"/>
+                <w:sz w:val="20"/>
+                <w:szCs w:val="20"/>
+              </w:rPr>
+              <w:t xml:space="preserve">POST /job — full escrow flow with deliverable submission</w:t>
+            </w:r>
+          </w:p>
+        </w:tc>
+      </w:tr>
+      <w:tr>
+        <w:tc>
+          <w:tcPr>
+            <w:tcW w:type="dxa" w:w="3200"/>
+            <w:tcBorders>
+              <w:top w:val="single" w:color="CCCCCC" w:sz="1"/>
+              <w:left w:val="single" w:color="CCCCCC" w:sz="1"/>
+              <w:bottom w:val="single" w:color="CCCCCC" w:sz="1"/>
+              <w:right w:val="single" w:color="CCCCCC" w:sz="1"/>
+            </w:tcBorders>
+            <w:shd w:fill="FFFFFF" w:val="clear"/>
+            <w:tcMar>
+              <w:top w:type="dxa" w:w="80"/>
+              <w:left w:type="dxa" w:w="120"/>
+              <w:bottom w:type="dxa" w:w="80"/>
+              <w:right w:type="dxa" w:w="120"/>
+            </w:tcMar>
+          </w:tcPr>
+          <w:p>
+            <w:r>
+              <w:rPr>
+                <w:rFonts w:ascii="Arial" w:cs="Arial" w:eastAsia="Arial" w:hAnsi="Arial"/>
+                <w:b/>
+                <w:bCs/>
+                <w:sz w:val="20"/>
+                <w:szCs w:val="20"/>
+              </w:rPr>
+              <w:t xml:space="preserve">ERC-8183 Agent Buyer Script</w:t>
+            </w:r>
+          </w:p>
+        </w:tc>
+        <w:tc>
+          <w:tcPr>
+            <w:tcW w:type="dxa" w:w="1960"/>
+            <w:tcBorders>
+              <w:top w:val="single" w:color="CCCCCC" w:sz="1"/>
+              <w:left w:val="single" w:color="CCCCCC" w:sz="1"/>
+              <w:bottom w:val="single" w:color="CCCCCC" w:sz="1"/>
+              <w:right w:val="single" w:color="CCCCCC" w:sz="1"/>
+            </w:tcBorders>
+            <w:shd w:fill="FFFFFF" w:val="clear"/>
+            <w:tcMar>
+              <w:top w:type="dxa" w:w="80"/>
+              <w:left w:type="dxa" w:w="120"/>
+              <w:bottom w:type="dxa" w:w="80"/>
+              <w:right w:type="dxa" w:w="120"/>
+            </w:tcMar>
+          </w:tcPr>
+          <w:p>
+            <w:r>
+              <w:rPr>
+                <w:rFonts w:ascii="Arial" w:cs="Arial" w:eastAsia="Arial" w:hAnsi="Arial"/>
+                <w:b w:val="false"/>
+                <w:bCs w:val="false"/>
+                <w:sz w:val="20"/>
+                <w:szCs w:val="20"/>
+              </w:rPr>
+              <w:t xml:space="preserve">Complete ✅</w:t>
+            </w:r>
+          </w:p>
+        </w:tc>
+        <w:tc>
+          <w:tcPr>
+            <w:tcW w:type="dxa" w:w="4200"/>
+            <w:tcBorders>
+              <w:top w:val="single" w:color="CCCCCC" w:sz="1"/>
+              <w:left w:val="single" w:color="CCCCCC" w:sz="1"/>
+              <w:bottom w:val="single" w:color="CCCCCC" w:sz="1"/>
+              <w:right w:val="single" w:color="CCCCCC" w:sz="1"/>
+            </w:tcBorders>
+            <w:shd w:fill="FFFFFF" w:val="clear"/>
+            <w:tcMar>
+              <w:top w:type="dxa" w:w="80"/>
+              <w:left w:type="dxa" w:w="120"/>
+              <w:bottom w:type="dxa" w:w="80"/>
+              <w:right w:type="dxa" w:w="120"/>
+            </w:tcMar>
+          </w:tcPr>
+          <w:p>
+            <w:r>
+              <w:rPr>
+                <w:rFonts w:ascii="Arial" w:cs="Arial" w:eastAsia="Arial" w:hAnsi="Arial"/>
+                <w:b w:val="false"/>
+                <w:bCs w:val="false"/>
+                <w:sz w:val="20"/>
+                <w:szCs w:val="20"/>
+              </w:rPr>
+              <w:t xml:space="preserve">scripts/agent-buyer.ts — fully autonomous create/fund/audit/decide/complete</w:t>
+            </w:r>
+          </w:p>
+        </w:tc>
+      </w:tr>
+      <w:tr>
+        <w:tc>
+          <w:tcPr>
+            <w:tcW w:type="dxa" w:w="3200"/>
+            <w:tcBorders>
+              <w:top w:val="single" w:color="CCCCCC" w:sz="1"/>
+              <w:left w:val="single" w:color="CCCCCC" w:sz="1"/>
+              <w:bottom w:val="single" w:color="CCCCCC" w:sz="1"/>
+              <w:right w:val="single" w:color="CCCCCC" w:sz="1"/>
+            </w:tcBorders>
+            <w:shd w:fill="F5F7FA" w:val="clear"/>
+            <w:tcMar>
+              <w:top w:type="dxa" w:w="80"/>
+              <w:left w:type="dxa" w:w="120"/>
+              <w:bottom w:type="dxa" w:w="80"/>
+              <w:right w:type="dxa" w:w="120"/>
+            </w:tcMar>
+          </w:tcPr>
+          <w:p>
+            <w:r>
+              <w:rPr>
+                <w:rFonts w:ascii="Arial" w:cs="Arial" w:eastAsia="Arial" w:hAnsi="Arial"/>
+                <w:b/>
+                <w:bCs/>
+                <w:sz w:val="20"/>
+                <w:szCs w:val="20"/>
+              </w:rPr>
+              <w:t xml:space="preserve">ERC-8183 Test Script</w:t>
+            </w:r>
+          </w:p>
+        </w:tc>
+        <w:tc>
+          <w:tcPr>
+            <w:tcW w:type="dxa" w:w="1960"/>
+            <w:tcBorders>
+              <w:top w:val="single" w:color="CCCCCC" w:sz="1"/>
+              <w:left w:val="single" w:color="CCCCCC" w:sz="1"/>
+              <w:bottom w:val="single" w:color="CCCCCC" w:sz="1"/>
+              <w:right w:val="single" w:color="CCCCCC" w:sz="1"/>
+            </w:tcBorders>
+            <w:shd w:fill="F5F7FA" w:val="clear"/>
+            <w:tcMar>
+              <w:top w:type="dxa" w:w="80"/>
+              <w:left w:type="dxa" w:w="120"/>
+              <w:bottom w:type="dxa" w:w="80"/>
+              <w:right w:type="dxa" w:w="120"/>
+            </w:tcMar>
+          </w:tcPr>
+          <w:p>
+            <w:r>
+              <w:rPr>
+                <w:rFonts w:ascii="Arial" w:cs="Arial" w:eastAsia="Arial" w:hAnsi="Arial"/>
+                <w:b w:val="false"/>
+                <w:bCs w:val="false"/>
+                <w:sz w:val="20"/>
+                <w:szCs w:val="20"/>
+              </w:rPr>
+              <w:t xml:space="preserve">Complete ✅</w:t>
+            </w:r>
+          </w:p>
+        </w:tc>
+        <w:tc>
+          <w:tcPr>
+            <w:tcW w:type="dxa" w:w="4200"/>
+            <w:tcBorders>
+              <w:top w:val="single" w:color="CCCCCC" w:sz="1"/>
+              <w:left w:val="single" w:color="CCCCCC" w:sz="1"/>
+              <w:bottom w:val="single" w:color="CCCCCC" w:sz="1"/>
+              <w:right w:val="single" w:color="CCCCCC" w:sz="1"/>
+            </w:tcBorders>
+            <w:shd w:fill="F5F7FA" w:val="clear"/>
+            <w:tcMar>
+              <w:top w:type="dxa" w:w="80"/>
+              <w:left w:type="dxa" w:w="120"/>
+              <w:bottom w:type="dxa" w:w="80"/>
+              <w:right w:type="dxa" w:w="120"/>
+            </w:tcMar>
+          </w:tcPr>
+          <w:p>
+            <w:r>
+              <w:rPr>
+                <w:rFonts w:ascii="Arial" w:cs="Arial" w:eastAsia="Arial" w:hAnsi="Arial"/>
+                <w:b w:val="false"/>
+                <w:bCs w:val="false"/>
+                <w:sz w:val="20"/>
+                <w:szCs w:val="20"/>
+              </w:rPr>
+              <w:t xml:space="preserve">scripts/erc8183-test.ts — full lifecycle test confirmed</w:t>
+            </w:r>
+          </w:p>
+        </w:tc>
+      </w:tr>
+      <w:tr>
+        <w:tc>
+          <w:tcPr>
+            <w:tcW w:type="dxa" w:w="3200"/>
+            <w:tcBorders>
+              <w:top w:val="single" w:color="CCCCCC" w:sz="1"/>
+              <w:left w:val="single" w:color="CCCCCC" w:sz="1"/>
+              <w:bottom w:val="single" w:color="CCCCCC" w:sz="1"/>
+              <w:right w:val="single" w:color="CCCCCC" w:sz="1"/>
+            </w:tcBorders>
+            <w:shd w:fill="FFFFFF" w:val="clear"/>
+            <w:tcMar>
+              <w:top w:type="dxa" w:w="80"/>
+              <w:left w:type="dxa" w:w="120"/>
+              <w:bottom w:type="dxa" w:w="80"/>
+              <w:right w:type="dxa" w:w="120"/>
+            </w:tcMar>
+          </w:tcPr>
+          <w:p>
+            <w:r>
+              <w:rPr>
+                <w:rFonts w:ascii="Arial" w:cs="Arial" w:eastAsia="Arial" w:hAnsi="Arial"/>
+                <w:b/>
+                <w:bCs/>
+                <w:sz w:val="20"/>
+                <w:szCs w:val="20"/>
+              </w:rPr>
               <w:t xml:space="preserve">Arc Discord #user-made-things</w:t>
             </w:r>
           </w:p>
@@ -17698,7 +18066,563 @@
           <w:sz w:val="26"/>
           <w:szCs w:val="26"/>
         </w:rPr>
-        <w:t xml:space="preserve">6.6 What's Next</w:t>
+        <w:t xml:space="preserve">6.6 ERC-8183 Agentic Commerce</w:t>
+      </w:r>
+    </w:p>
+    <w:p>
+      <w:pPr>
+        <w:spacing w:after="0" w:before="80"/>
+      </w:pPr>
+      <w:r>
+        <w:t xml:space="preserve"/>
+      </w:r>
+    </w:p>
+    <w:p>
+      <w:pPr>
+        <w:spacing w:after="80" w:before="80"/>
+      </w:pPr>
+      <w:r>
+        <w:rPr>
+          <w:rFonts w:ascii="Arial" w:cs="Arial" w:eastAsia="Arial" w:hAnsi="Arial"/>
+          <w:sz w:val="22"/>
+          <w:szCs w:val="22"/>
+        </w:rPr>
+        <w:t xml:space="preserve">ERC-8183 is Arc's standard for onchain job-based commerce between agents. ArcAuditAgent is registered as a provider — clients create jobs with USDC escrow, ArcAuditAgent submits the audit report hash as a verifiable deliverable, and payment releases automatically on completion.</w:t>
+      </w:r>
+    </w:p>
+    <w:p>
+      <w:pPr>
+        <w:spacing w:after="0" w:before="80"/>
+      </w:pPr>
+      <w:r>
+        <w:t xml:space="preserve"/>
+      </w:r>
+    </w:p>
+    <w:tbl>
+      <w:tblPr>
+        <w:tblW w:type="dxa" w:w="9360"/>
+        <w:tblBorders>
+          <w:top w:val="single" w:color="auto" w:sz="4"/>
+          <w:left w:val="single" w:color="auto" w:sz="4"/>
+          <w:bottom w:val="single" w:color="auto" w:sz="4"/>
+          <w:right w:val="single" w:color="auto" w:sz="4"/>
+          <w:insideH w:val="single" w:color="auto" w:sz="4"/>
+          <w:insideV w:val="single" w:color="auto" w:sz="4"/>
+        </w:tblBorders>
+      </w:tblPr>
+      <w:tblGrid>
+        <w:gridCol w:w="2400"/>
+        <w:gridCol w:w="6960"/>
+      </w:tblGrid>
+      <w:tr>
+        <w:tc>
+          <w:tcPr>
+            <w:tcW w:type="dxa" w:w="2400"/>
+            <w:tcBorders>
+              <w:top w:val="single" w:color="CCCCCC" w:sz="1"/>
+              <w:left w:val="single" w:color="CCCCCC" w:sz="1"/>
+              <w:bottom w:val="single" w:color="CCCCCC" w:sz="1"/>
+              <w:right w:val="single" w:color="CCCCCC" w:sz="1"/>
+            </w:tcBorders>
+            <w:shd w:fill="D6E4F0" w:val="clear"/>
+            <w:tcMar>
+              <w:top w:type="dxa" w:w="80"/>
+              <w:left w:type="dxa" w:w="120"/>
+              <w:bottom w:type="dxa" w:w="80"/>
+              <w:right w:type="dxa" w:w="120"/>
+            </w:tcMar>
+          </w:tcPr>
+          <w:p>
+            <w:r>
+              <w:rPr>
+                <w:rFonts w:ascii="Arial" w:cs="Arial" w:eastAsia="Arial" w:hAnsi="Arial"/>
+                <w:b/>
+                <w:bCs/>
+                <w:color w:val="1B4F8A"/>
+                <w:sz w:val="20"/>
+                <w:szCs w:val="20"/>
+              </w:rPr>
+              <w:t xml:space="preserve">AgenticCommerce Contract</w:t>
+            </w:r>
+          </w:p>
+        </w:tc>
+        <w:tc>
+          <w:tcPr>
+            <w:tcW w:type="dxa" w:w="6960"/>
+            <w:tcBorders>
+              <w:top w:val="single" w:color="CCCCCC" w:sz="1"/>
+              <w:left w:val="single" w:color="CCCCCC" w:sz="1"/>
+              <w:bottom w:val="single" w:color="CCCCCC" w:sz="1"/>
+              <w:right w:val="single" w:color="CCCCCC" w:sz="1"/>
+            </w:tcBorders>
+            <w:tcMar>
+              <w:top w:type="dxa" w:w="80"/>
+              <w:left w:type="dxa" w:w="120"/>
+              <w:bottom w:type="dxa" w:w="80"/>
+              <w:right w:type="dxa" w:w="120"/>
+            </w:tcMar>
+          </w:tcPr>
+          <w:p>
+            <w:r>
+              <w:rPr>
+                <w:rFonts w:ascii="Arial" w:cs="Arial" w:eastAsia="Arial" w:hAnsi="Arial"/>
+                <w:sz w:val="20"/>
+                <w:szCs w:val="20"/>
+              </w:rPr>
+              <w:t xml:space="preserve">0x0747EEf0706327138c69792bF28Cd525089e4583</w:t>
+            </w:r>
+          </w:p>
+        </w:tc>
+      </w:tr>
+    </w:tbl>
+    <w:p>
+      <w:pPr>
+        <w:spacing w:after="0" w:before="0"/>
+      </w:pPr>
+      <w:r>
+        <w:t xml:space="preserve"/>
+      </w:r>
+    </w:p>
+    <w:tbl>
+      <w:tblPr>
+        <w:tblW w:type="dxa" w:w="9360"/>
+        <w:tblBorders>
+          <w:top w:val="single" w:color="auto" w:sz="4"/>
+          <w:left w:val="single" w:color="auto" w:sz="4"/>
+          <w:bottom w:val="single" w:color="auto" w:sz="4"/>
+          <w:right w:val="single" w:color="auto" w:sz="4"/>
+          <w:insideH w:val="single" w:color="auto" w:sz="4"/>
+          <w:insideV w:val="single" w:color="auto" w:sz="4"/>
+        </w:tblBorders>
+      </w:tblPr>
+      <w:tblGrid>
+        <w:gridCol w:w="2400"/>
+        <w:gridCol w:w="6960"/>
+      </w:tblGrid>
+      <w:tr>
+        <w:tc>
+          <w:tcPr>
+            <w:tcW w:type="dxa" w:w="2400"/>
+            <w:tcBorders>
+              <w:top w:val="single" w:color="CCCCCC" w:sz="1"/>
+              <w:left w:val="single" w:color="CCCCCC" w:sz="1"/>
+              <w:bottom w:val="single" w:color="CCCCCC" w:sz="1"/>
+              <w:right w:val="single" w:color="CCCCCC" w:sz="1"/>
+            </w:tcBorders>
+            <w:shd w:fill="D6E4F0" w:val="clear"/>
+            <w:tcMar>
+              <w:top w:type="dxa" w:w="80"/>
+              <w:left w:type="dxa" w:w="120"/>
+              <w:bottom w:type="dxa" w:w="80"/>
+              <w:right w:type="dxa" w:w="120"/>
+            </w:tcMar>
+          </w:tcPr>
+          <w:p>
+            <w:r>
+              <w:rPr>
+                <w:rFonts w:ascii="Arial" w:cs="Arial" w:eastAsia="Arial" w:hAnsi="Arial"/>
+                <w:b/>
+                <w:bCs/>
+                <w:color w:val="1B4F8A"/>
+                <w:sz w:val="20"/>
+                <w:szCs w:val="20"/>
+              </w:rPr>
+              <w:t xml:space="preserve">AgenticCommerce Explorer</w:t>
+            </w:r>
+          </w:p>
+        </w:tc>
+        <w:tc>
+          <w:tcPr>
+            <w:tcW w:type="dxa" w:w="6960"/>
+            <w:tcBorders>
+              <w:top w:val="single" w:color="CCCCCC" w:sz="1"/>
+              <w:left w:val="single" w:color="CCCCCC" w:sz="1"/>
+              <w:bottom w:val="single" w:color="CCCCCC" w:sz="1"/>
+              <w:right w:val="single" w:color="CCCCCC" w:sz="1"/>
+            </w:tcBorders>
+            <w:tcMar>
+              <w:top w:type="dxa" w:w="80"/>
+              <w:left w:type="dxa" w:w="120"/>
+              <w:bottom w:type="dxa" w:w="80"/>
+              <w:right w:type="dxa" w:w="120"/>
+            </w:tcMar>
+          </w:tcPr>
+          <w:p>
+            <w:r>
+              <w:rPr>
+                <w:rFonts w:ascii="Arial" w:cs="Arial" w:eastAsia="Arial" w:hAnsi="Arial"/>
+                <w:sz w:val="20"/>
+                <w:szCs w:val="20"/>
+              </w:rPr>
+              <w:t xml:space="preserve">https://testnet.arcscan.app/address/0x0747EEf0706327138c69792bF28Cd525089e4583</w:t>
+            </w:r>
+          </w:p>
+        </w:tc>
+      </w:tr>
+    </w:tbl>
+    <w:p>
+      <w:pPr>
+        <w:spacing w:after="0" w:before="0"/>
+      </w:pPr>
+      <w:r>
+        <w:t xml:space="preserve"/>
+      </w:r>
+    </w:p>
+    <w:tbl>
+      <w:tblPr>
+        <w:tblW w:type="dxa" w:w="9360"/>
+        <w:tblBorders>
+          <w:top w:val="single" w:color="auto" w:sz="4"/>
+          <w:left w:val="single" w:color="auto" w:sz="4"/>
+          <w:bottom w:val="single" w:color="auto" w:sz="4"/>
+          <w:right w:val="single" w:color="auto" w:sz="4"/>
+          <w:insideH w:val="single" w:color="auto" w:sz="4"/>
+          <w:insideV w:val="single" w:color="auto" w:sz="4"/>
+        </w:tblBorders>
+      </w:tblPr>
+      <w:tblGrid>
+        <w:gridCol w:w="2400"/>
+        <w:gridCol w:w="6960"/>
+      </w:tblGrid>
+      <w:tr>
+        <w:tc>
+          <w:tcPr>
+            <w:tcW w:type="dxa" w:w="2400"/>
+            <w:tcBorders>
+              <w:top w:val="single" w:color="CCCCCC" w:sz="1"/>
+              <w:left w:val="single" w:color="CCCCCC" w:sz="1"/>
+              <w:bottom w:val="single" w:color="CCCCCC" w:sz="1"/>
+              <w:right w:val="single" w:color="CCCCCC" w:sz="1"/>
+            </w:tcBorders>
+            <w:shd w:fill="D6E4F0" w:val="clear"/>
+            <w:tcMar>
+              <w:top w:type="dxa" w:w="80"/>
+              <w:left w:type="dxa" w:w="120"/>
+              <w:bottom w:type="dxa" w:w="80"/>
+              <w:right w:type="dxa" w:w="120"/>
+            </w:tcMar>
+          </w:tcPr>
+          <w:p>
+            <w:r>
+              <w:rPr>
+                <w:rFonts w:ascii="Arial" w:cs="Arial" w:eastAsia="Arial" w:hAnsi="Arial"/>
+                <w:b/>
+                <w:bCs/>
+                <w:color w:val="1B4F8A"/>
+                <w:sz w:val="20"/>
+                <w:szCs w:val="20"/>
+              </w:rPr>
+              <w:t xml:space="preserve">ERC-8183 Test TX</w:t>
+            </w:r>
+          </w:p>
+        </w:tc>
+        <w:tc>
+          <w:tcPr>
+            <w:tcW w:type="dxa" w:w="6960"/>
+            <w:tcBorders>
+              <w:top w:val="single" w:color="CCCCCC" w:sz="1"/>
+              <w:left w:val="single" w:color="CCCCCC" w:sz="1"/>
+              <w:bottom w:val="single" w:color="CCCCCC" w:sz="1"/>
+              <w:right w:val="single" w:color="CCCCCC" w:sz="1"/>
+            </w:tcBorders>
+            <w:tcMar>
+              <w:top w:type="dxa" w:w="80"/>
+              <w:left w:type="dxa" w:w="120"/>
+              <w:bottom w:type="dxa" w:w="80"/>
+              <w:right w:type="dxa" w:w="120"/>
+            </w:tcMar>
+          </w:tcPr>
+          <w:p>
+            <w:r>
+              <w:rPr>
+                <w:rFonts w:ascii="Arial" w:cs="Arial" w:eastAsia="Arial" w:hAnsi="Arial"/>
+                <w:sz w:val="20"/>
+                <w:szCs w:val="20"/>
+              </w:rPr>
+              <w:t xml:space="preserve">0x39511793aa0d9cf8d7b528a77296e04f185e436cec01c162379155b11bfb399c</w:t>
+            </w:r>
+          </w:p>
+        </w:tc>
+      </w:tr>
+    </w:tbl>
+    <w:p>
+      <w:pPr>
+        <w:spacing w:after="0" w:before="0"/>
+      </w:pPr>
+      <w:r>
+        <w:t xml:space="preserve"/>
+      </w:r>
+    </w:p>
+    <w:tbl>
+      <w:tblPr>
+        <w:tblW w:type="dxa" w:w="9360"/>
+        <w:tblBorders>
+          <w:top w:val="single" w:color="auto" w:sz="4"/>
+          <w:left w:val="single" w:color="auto" w:sz="4"/>
+          <w:bottom w:val="single" w:color="auto" w:sz="4"/>
+          <w:right w:val="single" w:color="auto" w:sz="4"/>
+          <w:insideH w:val="single" w:color="auto" w:sz="4"/>
+          <w:insideV w:val="single" w:color="auto" w:sz="4"/>
+        </w:tblBorders>
+      </w:tblPr>
+      <w:tblGrid>
+        <w:gridCol w:w="2400"/>
+        <w:gridCol w:w="6960"/>
+      </w:tblGrid>
+      <w:tr>
+        <w:tc>
+          <w:tcPr>
+            <w:tcW w:type="dxa" w:w="2400"/>
+            <w:tcBorders>
+              <w:top w:val="single" w:color="CCCCCC" w:sz="1"/>
+              <w:left w:val="single" w:color="CCCCCC" w:sz="1"/>
+              <w:bottom w:val="single" w:color="CCCCCC" w:sz="1"/>
+              <w:right w:val="single" w:color="CCCCCC" w:sz="1"/>
+            </w:tcBorders>
+            <w:shd w:fill="D6E4F0" w:val="clear"/>
+            <w:tcMar>
+              <w:top w:type="dxa" w:w="80"/>
+              <w:left w:type="dxa" w:w="120"/>
+              <w:bottom w:type="dxa" w:w="80"/>
+              <w:right w:type="dxa" w:w="120"/>
+            </w:tcMar>
+          </w:tcPr>
+          <w:p>
+            <w:r>
+              <w:rPr>
+                <w:rFonts w:ascii="Arial" w:cs="Arial" w:eastAsia="Arial" w:hAnsi="Arial"/>
+                <w:b/>
+                <w:bCs/>
+                <w:color w:val="1B4F8A"/>
+                <w:sz w:val="20"/>
+                <w:szCs w:val="20"/>
+              </w:rPr>
+              <w:t xml:space="preserve">ERC-8183 Live Job TX</w:t>
+            </w:r>
+          </w:p>
+        </w:tc>
+        <w:tc>
+          <w:tcPr>
+            <w:tcW w:type="dxa" w:w="6960"/>
+            <w:tcBorders>
+              <w:top w:val="single" w:color="CCCCCC" w:sz="1"/>
+              <w:left w:val="single" w:color="CCCCCC" w:sz="1"/>
+              <w:bottom w:val="single" w:color="CCCCCC" w:sz="1"/>
+              <w:right w:val="single" w:color="CCCCCC" w:sz="1"/>
+            </w:tcBorders>
+            <w:tcMar>
+              <w:top w:type="dxa" w:w="80"/>
+              <w:left w:type="dxa" w:w="120"/>
+              <w:bottom w:type="dxa" w:w="80"/>
+              <w:right w:type="dxa" w:w="120"/>
+            </w:tcMar>
+          </w:tcPr>
+          <w:p>
+            <w:r>
+              <w:rPr>
+                <w:rFonts w:ascii="Arial" w:cs="Arial" w:eastAsia="Arial" w:hAnsi="Arial"/>
+                <w:sz w:val="20"/>
+                <w:szCs w:val="20"/>
+              </w:rPr>
+              <w:t xml:space="preserve">0xa5ef1ab37537d2a8b101ccde5209855e6601253e4a04c1a0d5a3ddbf38347a74</w:t>
+            </w:r>
+          </w:p>
+        </w:tc>
+      </w:tr>
+    </w:tbl>
+    <w:p>
+      <w:pPr>
+        <w:spacing w:after="0" w:before="0"/>
+      </w:pPr>
+      <w:r>
+        <w:t xml:space="preserve"/>
+      </w:r>
+    </w:p>
+    <w:tbl>
+      <w:tblPr>
+        <w:tblW w:type="dxa" w:w="9360"/>
+        <w:tblBorders>
+          <w:top w:val="single" w:color="auto" w:sz="4"/>
+          <w:left w:val="single" w:color="auto" w:sz="4"/>
+          <w:bottom w:val="single" w:color="auto" w:sz="4"/>
+          <w:right w:val="single" w:color="auto" w:sz="4"/>
+          <w:insideH w:val="single" w:color="auto" w:sz="4"/>
+          <w:insideV w:val="single" w:color="auto" w:sz="4"/>
+        </w:tblBorders>
+      </w:tblPr>
+      <w:tblGrid>
+        <w:gridCol w:w="2400"/>
+        <w:gridCol w:w="6960"/>
+      </w:tblGrid>
+      <w:tr>
+        <w:tc>
+          <w:tcPr>
+            <w:tcW w:type="dxa" w:w="2400"/>
+            <w:tcBorders>
+              <w:top w:val="single" w:color="CCCCCC" w:sz="1"/>
+              <w:left w:val="single" w:color="CCCCCC" w:sz="1"/>
+              <w:bottom w:val="single" w:color="CCCCCC" w:sz="1"/>
+              <w:right w:val="single" w:color="CCCCCC" w:sz="1"/>
+            </w:tcBorders>
+            <w:shd w:fill="D6E4F0" w:val="clear"/>
+            <w:tcMar>
+              <w:top w:type="dxa" w:w="80"/>
+              <w:left w:type="dxa" w:w="120"/>
+              <w:bottom w:type="dxa" w:w="80"/>
+              <w:right w:type="dxa" w:w="120"/>
+            </w:tcMar>
+          </w:tcPr>
+          <w:p>
+            <w:r>
+              <w:rPr>
+                <w:rFonts w:ascii="Arial" w:cs="Arial" w:eastAsia="Arial" w:hAnsi="Arial"/>
+                <w:b/>
+                <w:bCs/>
+                <w:color w:val="1B4F8A"/>
+                <w:sz w:val="20"/>
+                <w:szCs w:val="20"/>
+              </w:rPr>
+              <w:t xml:space="preserve">Autonomous Buyer TX</w:t>
+            </w:r>
+          </w:p>
+        </w:tc>
+        <w:tc>
+          <w:tcPr>
+            <w:tcW w:type="dxa" w:w="6960"/>
+            <w:tcBorders>
+              <w:top w:val="single" w:color="CCCCCC" w:sz="1"/>
+              <w:left w:val="single" w:color="CCCCCC" w:sz="1"/>
+              <w:bottom w:val="single" w:color="CCCCCC" w:sz="1"/>
+              <w:right w:val="single" w:color="CCCCCC" w:sz="1"/>
+            </w:tcBorders>
+            <w:tcMar>
+              <w:top w:type="dxa" w:w="80"/>
+              <w:left w:type="dxa" w:w="120"/>
+              <w:bottom w:type="dxa" w:w="80"/>
+              <w:right w:type="dxa" w:w="120"/>
+            </w:tcMar>
+          </w:tcPr>
+          <w:p>
+            <w:r>
+              <w:rPr>
+                <w:rFonts w:ascii="Arial" w:cs="Arial" w:eastAsia="Arial" w:hAnsi="Arial"/>
+                <w:sz w:val="20"/>
+                <w:szCs w:val="20"/>
+              </w:rPr>
+              <w:t xml:space="preserve">0x6f87ca8b10627009a95c8e00390e88cc8ddfb6b17343e97ff916b3479122c6a0</w:t>
+            </w:r>
+          </w:p>
+        </w:tc>
+      </w:tr>
+    </w:tbl>
+    <w:p>
+      <w:pPr>
+        <w:spacing w:after="0" w:before="0"/>
+      </w:pPr>
+      <w:r>
+        <w:t xml:space="preserve"/>
+      </w:r>
+    </w:p>
+    <w:tbl>
+      <w:tblPr>
+        <w:tblW w:type="dxa" w:w="9360"/>
+        <w:tblBorders>
+          <w:top w:val="single" w:color="auto" w:sz="4"/>
+          <w:left w:val="single" w:color="auto" w:sz="4"/>
+          <w:bottom w:val="single" w:color="auto" w:sz="4"/>
+          <w:right w:val="single" w:color="auto" w:sz="4"/>
+          <w:insideH w:val="single" w:color="auto" w:sz="4"/>
+          <w:insideV w:val="single" w:color="auto" w:sz="4"/>
+        </w:tblBorders>
+      </w:tblPr>
+      <w:tblGrid>
+        <w:gridCol w:w="2400"/>
+        <w:gridCol w:w="6960"/>
+      </w:tblGrid>
+      <w:tr>
+        <w:tc>
+          <w:tcPr>
+            <w:tcW w:type="dxa" w:w="2400"/>
+            <w:tcBorders>
+              <w:top w:val="single" w:color="CCCCCC" w:sz="1"/>
+              <w:left w:val="single" w:color="CCCCCC" w:sz="1"/>
+              <w:bottom w:val="single" w:color="CCCCCC" w:sz="1"/>
+              <w:right w:val="single" w:color="CCCCCC" w:sz="1"/>
+            </w:tcBorders>
+            <w:shd w:fill="D6E4F0" w:val="clear"/>
+            <w:tcMar>
+              <w:top w:type="dxa" w:w="80"/>
+              <w:left w:type="dxa" w:w="120"/>
+              <w:bottom w:type="dxa" w:w="80"/>
+              <w:right w:type="dxa" w:w="120"/>
+            </w:tcMar>
+          </w:tcPr>
+          <w:p>
+            <w:r>
+              <w:rPr>
+                <w:rFonts w:ascii="Arial" w:cs="Arial" w:eastAsia="Arial" w:hAnsi="Arial"/>
+                <w:b/>
+                <w:bCs/>
+                <w:color w:val="1B4F8A"/>
+                <w:sz w:val="20"/>
+                <w:szCs w:val="20"/>
+              </w:rPr>
+              <w:t xml:space="preserve">API Endpoint</w:t>
+            </w:r>
+          </w:p>
+        </w:tc>
+        <w:tc>
+          <w:tcPr>
+            <w:tcW w:type="dxa" w:w="6960"/>
+            <w:tcBorders>
+              <w:top w:val="single" w:color="CCCCCC" w:sz="1"/>
+              <w:left w:val="single" w:color="CCCCCC" w:sz="1"/>
+              <w:bottom w:val="single" w:color="CCCCCC" w:sz="1"/>
+              <w:right w:val="single" w:color="CCCCCC" w:sz="1"/>
+            </w:tcBorders>
+            <w:tcMar>
+              <w:top w:type="dxa" w:w="80"/>
+              <w:left w:type="dxa" w:w="120"/>
+              <w:bottom w:type="dxa" w:w="80"/>
+              <w:right w:type="dxa" w:w="120"/>
+            </w:tcMar>
+          </w:tcPr>
+          <w:p>
+            <w:r>
+              <w:rPr>
+                <w:rFonts w:ascii="Arial" w:cs="Arial" w:eastAsia="Arial" w:hAnsi="Arial"/>
+                <w:sz w:val="20"/>
+                <w:szCs w:val="20"/>
+              </w:rPr>
+              <w:t xml:space="preserve">POST https://arc-audit-agent-production.up.railway.app/job</w:t>
+            </w:r>
+          </w:p>
+        </w:tc>
+      </w:tr>
+    </w:tbl>
+    <w:p>
+      <w:pPr>
+        <w:spacing w:after="0" w:before="160"/>
+      </w:pPr>
+      <w:r>
+        <w:t xml:space="preserve"/>
+      </w:r>
+    </w:p>
+    <w:p>
+      <w:pPr>
+        <w:pStyle w:val="Heading2"/>
+        <w:spacing w:after="80" w:before="280"/>
+      </w:pPr>
+      <w:r>
+        <w:rPr>
+          <w:rFonts w:ascii="Arial" w:cs="Arial" w:eastAsia="Arial" w:hAnsi="Arial"/>
+          <w:b/>
+          <w:bCs/>
+          <w:color w:val="2E75B6"/>
+          <w:sz w:val="26"/>
+          <w:szCs w:val="26"/>
+        </w:rPr>
+        <w:t xml:space="preserve">6.7 What's Next</w:t>
       </w:r>
     </w:p>
     <w:p>
@@ -17718,7 +18642,7 @@
           <w:sz w:val="22"/>
           <w:szCs w:val="22"/>
         </w:rPr>
-        <w:t xml:space="preserve">Arc Discord #user-made-things — post the full project writeup there once channel access opens. This is the highest-visibility developer channel in the Arc community.</w:t>
+        <w:t xml:space="preserve">Arc Discord #user-made-things — post full project writeup once channel access opens.</w:t>
       </w:r>
     </w:p>
     <w:p>
@@ -17738,7 +18662,7 @@
           <w:sz w:val="22"/>
           <w:szCs w:val="22"/>
         </w:rPr>
-        <w:t xml:space="preserve">Continue engaging on Arc Twitter — reply to substantive posts about technology, payments, and agent commerce. The ERC-8004 announcement is a direct opportunity.</w:t>
+        <w:t xml:space="preserve">Continue engaging on Arc Twitter — ERC-8183 and ERC-8004 are both good angles for substantive replies.</w:t>
       </w:r>
     </w:p>
     <w:p>
@@ -17758,7 +18682,7 @@
           <w:sz w:val="22"/>
           <w:szCs w:val="22"/>
         </w:rPr>
-        <w:t xml:space="preserve">Mainnet readiness review — when Arc mainnet date is announced, document what needs to change: fee pricing, persistent rate limiting (Redis), contract upgrade strategy.</w:t>
+        <w:t xml:space="preserve">Mainnet readiness review — fee pricing, Redis rate limiting, contract upgrade strategy.</w:t>
       </w:r>
     </w:p>
     <w:p>
@@ -17778,7 +18702,47 @@
           <w:sz w:val="22"/>
           <w:szCs w:val="22"/>
         </w:rPr>
-        <w:t xml:space="preserve">Reputation building — as other agents or developers use ArcAuditAgent, encourage them to record reputation feedback on ERC-8004 ReputationRegistry for Agent ID 11831.</w:t>
+        <w:t xml:space="preserve">Reputation building — encourage users to record ERC-8004 reputation feedback for Agent ID 11831.</w:t>
+      </w:r>
+    </w:p>
+    <w:p>
+      <w:pPr>
+        <w:pStyle w:val="ListParagraph"/>
+        <w:numPr>
+          <w:ilvl w:val="0"/>
+          <w:numId w:val="2"/>
+        </w:numPr>
+        <w:spacing w:after="40" w:before="40"/>
+      </w:pPr>
+      <w:r>
+        <w:rPr>
+          <w:rFonts w:ascii="Arial" w:cs="Arial" w:eastAsia="Arial" w:hAnsi="Arial"/>
+          <w:b w:val="false"/>
+          <w:bCs w:val="false"/>
+          <w:sz w:val="22"/>
+          <w:szCs w:val="22"/>
+        </w:rPr>
+        <w:t xml:space="preserve">ERC-8183 automation — build a script that watches for new jobs assigned to ArcAuditAgent and processes them automatically without manual intervention.</w:t>
+      </w:r>
+    </w:p>
+    <w:p>
+      <w:pPr>
+        <w:pStyle w:val="ListParagraph"/>
+        <w:numPr>
+          <w:ilvl w:val="0"/>
+          <w:numId w:val="2"/>
+        </w:numPr>
+        <w:spacing w:after="40" w:before="40"/>
+      </w:pPr>
+      <w:r>
+        <w:rPr>
+          <w:rFonts w:ascii="Arial" w:cs="Arial" w:eastAsia="Arial" w:hAnsi="Arial"/>
+          <w:b w:val="false"/>
+          <w:bCs w:val="false"/>
+          <w:sz w:val="22"/>
+          <w:szCs w:val="22"/>
+        </w:rPr>
+        <w:t xml:space="preserve">Frontend — simple one-page UI for human developers to create jobs and get audit reports without touching the API directly.</w:t>
       </w:r>
     </w:p>
     <w:p>
@@ -17856,7 +18820,7 @@
                 <w:sz w:val="22"/>
                 <w:szCs w:val="22"/>
               </w:rPr>
-              <w:t xml:space="preserve">I am building ArcAuditAgent — a Claude-powered autonomous smart contract audit agent deployed on Circle's Arc Network. The backend is live at https://arc-audit-agent-production.up.railway.app, AuditRegistry is at 0xC996c0143c4C88F0B0bC32d328D14c071A603CcB on Arc testnet, 9 audits on-chain, and ERC-8004 identity is registered as Agent ID 11831 with reputation 95/100 and validation passed. Here is the full project charter v2.0 Final. Read Section 6 for current state and help me continue from the next incomplete item.</w:t>
+              <w:t xml:space="preserve">I am building ArcAuditAgent — a Claude-powered autonomous smart contract audit agent deployed on Circle's Arc Network. The backend is live at https://arc-audit-agent-production.up.railway.app, AuditRegistry is at 0xC996c0143c4C88F0B0bC32d328D14c071A603CcB on Arc testnet, 9 audits on-chain, and ERC-8004 identity is registered as Agent ID 11831 with reputation 95/100 and validation passed. ERC-8183 agentic commerce is integrated — POST /job endpoint accepts job IDs and submits deliverables on-chain automatically. Here is the full project charter v2.0 Final. Read Section 6 for current state and help me continue from the next incomplete item.</w:t>
             </w:r>
           </w:p>
         </w:tc>
@@ -17887,7 +18851,7 @@
           <w:sz w:val="18"/>
           <w:szCs w:val="18"/>
         </w:rPr>
-        <w:t xml:space="preserve">ArcAuditAgent Project Charter v2.0 Final  |  Kiran Nisaci  |  May 15, 2026  |  ERC-8004 Agent ID 11831  |  9 Audits On-Chain</w:t>
+        <w:t xml:space="preserve">ArcAuditAgent Project Charter v2.0 Final  |  Kiran Nisaci  |  May 16, 2026  |  ERC-8004 + ERC-8183 Live  |  Agent-to-Agent Commerce</w:t>
       </w:r>
     </w:p>
     <w:sectPr>

</xml_diff>